<commit_message>
Update Lab03 presentation and teaching guides; preserve student TODOs
</commit_message>
<xml_diff>
--- a/Huong_dan.docx
+++ b/Huong_dan.docx
@@ -258,7 +258,7 @@
         </w:rPr>
         <w:drawing>
           <wp:inline xmlns:a="http://schemas.openxmlformats.org/drawingml/2006/main" xmlns:pic="http://schemas.openxmlformats.org/drawingml/2006/picture">
-            <wp:extent cx="5760000" cy="3953454"/>
+            <wp:extent cx="5760000" cy="5828716"/>
             <wp:docPr id="1" name="Picture 1" descr="Danh sách sự kiện của mã mẫu"/>
             <wp:cNvGraphicFramePr>
               <a:graphicFrameLocks noChangeAspect="1"/>
@@ -279,7 +279,7 @@
                   <pic:spPr>
                     <a:xfrm>
                       <a:off x="0" y="0"/>
-                      <a:ext cx="5760000" cy="3953454"/>
+                      <a:ext cx="5760000" cy="5828716"/>
                     </a:xfrm>
                     <a:prstGeom prst="rect"/>
                   </pic:spPr>
@@ -336,6 +336,12 @@
           <w:sz w:val="26"/>
         </w:rPr>
         <w:t>, trang chỉ còn PHP Open Day. Khi gửi họ tên và email hợp lệ, trang hiển thị nội dung đã nhận. Đây là bản xem trước, không phải đăng ký đã được lưu.</w:t>
+      </w:r>
+    </w:p>
+    <w:p>
+      <w:pPr/>
+      <w:r>
+        <w:t>Giao diện Material 3 bổ sung metadata chỉ đọc tại data/event-content.php, ảnh cục bộ và trang event.php. ui-demo.php và ticket-preview.php là khu thử riêng, không thay FormData hoặc TODO. Xem README để phân biệt ba lớp.</w:t>
       </w:r>
     </w:p>
     <w:p>
@@ -2483,8 +2489,8 @@
     </w:p>
     <w:p>
       <w:pPr>
-        <w:keepNext/>
-        <w:keepLines/>
+        <w:keepNext w:val="0"/>
+        <w:keepLines w:val="0"/>
         <w:widowControl/>
         <w:spacing w:after="0" w:before="0" w:line="240" w:lineRule="auto"/>
         <w:ind w:firstLine="0" w:left="142" w:right="85"/>
@@ -2492,17 +2498,16 @@
       </w:pPr>
       <w:r>
         <w:rPr>
-          <w:rFonts w:ascii="Times New Roman" w:hAnsi="Times New Roman"/>
-          <w:b w:val="0"/>
-          <w:sz w:val="26"/>
+          <w:rFonts w:ascii="Consolas" w:hAnsi="Consolas"/>
+          <w:sz w:val="17"/>
         </w:rPr>
         <w:t>&lt;?php</w:t>
       </w:r>
     </w:p>
     <w:p>
       <w:pPr>
-        <w:keepNext/>
-        <w:keepLines/>
+        <w:keepNext w:val="0"/>
+        <w:keepLines w:val="0"/>
         <w:widowControl/>
         <w:spacing w:after="0" w:before="0" w:line="240" w:lineRule="auto"/>
         <w:ind w:firstLine="0" w:left="142" w:right="85"/>
@@ -2510,17 +2515,16 @@
       </w:pPr>
       <w:r>
         <w:rPr>
-          <w:rFonts w:ascii="Times New Roman" w:hAnsi="Times New Roman"/>
-          <w:b w:val="0"/>
-          <w:sz w:val="26"/>
+          <w:rFonts w:ascii="Consolas" w:hAnsi="Consolas"/>
+          <w:sz w:val="17"/>
         </w:rPr>
         <w:t>require __DIR__ . '/../src/Input.php';</w:t>
       </w:r>
     </w:p>
     <w:p>
       <w:pPr>
-        <w:keepNext/>
-        <w:keepLines/>
+        <w:keepNext w:val="0"/>
+        <w:keepLines w:val="0"/>
         <w:widowControl/>
         <w:spacing w:after="0" w:before="0" w:line="240" w:lineRule="auto"/>
         <w:ind w:firstLine="0" w:left="142" w:right="85"/>
@@ -2528,17 +2532,16 @@
       </w:pPr>
       <w:r>
         <w:rPr>
-          <w:rFonts w:ascii="Times New Roman" w:hAnsi="Times New Roman"/>
-          <w:b w:val="0"/>
-          <w:sz w:val="26"/>
+          <w:rFonts w:ascii="Consolas" w:hAnsi="Consolas"/>
+          <w:sz w:val="17"/>
         </w:rPr>
         <w:t>require __DIR__ . '/../src/EventFilter.php';</w:t>
       </w:r>
     </w:p>
     <w:p>
       <w:pPr>
-        <w:keepNext/>
-        <w:keepLines/>
+        <w:keepNext w:val="0"/>
+        <w:keepLines w:val="0"/>
         <w:widowControl/>
         <w:spacing w:after="0" w:before="0" w:line="240" w:lineRule="auto"/>
         <w:ind w:firstLine="0" w:left="142" w:right="85"/>
@@ -2546,17 +2549,16 @@
       </w:pPr>
       <w:r>
         <w:rPr>
-          <w:rFonts w:ascii="Times New Roman" w:hAnsi="Times New Roman"/>
-          <w:b w:val="0"/>
-          <w:sz w:val="26"/>
+          <w:rFonts w:ascii="Consolas" w:hAnsi="Consolas"/>
+          <w:sz w:val="17"/>
         </w:rPr>
         <w:t>$events = require __DIR__ . '/../data/events.php';</w:t>
       </w:r>
     </w:p>
     <w:p>
       <w:pPr>
-        <w:keepNext/>
-        <w:keepLines/>
+        <w:keepNext w:val="0"/>
+        <w:keepLines w:val="0"/>
         <w:widowControl/>
         <w:spacing w:after="0" w:before="0" w:line="240" w:lineRule="auto"/>
         <w:ind w:firstLine="0" w:left="142" w:right="85"/>
@@ -2564,17 +2566,16 @@
       </w:pPr>
       <w:r>
         <w:rPr>
-          <w:rFonts w:ascii="Times New Roman" w:hAnsi="Times New Roman"/>
-          <w:b w:val="0"/>
-          <w:sz w:val="26"/>
+          <w:rFonts w:ascii="Consolas" w:hAnsi="Consolas"/>
+          <w:sz w:val="17"/>
         </w:rPr>
         <w:t>$query = field($_GET, 'q');</w:t>
       </w:r>
     </w:p>
     <w:p>
       <w:pPr>
-        <w:keepNext/>
-        <w:keepLines/>
+        <w:keepNext w:val="0"/>
+        <w:keepLines w:val="0"/>
         <w:widowControl/>
         <w:spacing w:after="0" w:before="0" w:line="240" w:lineRule="auto"/>
         <w:ind w:firstLine="0" w:left="142" w:right="85"/>
@@ -2582,17 +2583,16 @@
       </w:pPr>
       <w:r>
         <w:rPr>
-          <w:rFonts w:ascii="Times New Roman" w:hAnsi="Times New Roman"/>
-          <w:b w:val="0"/>
-          <w:sz w:val="26"/>
+          <w:rFonts w:ascii="Consolas" w:hAnsi="Consolas"/>
+          <w:sz w:val="17"/>
         </w:rPr>
         <w:t>$visible = filterEvents($events, $query);</w:t>
       </w:r>
     </w:p>
     <w:p>
       <w:pPr>
-        <w:keepNext/>
-        <w:keepLines/>
+        <w:keepNext w:val="0"/>
+        <w:keepLines w:val="0"/>
         <w:widowControl/>
         <w:spacing w:after="0" w:before="0" w:line="240" w:lineRule="auto"/>
         <w:ind w:firstLine="0" w:left="142" w:right="85"/>
@@ -2600,17 +2600,16 @@
       </w:pPr>
       <w:r>
         <w:rPr>
-          <w:rFonts w:ascii="Times New Roman" w:hAnsi="Times New Roman"/>
-          <w:b w:val="0"/>
-          <w:sz w:val="26"/>
-        </w:rPr>
-        <w:t>require __DIR__ . '/../templates/header.php';</w:t>
+          <w:rFonts w:ascii="Consolas" w:hAnsi="Consolas"/>
+          <w:sz w:val="17"/>
+        </w:rPr>
+        <w:t>require_once __DIR__ . '/../templates/event-presentation.php';</w:t>
       </w:r>
     </w:p>
     <w:p>
       <w:pPr>
-        <w:keepNext/>
-        <w:keepLines/>
+        <w:keepNext w:val="0"/>
+        <w:keepLines w:val="0"/>
         <w:widowControl/>
         <w:spacing w:after="0" w:before="0" w:line="240" w:lineRule="auto"/>
         <w:ind w:firstLine="0" w:left="142" w:right="85"/>
@@ -2618,17 +2617,16 @@
       </w:pPr>
       <w:r>
         <w:rPr>
-          <w:rFonts w:ascii="Times New Roman" w:hAnsi="Times New Roman"/>
-          <w:b w:val="0"/>
-          <w:sz w:val="26"/>
-        </w:rPr>
-        <w:t>?&gt;</w:t>
+          <w:rFonts w:ascii="Consolas" w:hAnsi="Consolas"/>
+          <w:sz w:val="17"/>
+        </w:rPr>
+        <w:t>require __DIR__ . '/../templates/header.php';</w:t>
       </w:r>
     </w:p>
     <w:p>
       <w:pPr>
-        <w:keepNext/>
-        <w:keepLines/>
+        <w:keepNext w:val="0"/>
+        <w:keepLines w:val="0"/>
         <w:widowControl/>
         <w:spacing w:after="0" w:before="0" w:line="240" w:lineRule="auto"/>
         <w:ind w:firstLine="0" w:left="142" w:right="85"/>
@@ -2636,17 +2634,16 @@
       </w:pPr>
       <w:r>
         <w:rPr>
-          <w:rFonts w:ascii="Times New Roman" w:hAnsi="Times New Roman"/>
-          <w:b w:val="0"/>
-          <w:sz w:val="26"/>
-        </w:rPr>
-        <w:t>&lt;form method="get"&gt;</w:t>
+          <w:rFonts w:ascii="Consolas" w:hAnsi="Consolas"/>
+          <w:sz w:val="17"/>
+        </w:rPr>
+        <w:t>?&gt;</w:t>
       </w:r>
     </w:p>
     <w:p>
       <w:pPr>
-        <w:keepNext/>
-        <w:keepLines/>
+        <w:keepNext w:val="0"/>
+        <w:keepLines w:val="0"/>
         <w:widowControl/>
         <w:spacing w:after="0" w:before="0" w:line="240" w:lineRule="auto"/>
         <w:ind w:firstLine="0" w:left="142" w:right="85"/>
@@ -2654,17 +2651,16 @@
       </w:pPr>
       <w:r>
         <w:rPr>
-          <w:rFonts w:ascii="Times New Roman" w:hAnsi="Times New Roman"/>
-          <w:b w:val="0"/>
-          <w:sz w:val="26"/>
-        </w:rPr>
-        <w:t xml:space="preserve">    &lt;label&gt;Từ khóa</w:t>
+          <w:rFonts w:ascii="Consolas" w:hAnsi="Consolas"/>
+          <w:sz w:val="17"/>
+        </w:rPr>
+        <w:t>&lt;div class="page-heading page-heading--list page-search"&gt;</w:t>
       </w:r>
     </w:p>
     <w:p>
       <w:pPr>
-        <w:keepNext/>
-        <w:keepLines/>
+        <w:keepNext w:val="0"/>
+        <w:keepLines w:val="0"/>
         <w:widowControl/>
         <w:spacing w:after="0" w:before="0" w:line="240" w:lineRule="auto"/>
         <w:ind w:firstLine="0" w:left="142" w:right="85"/>
@@ -2672,17 +2668,16 @@
       </w:pPr>
       <w:r>
         <w:rPr>
-          <w:rFonts w:ascii="Times New Roman" w:hAnsi="Times New Roman"/>
-          <w:b w:val="0"/>
-          <w:sz w:val="26"/>
-        </w:rPr>
-        <w:t xml:space="preserve">        &lt;input name="q" value="&lt;?= e($query) ?&gt;"&gt;</w:t>
+          <w:rFonts w:ascii="Consolas" w:hAnsi="Consolas"/>
+          <w:sz w:val="17"/>
+        </w:rPr>
+        <w:t>&lt;h1&gt;Sự kiện&lt;/h1&gt;</w:t>
       </w:r>
     </w:p>
     <w:p>
       <w:pPr>
-        <w:keepNext/>
-        <w:keepLines/>
+        <w:keepNext w:val="0"/>
+        <w:keepLines w:val="0"/>
         <w:widowControl/>
         <w:spacing w:after="0" w:before="0" w:line="240" w:lineRule="auto"/>
         <w:ind w:firstLine="0" w:left="142" w:right="85"/>
@@ -2690,17 +2685,16 @@
       </w:pPr>
       <w:r>
         <w:rPr>
-          <w:rFonts w:ascii="Times New Roman" w:hAnsi="Times New Roman"/>
-          <w:b w:val="0"/>
-          <w:sz w:val="26"/>
-        </w:rPr>
-        <w:t xml:space="preserve">    &lt;/label&gt;</w:t>
+          <w:rFonts w:ascii="Consolas" w:hAnsi="Consolas"/>
+          <w:sz w:val="17"/>
+        </w:rPr>
+        <w:t>&lt;p&gt;Tìm theo tên và xem thông tin sự kiện.&lt;/p&gt;</w:t>
       </w:r>
     </w:p>
     <w:p>
       <w:pPr>
-        <w:keepNext/>
-        <w:keepLines/>
+        <w:keepNext w:val="0"/>
+        <w:keepLines w:val="0"/>
         <w:widowControl/>
         <w:spacing w:after="0" w:before="0" w:line="240" w:lineRule="auto"/>
         <w:ind w:firstLine="0" w:left="142" w:right="85"/>
@@ -2708,17 +2702,16 @@
       </w:pPr>
       <w:r>
         <w:rPr>
-          <w:rFonts w:ascii="Times New Roman" w:hAnsi="Times New Roman"/>
-          <w:b w:val="0"/>
-          <w:sz w:val="26"/>
-        </w:rPr>
-        <w:t xml:space="preserve">    &lt;button&gt;Tìm&lt;/button&gt;</w:t>
+          <w:rFonts w:ascii="Consolas" w:hAnsi="Consolas"/>
+          <w:sz w:val="17"/>
+        </w:rPr>
+        <w:t>&lt;/div&gt;</w:t>
       </w:r>
     </w:p>
     <w:p>
       <w:pPr>
-        <w:keepNext/>
-        <w:keepLines/>
+        <w:keepNext w:val="0"/>
+        <w:keepLines w:val="0"/>
         <w:widowControl/>
         <w:spacing w:after="0" w:before="0" w:line="240" w:lineRule="auto"/>
         <w:ind w:firstLine="0" w:left="142" w:right="85"/>
@@ -2726,17 +2719,16 @@
       </w:pPr>
       <w:r>
         <w:rPr>
-          <w:rFonts w:ascii="Times New Roman" w:hAnsi="Times New Roman"/>
-          <w:b w:val="0"/>
-          <w:sz w:val="26"/>
-        </w:rPr>
-        <w:t>&lt;/form&gt;</w:t>
+          <w:rFonts w:ascii="Consolas" w:hAnsi="Consolas"/>
+          <w:sz w:val="17"/>
+        </w:rPr>
+        <w:t>&lt;form class="search-form" method="get"&gt;</w:t>
       </w:r>
     </w:p>
     <w:p>
       <w:pPr>
-        <w:keepNext/>
-        <w:keepLines/>
+        <w:keepNext w:val="0"/>
+        <w:keepLines w:val="0"/>
         <w:widowControl/>
         <w:spacing w:after="0" w:before="0" w:line="240" w:lineRule="auto"/>
         <w:ind w:firstLine="0" w:left="142" w:right="85"/>
@@ -2744,17 +2736,16 @@
       </w:pPr>
       <w:r>
         <w:rPr>
-          <w:rFonts w:ascii="Times New Roman" w:hAnsi="Times New Roman"/>
-          <w:b w:val="0"/>
-          <w:sz w:val="26"/>
-        </w:rPr>
-        <w:t>&lt;p&gt;Kết quả: &lt;?= count($visible) ?&gt;&lt;/p&gt;</w:t>
+          <w:rFonts w:ascii="Consolas" w:hAnsi="Consolas"/>
+          <w:sz w:val="17"/>
+        </w:rPr>
+        <w:t xml:space="preserve">    &lt;label class="form-field" for="q"&gt;Từ khóa</w:t>
       </w:r>
     </w:p>
     <w:p>
       <w:pPr>
-        <w:keepNext/>
-        <w:keepLines/>
+        <w:keepNext w:val="0"/>
+        <w:keepLines w:val="0"/>
         <w:widowControl/>
         <w:spacing w:after="0" w:before="0" w:line="240" w:lineRule="auto"/>
         <w:ind w:firstLine="0" w:left="142" w:right="85"/>
@@ -2762,17 +2753,16 @@
       </w:pPr>
       <w:r>
         <w:rPr>
-          <w:rFonts w:ascii="Times New Roman" w:hAnsi="Times New Roman"/>
-          <w:b w:val="0"/>
-          <w:sz w:val="26"/>
-        </w:rPr>
-        <w:t>&lt;?php foreach ($visible as $event): ?&gt;</w:t>
+          <w:rFonts w:ascii="Consolas" w:hAnsi="Consolas"/>
+          <w:sz w:val="17"/>
+        </w:rPr>
+        <w:t>&lt;input id="q" name="q" value="&lt;?= e($query) ?&gt;"&gt;</w:t>
       </w:r>
     </w:p>
     <w:p>
       <w:pPr>
-        <w:keepNext/>
-        <w:keepLines/>
+        <w:keepNext w:val="0"/>
+        <w:keepLines w:val="0"/>
         <w:widowControl/>
         <w:spacing w:after="0" w:before="0" w:line="240" w:lineRule="auto"/>
         <w:ind w:firstLine="0" w:left="142" w:right="85"/>
@@ -2780,17 +2770,16 @@
       </w:pPr>
       <w:r>
         <w:rPr>
-          <w:rFonts w:ascii="Times New Roman" w:hAnsi="Times New Roman"/>
-          <w:b w:val="0"/>
-          <w:sz w:val="26"/>
-        </w:rPr>
-        <w:t xml:space="preserve">    &lt;article&gt;</w:t>
+          <w:rFonts w:ascii="Consolas" w:hAnsi="Consolas"/>
+          <w:sz w:val="17"/>
+        </w:rPr>
+        <w:t xml:space="preserve">    &lt;/label&gt;</w:t>
       </w:r>
     </w:p>
     <w:p>
       <w:pPr>
-        <w:keepNext/>
-        <w:keepLines/>
+        <w:keepNext w:val="0"/>
+        <w:keepLines w:val="0"/>
         <w:widowControl/>
         <w:spacing w:after="0" w:before="0" w:line="240" w:lineRule="auto"/>
         <w:ind w:firstLine="0" w:left="142" w:right="85"/>
@@ -2798,17 +2787,16 @@
       </w:pPr>
       <w:r>
         <w:rPr>
-          <w:rFonts w:ascii="Times New Roman" w:hAnsi="Times New Roman"/>
-          <w:b w:val="0"/>
-          <w:sz w:val="26"/>
-        </w:rPr>
-        <w:t xml:space="preserve">        &lt;strong&gt;&lt;?= e($event['title']) ?&gt;&lt;/strong&gt;&lt;br&gt;</w:t>
+          <w:rFonts w:ascii="Consolas" w:hAnsi="Consolas"/>
+          <w:sz w:val="17"/>
+        </w:rPr>
+        <w:t xml:space="preserve">    &lt;button&gt;Tìm&lt;/button&gt;</w:t>
       </w:r>
     </w:p>
     <w:p>
       <w:pPr>
-        <w:keepNext/>
-        <w:keepLines/>
+        <w:keepNext w:val="0"/>
+        <w:keepLines w:val="0"/>
         <w:widowControl/>
         <w:spacing w:after="0" w:before="0" w:line="240" w:lineRule="auto"/>
         <w:ind w:firstLine="0" w:left="142" w:right="85"/>
@@ -2816,17 +2804,16 @@
       </w:pPr>
       <w:r>
         <w:rPr>
-          <w:rFonts w:ascii="Times New Roman" w:hAnsi="Times New Roman"/>
-          <w:b w:val="0"/>
-          <w:sz w:val="26"/>
-        </w:rPr>
-        <w:t xml:space="preserve">        Loại: &lt;?= e($event['category']) ?&gt;.&lt;br&gt;</w:t>
+          <w:rFonts w:ascii="Consolas" w:hAnsi="Consolas"/>
+          <w:sz w:val="17"/>
+        </w:rPr>
+        <w:t>&lt;/form&gt;</w:t>
       </w:r>
     </w:p>
     <w:p>
       <w:pPr>
-        <w:keepNext/>
-        <w:keepLines/>
+        <w:keepNext w:val="0"/>
+        <w:keepLines w:val="0"/>
         <w:widowControl/>
         <w:spacing w:after="0" w:before="0" w:line="240" w:lineRule="auto"/>
         <w:ind w:firstLine="0" w:left="142" w:right="85"/>
@@ -2834,17 +2821,16 @@
       </w:pPr>
       <w:r>
         <w:rPr>
-          <w:rFonts w:ascii="Times New Roman" w:hAnsi="Times New Roman"/>
-          <w:b w:val="0"/>
-          <w:sz w:val="26"/>
-        </w:rPr>
-        <w:t xml:space="preserve">        Còn &lt;?= max(0, $event['capacity'] - $event['registered']) ?&gt;</w:t>
+          <w:rFonts w:ascii="Consolas" w:hAnsi="Consolas"/>
+          <w:sz w:val="17"/>
+        </w:rPr>
+        <w:t>&lt;p class="result-count"&gt;Kết quả: &lt;?= count($visible) ?&gt;&lt;/p&gt;</w:t>
       </w:r>
     </w:p>
     <w:p>
       <w:pPr>
-        <w:keepNext/>
-        <w:keepLines/>
+        <w:keepNext w:val="0"/>
+        <w:keepLines w:val="0"/>
         <w:widowControl/>
         <w:spacing w:after="0" w:before="0" w:line="240" w:lineRule="auto"/>
         <w:ind w:firstLine="0" w:left="142" w:right="85"/>
@@ -2852,17 +2838,16 @@
       </w:pPr>
       <w:r>
         <w:rPr>
-          <w:rFonts w:ascii="Times New Roman" w:hAnsi="Times New Roman"/>
-          <w:b w:val="0"/>
-          <w:sz w:val="26"/>
-        </w:rPr>
-        <w:t xml:space="preserve">        chỗ (dữ liệu mẫu).</w:t>
+          <w:rFonts w:ascii="Consolas" w:hAnsi="Consolas"/>
+          <w:sz w:val="17"/>
+        </w:rPr>
+        <w:t>&lt;section class="event-list" aria-label="Danh sách sự kiện"&gt;</w:t>
       </w:r>
     </w:p>
     <w:p>
       <w:pPr>
-        <w:keepNext/>
-        <w:keepLines/>
+        <w:keepNext w:val="0"/>
+        <w:keepLines w:val="0"/>
         <w:widowControl/>
         <w:spacing w:after="0" w:before="0" w:line="240" w:lineRule="auto"/>
         <w:ind w:firstLine="0" w:left="142" w:right="85"/>
@@ -2870,17 +2855,16 @@
       </w:pPr>
       <w:r>
         <w:rPr>
-          <w:rFonts w:ascii="Times New Roman" w:hAnsi="Times New Roman"/>
-          <w:b w:val="0"/>
-          <w:sz w:val="26"/>
-        </w:rPr>
-        <w:t xml:space="preserve">    &lt;/article&gt;</w:t>
+          <w:rFonts w:ascii="Consolas" w:hAnsi="Consolas"/>
+          <w:sz w:val="17"/>
+        </w:rPr>
+        <w:t>&lt;?php foreach ($visible as $event): ?&gt;</w:t>
       </w:r>
     </w:p>
     <w:p>
       <w:pPr>
-        <w:keepNext/>
-        <w:keepLines/>
+        <w:keepNext w:val="0"/>
+        <w:keepLines w:val="0"/>
         <w:widowControl/>
         <w:spacing w:after="0" w:before="0" w:line="240" w:lineRule="auto"/>
         <w:ind w:firstLine="0" w:left="142" w:right="85"/>
@@ -2888,17 +2872,16 @@
       </w:pPr>
       <w:r>
         <w:rPr>
-          <w:rFonts w:ascii="Times New Roman" w:hAnsi="Times New Roman"/>
-          <w:b w:val="0"/>
-          <w:sz w:val="26"/>
-        </w:rPr>
-        <w:t>&lt;?php endforeach; ?&gt;</w:t>
+          <w:rFonts w:ascii="Consolas" w:hAnsi="Consolas"/>
+          <w:sz w:val="17"/>
+        </w:rPr>
+        <w:t xml:space="preserve">    &lt;article class="event-item event-card"&gt;</w:t>
       </w:r>
     </w:p>
     <w:p>
       <w:pPr>
-        <w:keepNext/>
-        <w:keepLines/>
+        <w:keepNext w:val="0"/>
+        <w:keepLines w:val="0"/>
         <w:widowControl/>
         <w:spacing w:after="0" w:before="0" w:line="240" w:lineRule="auto"/>
         <w:ind w:firstLine="0" w:left="142" w:right="85"/>
@@ -2906,17 +2889,16 @@
       </w:pPr>
       <w:r>
         <w:rPr>
-          <w:rFonts w:ascii="Times New Roman" w:hAnsi="Times New Roman"/>
-          <w:b w:val="0"/>
-          <w:sz w:val="26"/>
-        </w:rPr>
-        <w:t>&lt;?php if (!$visible): ?&gt;</w:t>
+          <w:rFonts w:ascii="Consolas" w:hAnsi="Consolas"/>
+          <w:sz w:val="17"/>
+        </w:rPr>
+        <w:t>&lt;?php $content = uiContent((int)$event['id']); ?&gt;</w:t>
       </w:r>
     </w:p>
     <w:p>
       <w:pPr>
-        <w:keepNext/>
-        <w:keepLines/>
+        <w:keepNext w:val="0"/>
+        <w:keepLines w:val="0"/>
         <w:widowControl/>
         <w:spacing w:after="0" w:before="0" w:line="240" w:lineRule="auto"/>
         <w:ind w:firstLine="0" w:left="142" w:right="85"/>
@@ -2924,17 +2906,16 @@
       </w:pPr>
       <w:r>
         <w:rPr>
-          <w:rFonts w:ascii="Times New Roman" w:hAnsi="Times New Roman"/>
-          <w:b w:val="0"/>
-          <w:sz w:val="26"/>
-        </w:rPr>
-        <w:t xml:space="preserve">    &lt;p&gt;Không có kết quả.&lt;/p&gt;</w:t>
+          <w:rFonts w:ascii="Consolas" w:hAnsi="Consolas"/>
+          <w:sz w:val="17"/>
+        </w:rPr>
+        <w:t>&lt;figure class="event-cover"&gt;</w:t>
       </w:r>
     </w:p>
     <w:p>
       <w:pPr>
         <w:keepNext w:val="0"/>
-        <w:keepLines/>
+        <w:keepLines w:val="0"/>
         <w:widowControl/>
         <w:spacing w:after="0" w:before="0" w:line="240" w:lineRule="auto"/>
         <w:ind w:firstLine="0" w:left="142" w:right="85"/>
@@ -2942,11 +2923,724 @@
       </w:pPr>
       <w:r>
         <w:rPr>
+          <w:rFonts w:ascii="Consolas" w:hAnsi="Consolas"/>
+          <w:sz w:val="17"/>
+        </w:rPr>
+        <w:t>&lt;img src="&lt;?= e(uiImage($content['image'])) ?&gt;" alt="&lt;?= e($content['alt']) ?&gt;" width="960" height="540"&gt;</w:t>
+      </w:r>
+    </w:p>
+    <w:p>
+      <w:pPr>
+        <w:keepNext w:val="0"/>
+        <w:keepLines w:val="0"/>
+        <w:widowControl/>
+        <w:spacing w:after="0" w:before="0" w:line="240" w:lineRule="auto"/>
+        <w:ind w:firstLine="0" w:left="142" w:right="85"/>
+        <w:jc w:val="left"/>
+      </w:pPr>
+      <w:r>
+        <w:rPr>
+          <w:rFonts w:ascii="Consolas" w:hAnsi="Consolas"/>
+          <w:sz w:val="17"/>
+        </w:rPr>
+        <w:t>&lt;figcaption&gt;Minh họa&lt;/figcaption&gt;</w:t>
+      </w:r>
+    </w:p>
+    <w:p>
+      <w:pPr>
+        <w:keepNext w:val="0"/>
+        <w:keepLines w:val="0"/>
+        <w:widowControl/>
+        <w:spacing w:after="0" w:before="0" w:line="240" w:lineRule="auto"/>
+        <w:ind w:firstLine="0" w:left="142" w:right="85"/>
+        <w:jc w:val="left"/>
+      </w:pPr>
+      <w:r>
+        <w:rPr>
+          <w:rFonts w:ascii="Consolas" w:hAnsi="Consolas"/>
+          <w:sz w:val="17"/>
+        </w:rPr>
+        <w:t>&lt;/figure&gt;</w:t>
+      </w:r>
+    </w:p>
+    <w:p>
+      <w:pPr>
+        <w:keepNext w:val="0"/>
+        <w:keepLines w:val="0"/>
+        <w:widowControl/>
+        <w:spacing w:after="0" w:before="0" w:line="240" w:lineRule="auto"/>
+        <w:ind w:firstLine="0" w:left="142" w:right="85"/>
+        <w:jc w:val="left"/>
+      </w:pPr>
+      <w:r>
+        <w:rPr>
+          <w:rFonts w:ascii="Consolas" w:hAnsi="Consolas"/>
+          <w:sz w:val="17"/>
+        </w:rPr>
+        <w:t>&lt;div class="event-card-content"&gt;</w:t>
+      </w:r>
+    </w:p>
+    <w:p>
+      <w:pPr>
+        <w:keepNext w:val="0"/>
+        <w:keepLines w:val="0"/>
+        <w:widowControl/>
+        <w:spacing w:after="0" w:before="0" w:line="240" w:lineRule="auto"/>
+        <w:ind w:firstLine="0" w:left="142" w:right="85"/>
+        <w:jc w:val="left"/>
+      </w:pPr>
+      <w:r>
+        <w:rPr>
+          <w:rFonts w:ascii="Consolas" w:hAnsi="Consolas"/>
+          <w:sz w:val="17"/>
+        </w:rPr>
+        <w:t xml:space="preserve">        &lt;h2 class="event-title"&gt;&lt;?= e($event['title']) ?&gt;&lt;/h2&gt;</w:t>
+      </w:r>
+    </w:p>
+    <w:p>
+      <w:pPr>
+        <w:keepNext w:val="0"/>
+        <w:keepLines w:val="0"/>
+        <w:widowControl/>
+        <w:spacing w:after="0" w:before="0" w:line="240" w:lineRule="auto"/>
+        <w:ind w:firstLine="0" w:left="142" w:right="85"/>
+        <w:jc w:val="left"/>
+      </w:pPr>
+      <w:r>
+        <w:rPr>
+          <w:rFonts w:ascii="Consolas" w:hAnsi="Consolas"/>
+          <w:sz w:val="17"/>
+        </w:rPr>
+        <w:t>&lt;p class="event-date"&gt;&lt;?= e(uiDate($content['start'])) ?&gt;&lt;/p&gt;</w:t>
+      </w:r>
+    </w:p>
+    <w:p>
+      <w:pPr>
+        <w:keepNext w:val="0"/>
+        <w:keepLines w:val="0"/>
+        <w:widowControl/>
+        <w:spacing w:after="0" w:before="0" w:line="240" w:lineRule="auto"/>
+        <w:ind w:firstLine="0" w:left="142" w:right="85"/>
+        <w:jc w:val="left"/>
+      </w:pPr>
+      <w:r>
+        <w:rPr>
+          <w:rFonts w:ascii="Consolas" w:hAnsi="Consolas"/>
+          <w:sz w:val="17"/>
+        </w:rPr>
+        <w:t>&lt;p class="event-venue"&gt;&lt;?= e($content['venue']) ?&gt;&lt;/p&gt;</w:t>
+      </w:r>
+    </w:p>
+    <w:p>
+      <w:pPr>
+        <w:keepNext w:val="0"/>
+        <w:keepLines w:val="0"/>
+        <w:widowControl/>
+        <w:spacing w:after="0" w:before="0" w:line="240" w:lineRule="auto"/>
+        <w:ind w:firstLine="0" w:left="142" w:right="85"/>
+        <w:jc w:val="left"/>
+      </w:pPr>
+      <w:r>
+        <w:rPr>
+          <w:rFonts w:ascii="Consolas" w:hAnsi="Consolas"/>
+          <w:sz w:val="17"/>
+        </w:rPr>
+        <w:t>&lt;p&gt;&lt;?= e($content['summary']) ?&gt;&lt;/p&gt;</w:t>
+      </w:r>
+    </w:p>
+    <w:p>
+      <w:pPr>
+        <w:keepNext w:val="0"/>
+        <w:keepLines w:val="0"/>
+        <w:widowControl/>
+        <w:spacing w:after="0" w:before="0" w:line="240" w:lineRule="auto"/>
+        <w:ind w:firstLine="0" w:left="142" w:right="85"/>
+        <w:jc w:val="left"/>
+      </w:pPr>
+      <w:r>
+        <w:rPr>
+          <w:rFonts w:ascii="Consolas" w:hAnsi="Consolas"/>
+          <w:sz w:val="17"/>
+        </w:rPr>
+        <w:t>&lt;p class="event-meta"&gt;</w:t>
+      </w:r>
+    </w:p>
+    <w:p>
+      <w:pPr>
+        <w:keepNext w:val="0"/>
+        <w:keepLines w:val="0"/>
+        <w:widowControl/>
+        <w:spacing w:after="0" w:before="0" w:line="240" w:lineRule="auto"/>
+        <w:ind w:firstLine="0" w:left="142" w:right="85"/>
+        <w:jc w:val="left"/>
+      </w:pPr>
+      <w:r>
+        <w:rPr>
+          <w:rFonts w:ascii="Consolas" w:hAnsi="Consolas"/>
+          <w:sz w:val="17"/>
+        </w:rPr>
+        <w:t xml:space="preserve">        Loại: &lt;?= e($event['category']) ?&gt;. </w:t>
+      </w:r>
+    </w:p>
+    <w:p>
+      <w:pPr>
+        <w:keepNext w:val="0"/>
+        <w:keepLines w:val="0"/>
+        <w:widowControl/>
+        <w:spacing w:after="0" w:before="0" w:line="240" w:lineRule="auto"/>
+        <w:ind w:firstLine="0" w:left="142" w:right="85"/>
+        <w:jc w:val="left"/>
+      </w:pPr>
+      <w:r>
+        <w:rPr>
+          <w:rFonts w:ascii="Consolas" w:hAnsi="Consolas"/>
+          <w:sz w:val="17"/>
+        </w:rPr>
+        <w:t xml:space="preserve">        Còn &lt;?= max(0, $event['capacity'] - $event['registered']) ?&gt;</w:t>
+      </w:r>
+    </w:p>
+    <w:p>
+      <w:pPr>
+        <w:keepNext w:val="0"/>
+        <w:keepLines w:val="0"/>
+        <w:widowControl/>
+        <w:spacing w:after="0" w:before="0" w:line="240" w:lineRule="auto"/>
+        <w:ind w:firstLine="0" w:left="142" w:right="85"/>
+        <w:jc w:val="left"/>
+      </w:pPr>
+      <w:r>
+        <w:rPr>
+          <w:rFonts w:ascii="Consolas" w:hAnsi="Consolas"/>
+          <w:sz w:val="17"/>
+        </w:rPr>
+        <w:t xml:space="preserve">        chỗ (dữ liệu mẫu).</w:t>
+      </w:r>
+    </w:p>
+    <w:p>
+      <w:pPr>
+        <w:keepNext w:val="0"/>
+        <w:keepLines w:val="0"/>
+        <w:widowControl/>
+        <w:spacing w:after="0" w:before="0" w:line="240" w:lineRule="auto"/>
+        <w:ind w:firstLine="0" w:left="142" w:right="85"/>
+        <w:jc w:val="left"/>
+      </w:pPr>
+      <w:r>
+        <w:rPr>
+          <w:rFonts w:ascii="Consolas" w:hAnsi="Consolas"/>
+          <w:sz w:val="17"/>
+        </w:rPr>
+        <w:t xml:space="preserve">    &lt;/p&gt;</w:t>
+      </w:r>
+    </w:p>
+    <w:p>
+      <w:pPr>
+        <w:keepNext w:val="0"/>
+        <w:keepLines w:val="0"/>
+        <w:widowControl/>
+        <w:spacing w:after="0" w:before="0" w:line="240" w:lineRule="auto"/>
+        <w:ind w:firstLine="0" w:left="142" w:right="85"/>
+        <w:jc w:val="left"/>
+      </w:pPr>
+      <w:r>
+        <w:rPr>
+          <w:rFonts w:ascii="Consolas" w:hAnsi="Consolas"/>
+          <w:sz w:val="17"/>
+        </w:rPr>
+        <w:t>&lt;a class="text-button" href="/event.php?id=&lt;?= (int)$event['id'] ?&gt;"&gt;Xem chi tiết&lt;/a&gt;</w:t>
+      </w:r>
+    </w:p>
+    <w:p>
+      <w:pPr>
+        <w:keepNext w:val="0"/>
+        <w:keepLines w:val="0"/>
+        <w:widowControl/>
+        <w:spacing w:after="0" w:before="0" w:line="240" w:lineRule="auto"/>
+        <w:ind w:firstLine="0" w:left="142" w:right="85"/>
+        <w:jc w:val="left"/>
+      </w:pPr>
+      <w:r>
+        <w:rPr>
+          <w:rFonts w:ascii="Consolas" w:hAnsi="Consolas"/>
+          <w:sz w:val="17"/>
+        </w:rPr>
+        <w:t>&lt;/div&gt;</w:t>
+      </w:r>
+    </w:p>
+    <w:p>
+      <w:pPr>
+        <w:keepNext w:val="0"/>
+        <w:keepLines w:val="0"/>
+        <w:widowControl/>
+        <w:spacing w:after="0" w:before="0" w:line="240" w:lineRule="auto"/>
+        <w:ind w:firstLine="0" w:left="142" w:right="85"/>
+        <w:jc w:val="left"/>
+      </w:pPr>
+      <w:r>
+        <w:rPr>
+          <w:rFonts w:ascii="Consolas" w:hAnsi="Consolas"/>
+          <w:sz w:val="17"/>
+        </w:rPr>
+        <w:t>&lt;/article&gt;</w:t>
+      </w:r>
+    </w:p>
+    <w:p>
+      <w:pPr>
+        <w:keepNext w:val="0"/>
+        <w:keepLines w:val="0"/>
+        <w:widowControl/>
+        <w:spacing w:after="0" w:before="0" w:line="240" w:lineRule="auto"/>
+        <w:ind w:firstLine="0" w:left="142" w:right="85"/>
+        <w:jc w:val="left"/>
+      </w:pPr>
+      <w:r>
+        <w:rPr>
+          <w:rFonts w:ascii="Consolas" w:hAnsi="Consolas"/>
+          <w:sz w:val="17"/>
+        </w:rPr>
+        <w:t>&lt;?php endforeach; ?&gt;</w:t>
+      </w:r>
+    </w:p>
+    <w:p>
+      <w:pPr>
+        <w:keepNext w:val="0"/>
+        <w:keepLines w:val="0"/>
+        <w:widowControl/>
+        <w:spacing w:after="0" w:before="0" w:line="240" w:lineRule="auto"/>
+        <w:ind w:firstLine="0" w:left="142" w:right="85"/>
+        <w:jc w:val="left"/>
+      </w:pPr>
+      <w:r>
+        <w:rPr>
+          <w:rFonts w:ascii="Consolas" w:hAnsi="Consolas"/>
+          <w:sz w:val="17"/>
+        </w:rPr>
+        <w:t>&lt;/section&gt;</w:t>
+      </w:r>
+    </w:p>
+    <w:p>
+      <w:pPr>
+        <w:keepNext w:val="0"/>
+        <w:keepLines w:val="0"/>
+        <w:widowControl/>
+        <w:spacing w:after="0" w:before="0" w:line="240" w:lineRule="auto"/>
+        <w:ind w:firstLine="0" w:left="142" w:right="85"/>
+        <w:jc w:val="left"/>
+      </w:pPr>
+      <w:r>
+        <w:rPr>
+          <w:rFonts w:ascii="Consolas" w:hAnsi="Consolas"/>
+          <w:sz w:val="17"/>
+        </w:rPr>
+        <w:t>&lt;?php if (!$visible): ?&gt;</w:t>
+      </w:r>
+    </w:p>
+    <w:p>
+      <w:pPr>
+        <w:keepNext w:val="0"/>
+        <w:keepLines w:val="0"/>
+        <w:widowControl/>
+        <w:spacing w:after="0" w:before="0" w:line="240" w:lineRule="auto"/>
+        <w:ind w:firstLine="0" w:left="142" w:right="85"/>
+        <w:jc w:val="left"/>
+      </w:pPr>
+      <w:r>
+        <w:rPr>
+          <w:rFonts w:ascii="Consolas" w:hAnsi="Consolas"/>
+          <w:sz w:val="17"/>
+        </w:rPr>
+        <w:t xml:space="preserve">    &lt;p class="empty-state"&gt;Không có kết quả.&lt;span&gt;Thử tìm với một từ khóa khác.&lt;/span&gt;</w:t>
+      </w:r>
+    </w:p>
+    <w:p>
+      <w:pPr>
+        <w:keepNext w:val="0"/>
+        <w:keepLines w:val="0"/>
+        <w:widowControl/>
+        <w:spacing w:after="0" w:before="0" w:line="240" w:lineRule="auto"/>
+        <w:ind w:firstLine="0" w:left="142" w:right="85"/>
+        <w:jc w:val="left"/>
+      </w:pPr>
+      <w:r>
+        <w:rPr>
+          <w:rFonts w:ascii="Consolas" w:hAnsi="Consolas"/>
+          <w:sz w:val="17"/>
+        </w:rPr>
+        <w:t>&lt;/p&gt;</w:t>
+      </w:r>
+    </w:p>
+    <w:p>
+      <w:pPr>
+        <w:keepNext w:val="0"/>
+        <w:keepLines w:val="0"/>
+        <w:widowControl/>
+        <w:spacing w:after="0" w:before="0" w:line="240" w:lineRule="auto"/>
+        <w:ind w:firstLine="0" w:left="142" w:right="85"/>
+        <w:jc w:val="left"/>
+      </w:pPr>
+      <w:r>
+        <w:rPr>
+          <w:rFonts w:ascii="Consolas" w:hAnsi="Consolas"/>
+          <w:sz w:val="17"/>
+        </w:rPr>
+        <w:t>&lt;?php endif; ?&gt;</w:t>
+      </w:r>
+    </w:p>
+    <w:p>
+      <w:pPr>
+        <w:keepNext w:val="0"/>
+        <w:keepLines w:val="0"/>
+        <w:widowControl/>
+        <w:spacing w:after="0" w:before="0" w:line="240" w:lineRule="auto"/>
+        <w:ind w:firstLine="0" w:left="142" w:right="85"/>
+        <w:jc w:val="left"/>
+      </w:pPr>
+      <w:r>
+        <w:rPr>
+          <w:rFonts w:ascii="Consolas" w:hAnsi="Consolas"/>
+          <w:sz w:val="17"/>
+        </w:rPr>
+        <w:t>&lt;p class="content-note"&gt;Thời gian, địa điểm và ảnh bổ sung là nội dung hư cấu phục vụ học tập. Dữ liệu đăng ký vẫn lấy từ nguồn gốc của lab.&lt;/p&gt;</w:t>
+      </w:r>
+    </w:p>
+    <w:p>
+      <w:pPr>
+        <w:keepNext w:val="0"/>
+        <w:keepLines w:val="0"/>
+        <w:widowControl/>
+        <w:spacing w:after="0" w:before="0" w:line="240" w:lineRule="auto"/>
+        <w:ind w:firstLine="0" w:left="142" w:right="85"/>
+        <w:jc w:val="left"/>
+      </w:pPr>
+      <w:r>
+        <w:rPr>
+          <w:rFonts w:ascii="Consolas" w:hAnsi="Consolas"/>
+          <w:sz w:val="17"/>
+        </w:rPr>
+        <w:t>&lt;section class="demo-entry"&gt;&lt;h2&gt;Sáu bối cảnh, một khu thử riêng&lt;/h2&gt;</w:t>
+      </w:r>
+    </w:p>
+    <w:p>
+      <w:pPr>
+        <w:keepNext w:val="0"/>
+        <w:keepLines w:val="0"/>
+        <w:widowControl/>
+        <w:spacing w:after="0" w:before="0" w:line="240" w:lineRule="auto"/>
+        <w:ind w:firstLine="0" w:left="142" w:right="85"/>
+        <w:jc w:val="left"/>
+      </w:pPr>
+      <w:r>
+        <w:rPr>
+          <w:rFonts w:ascii="Consolas" w:hAnsi="Consolas"/>
+          <w:sz w:val="17"/>
+        </w:rPr>
+        <w:t>&lt;p&gt;Hội thảo, workshop, âm nhạc, nghề nghiệp, online và triển lãm. Thử vé và ghế mà không đưa lựa chọn vào đăng ký của lab.&lt;/p&gt;</w:t>
+      </w:r>
+    </w:p>
+    <w:p>
+      <w:pPr>
+        <w:keepNext w:val="0"/>
+        <w:keepLines w:val="0"/>
+        <w:widowControl/>
+        <w:spacing w:after="0" w:before="0" w:line="240" w:lineRule="auto"/>
+        <w:ind w:firstLine="0" w:left="142" w:right="85"/>
+        <w:jc w:val="left"/>
+      </w:pPr>
+      <w:r>
+        <w:rPr>
+          <w:rFonts w:ascii="Consolas" w:hAnsi="Consolas"/>
+          <w:sz w:val="17"/>
+        </w:rPr>
+        <w:t>&lt;a class="text-button" href="/ui-demo.php"&gt;Khám phá sự kiện mẫu&lt;/a&gt;&lt;/section&gt;</w:t>
+      </w:r>
+    </w:p>
+    <w:p>
+      <w:pPr>
+        <w:keepNext w:val="0"/>
+        <w:keepLines w:val="0"/>
+        <w:widowControl/>
+        <w:spacing w:after="0" w:before="0" w:line="240" w:lineRule="auto"/>
+        <w:ind w:firstLine="0" w:left="142" w:right="85"/>
+        <w:jc w:val="left"/>
+      </w:pPr>
+      <w:r>
+        <w:rPr>
+          <w:rFonts w:ascii="Consolas" w:hAnsi="Consolas"/>
+          <w:sz w:val="17"/>
+        </w:rPr>
+        <w:t>&lt;?php require __DIR__ . '/../templates/footer.php'; ?&gt;</w:t>
+      </w:r>
+    </w:p>
+    <w:p>
+      <w:pPr>
+        <w:widowControl/>
+      </w:pPr>
+      <w:r>
+        <w:rPr>
+          <w:rFonts w:ascii="Times New Roman" w:hAnsi="Times New Roman"/>
+          <w:b w:val="0"/>
+          <w:color w:val="000000"/>
+          <w:sz w:val="26"/>
+        </w:rPr>
+        <w:t>Đọc theo thứ tự:</w:t>
+      </w:r>
+      <w:r>
+        <w:rPr>
+          <w:rFonts w:ascii="Times New Roman" w:hAnsi="Times New Roman"/>
+          <w:b w:val="0"/>
+          <w:color w:val="000000"/>
+          <w:sz w:val="26"/>
+        </w:rPr>
+        <w:t xml:space="preserve"> ba lệnh </w:t>
+      </w:r>
+      <w:r>
+        <w:rPr>
+          <w:rFonts w:ascii="Times New Roman" w:hAnsi="Times New Roman"/>
+          <w:b w:val="0"/>
+          <w:color w:val="000000"/>
+          <w:sz w:val="26"/>
+        </w:rPr>
+        <w:t>require</w:t>
+      </w:r>
+      <w:r>
+        <w:rPr>
+          <w:rFonts w:ascii="Times New Roman" w:hAnsi="Times New Roman"/>
+          <w:b w:val="0"/>
+          <w:color w:val="000000"/>
+          <w:sz w:val="26"/>
+        </w:rPr>
+        <w:t xml:space="preserve"> đầu nạp hàm và dữ liệu; </w:t>
+      </w:r>
+      <w:r>
+        <w:rPr>
+          <w:rFonts w:ascii="Times New Roman" w:hAnsi="Times New Roman"/>
+          <w:b w:val="0"/>
+          <w:color w:val="000000"/>
+          <w:sz w:val="26"/>
+        </w:rPr>
+        <w:t>$query</w:t>
+      </w:r>
+      <w:r>
+        <w:rPr>
+          <w:rFonts w:ascii="Times New Roman" w:hAnsi="Times New Roman"/>
+          <w:b w:val="0"/>
+          <w:color w:val="000000"/>
+          <w:sz w:val="26"/>
+        </w:rPr>
+        <w:t xml:space="preserve"> đọc từ khóa; </w:t>
+      </w:r>
+      <w:r>
+        <w:rPr>
+          <w:rFonts w:ascii="Times New Roman" w:hAnsi="Times New Roman"/>
+          <w:b w:val="0"/>
+          <w:color w:val="000000"/>
+          <w:sz w:val="26"/>
+        </w:rPr>
+        <w:t>$visible</w:t>
+      </w:r>
+      <w:r>
+        <w:rPr>
+          <w:rFonts w:ascii="Times New Roman" w:hAnsi="Times New Roman"/>
+          <w:b w:val="0"/>
+          <w:color w:val="000000"/>
+          <w:sz w:val="26"/>
+        </w:rPr>
+        <w:t xml:space="preserve"> nhận danh sách kết quả; header được nạp trước phần HTML, footer ở cuối. </w:t>
+      </w:r>
+      <w:r>
+        <w:rPr>
+          <w:rFonts w:ascii="Times New Roman" w:hAnsi="Times New Roman"/>
+          <w:b w:val="0"/>
+          <w:color w:val="000000"/>
+          <w:sz w:val="26"/>
+        </w:rPr>
+        <w:t>name="q"</w:t>
+      </w:r>
+      <w:r>
+        <w:rPr>
+          <w:rFonts w:ascii="Times New Roman" w:hAnsi="Times New Roman"/>
+          <w:b w:val="0"/>
+          <w:color w:val="000000"/>
+          <w:sz w:val="26"/>
+        </w:rPr>
+        <w:t xml:space="preserve"> là tên trường để PHP đọc </w:t>
+      </w:r>
+      <w:r>
+        <w:rPr>
+          <w:rFonts w:ascii="Times New Roman" w:hAnsi="Times New Roman"/>
+          <w:b w:val="0"/>
+          <w:color w:val="000000"/>
+          <w:sz w:val="26"/>
+        </w:rPr>
+        <w:t>$_GET['q']</w:t>
+      </w:r>
+      <w:r>
+        <w:rPr>
+          <w:rFonts w:ascii="Times New Roman" w:hAnsi="Times New Roman"/>
+          <w:b w:val="0"/>
+          <w:color w:val="000000"/>
+          <w:sz w:val="26"/>
+        </w:rPr>
+        <w:t xml:space="preserve">; </w:t>
+      </w:r>
+      <w:r>
+        <w:rPr>
+          <w:rFonts w:ascii="Times New Roman" w:hAnsi="Times New Roman"/>
+          <w:b w:val="0"/>
+          <w:color w:val="000000"/>
+          <w:sz w:val="26"/>
+        </w:rPr>
+        <w:t>value</w:t>
+      </w:r>
+      <w:r>
+        <w:rPr>
+          <w:rFonts w:ascii="Times New Roman" w:hAnsi="Times New Roman"/>
+          <w:b w:val="0"/>
+          <w:color w:val="000000"/>
+          <w:sz w:val="26"/>
+        </w:rPr>
+        <w:t xml:space="preserve"> giữ lại từ khóa sau khi gửi form. Dấu </w:t>
+      </w:r>
+      <w:r>
+        <w:rPr>
+          <w:rFonts w:ascii="Times New Roman" w:hAnsi="Times New Roman"/>
+          <w:b w:val="0"/>
+          <w:color w:val="000000"/>
+          <w:sz w:val="26"/>
+        </w:rPr>
+        <w:t>&lt;?= ... ?&gt;</w:t>
+      </w:r>
+      <w:r>
+        <w:rPr>
+          <w:rFonts w:ascii="Times New Roman" w:hAnsi="Times New Roman"/>
+          <w:b w:val="0"/>
+          <w:color w:val="000000"/>
+          <w:sz w:val="26"/>
+        </w:rPr>
+        <w:t xml:space="preserve"> in một giá trị vào HTML.</w:t>
+      </w:r>
+    </w:p>
+    <w:p>
+      <w:pPr>
+        <w:widowControl/>
+      </w:pPr>
+      <w:r>
+        <w:rPr>
+          <w:rFonts w:ascii="Times New Roman" w:hAnsi="Times New Roman"/>
+          <w:b w:val="0"/>
+          <w:color w:val="000000"/>
+          <w:sz w:val="26"/>
+        </w:rPr>
+        <w:t xml:space="preserve">Đoạn </w:t>
+      </w:r>
+      <w:r>
+        <w:rPr>
+          <w:rFonts w:ascii="Times New Roman" w:hAnsi="Times New Roman"/>
+          <w:b w:val="0"/>
+          <w:color w:val="000000"/>
+          <w:sz w:val="26"/>
+        </w:rPr>
+        <w:t>foreach ... endforeach</w:t>
+      </w:r>
+      <w:r>
+        <w:rPr>
+          <w:rFonts w:ascii="Times New Roman" w:hAnsi="Times New Roman"/>
+          <w:b w:val="0"/>
+          <w:color w:val="000000"/>
+          <w:sz w:val="26"/>
+        </w:rPr>
+        <w:t xml:space="preserve"> chỉ lặp qua kết quả tìm được, không phải mảng gốc. </w:t>
+      </w:r>
+      <w:r>
+        <w:rPr>
+          <w:rFonts w:ascii="Times New Roman" w:hAnsi="Times New Roman"/>
+          <w:b w:val="0"/>
+          <w:color w:val="000000"/>
+          <w:sz w:val="26"/>
+        </w:rPr>
+        <w:t>if (!$visible)</w:t>
+      </w:r>
+      <w:r>
+        <w:rPr>
+          <w:rFonts w:ascii="Times New Roman" w:hAnsi="Times New Roman"/>
+          <w:b w:val="0"/>
+          <w:color w:val="000000"/>
+          <w:sz w:val="26"/>
+        </w:rPr>
+        <w:t xml:space="preserve"> xử lý mảng rỗng. Cú pháp dạng dấu </w:t>
+      </w:r>
+      <w:r>
+        <w:rPr>
+          <w:rFonts w:ascii="Times New Roman" w:hAnsi="Times New Roman"/>
+          <w:b w:val="0"/>
+          <w:color w:val="000000"/>
+          <w:sz w:val="26"/>
+        </w:rPr>
+        <w:t>:</w:t>
+      </w:r>
+      <w:r>
+        <w:rPr>
+          <w:rFonts w:ascii="Times New Roman" w:hAnsi="Times New Roman"/>
+          <w:b w:val="0"/>
+          <w:color w:val="000000"/>
+          <w:sz w:val="26"/>
+        </w:rPr>
+        <w:t xml:space="preserve"> giúp trộn vòng lặp với HTML dễ nhìn hơn; ý nghĩa vẫn là vòng lặp PHP đã học.</w:t>
+      </w:r>
+    </w:p>
+    <w:p>
+      <w:pPr>
+        <w:keepNext/>
+        <w:widowControl/>
+      </w:pPr>
+      <w:r>
+        <w:rPr>
           <w:rFonts w:ascii="Times New Roman" w:hAnsi="Times New Roman"/>
           <w:b w:val="0"/>
           <w:sz w:val="26"/>
         </w:rPr>
-        <w:t>&lt;?php endif; ?&gt;</w:t>
+        <w:t>Kiểm tra kết quả bước 4:</w:t>
+      </w:r>
+    </w:p>
+    <w:p>
+      <w:pPr>
+        <w:widowControl/>
+        <w:ind w:firstLine="0" w:left="0"/>
+        <w:jc w:val="left"/>
+      </w:pPr>
+      <w:r>
+        <w:rPr>
+          <w:rFonts w:ascii="Times New Roman" w:hAnsi="Times New Roman"/>
+          <w:b w:val="0"/>
+          <w:color w:val="000000"/>
+          <w:sz w:val="26"/>
+        </w:rPr>
+        <w:t>[</w:t>
+      </w:r>
+      <w:r>
+        <w:rPr>
+          <w:rFonts w:ascii="Times New Roman" w:hAnsi="Times New Roman"/>
+          <w:b w:val="0"/>
+          <w:color w:val="000000"/>
+          <w:sz w:val="26"/>
+        </w:rPr>
+        <w:t xml:space="preserve"> ] Trang dùng require/foreach và form GET; biết dòng nào gọi hàm lọc.</w:t>
+      </w:r>
+    </w:p>
+    <w:p>
+      <w:pPr>
+        <w:pStyle w:val="Heading3"/>
+        <w:keepNext/>
+        <w:widowControl/>
+      </w:pPr>
+      <w:r>
+        <w:rPr>
+          <w:rFonts w:ascii="Times New Roman" w:hAnsi="Times New Roman"/>
+          <w:b/>
+          <w:color w:val="000000"/>
+          <w:sz w:val="26"/>
+        </w:rPr>
+        <w:t>Bước 5. Chạy trang và đối chiếu</w:t>
       </w:r>
     </w:p>
     <w:p>
@@ -2962,7 +3656,7 @@
           <w:b w:val="0"/>
           <w:sz w:val="26"/>
         </w:rPr>
-        <w:t>&lt;?php require __DIR__ . '/../templates/footer.php'; ?&gt;</w:t>
+        <w:t>bash lab.sh run</w:t>
       </w:r>
     </w:p>
     <w:p>
@@ -2976,7 +3670,7 @@
           <w:color w:val="000000"/>
           <w:sz w:val="26"/>
         </w:rPr>
-        <w:t>Đọc theo thứ tự:</w:t>
+        <w:t xml:space="preserve">Mở </w:t>
       </w:r>
       <w:r>
         <w:rPr>
@@ -2985,7 +3679,7 @@
           <w:color w:val="000000"/>
           <w:sz w:val="26"/>
         </w:rPr>
-        <w:t xml:space="preserve"> ba lệnh </w:t>
+        <w:t>http://127.0.0.1:8103</w:t>
       </w:r>
       <w:r>
         <w:rPr>
@@ -2994,7 +3688,7 @@
           <w:color w:val="000000"/>
           <w:sz w:val="26"/>
         </w:rPr>
-        <w:t>require</w:t>
+        <w:t xml:space="preserve">. Không nhập từ khóa: 3 sự kiện. Nhập </w:t>
       </w:r>
       <w:r>
         <w:rPr>
@@ -3003,7 +3697,7 @@
           <w:color w:val="000000"/>
           <w:sz w:val="26"/>
         </w:rPr>
-        <w:t xml:space="preserve"> đầu nạp hàm và dữ liệu; </w:t>
+        <w:t>php</w:t>
       </w:r>
       <w:r>
         <w:rPr>
@@ -3012,7 +3706,7 @@
           <w:color w:val="000000"/>
           <w:sz w:val="26"/>
         </w:rPr>
-        <w:t>$query</w:t>
+        <w:t xml:space="preserve">: 1 sự kiện. Nhập </w:t>
       </w:r>
       <w:r>
         <w:rPr>
@@ -3021,7 +3715,7 @@
           <w:color w:val="000000"/>
           <w:sz w:val="26"/>
         </w:rPr>
-        <w:t xml:space="preserve"> đọc từ khóa; </w:t>
+        <w:t>xyz</w:t>
       </w:r>
       <w:r>
         <w:rPr>
@@ -3030,7 +3724,7 @@
           <w:color w:val="000000"/>
           <w:sz w:val="26"/>
         </w:rPr>
-        <w:t>$visible</w:t>
+        <w:t xml:space="preserve">: 0 và có thông báo không tìm thấy. Quan sát URL có </w:t>
       </w:r>
       <w:r>
         <w:rPr>
@@ -3039,7 +3733,7 @@
           <w:color w:val="000000"/>
           <w:sz w:val="26"/>
         </w:rPr>
-        <w:t xml:space="preserve"> nhận danh sách kết quả; header được nạp trước phần HTML, footer ở cuối. </w:t>
+        <w:t>?q=php</w:t>
       </w:r>
       <w:r>
         <w:rPr>
@@ -3048,294 +3742,6 @@
           <w:color w:val="000000"/>
           <w:sz w:val="26"/>
         </w:rPr>
-        <w:t>name="q"</w:t>
-      </w:r>
-      <w:r>
-        <w:rPr>
-          <w:rFonts w:ascii="Times New Roman" w:hAnsi="Times New Roman"/>
-          <w:b w:val="0"/>
-          <w:color w:val="000000"/>
-          <w:sz w:val="26"/>
-        </w:rPr>
-        <w:t xml:space="preserve"> là tên trường để PHP đọc </w:t>
-      </w:r>
-      <w:r>
-        <w:rPr>
-          <w:rFonts w:ascii="Times New Roman" w:hAnsi="Times New Roman"/>
-          <w:b w:val="0"/>
-          <w:color w:val="000000"/>
-          <w:sz w:val="26"/>
-        </w:rPr>
-        <w:t>$_GET['q']</w:t>
-      </w:r>
-      <w:r>
-        <w:rPr>
-          <w:rFonts w:ascii="Times New Roman" w:hAnsi="Times New Roman"/>
-          <w:b w:val="0"/>
-          <w:color w:val="000000"/>
-          <w:sz w:val="26"/>
-        </w:rPr>
-        <w:t xml:space="preserve">; </w:t>
-      </w:r>
-      <w:r>
-        <w:rPr>
-          <w:rFonts w:ascii="Times New Roman" w:hAnsi="Times New Roman"/>
-          <w:b w:val="0"/>
-          <w:color w:val="000000"/>
-          <w:sz w:val="26"/>
-        </w:rPr>
-        <w:t>value</w:t>
-      </w:r>
-      <w:r>
-        <w:rPr>
-          <w:rFonts w:ascii="Times New Roman" w:hAnsi="Times New Roman"/>
-          <w:b w:val="0"/>
-          <w:color w:val="000000"/>
-          <w:sz w:val="26"/>
-        </w:rPr>
-        <w:t xml:space="preserve"> giữ lại từ khóa sau khi gửi form. Dấu </w:t>
-      </w:r>
-      <w:r>
-        <w:rPr>
-          <w:rFonts w:ascii="Times New Roman" w:hAnsi="Times New Roman"/>
-          <w:b w:val="0"/>
-          <w:color w:val="000000"/>
-          <w:sz w:val="26"/>
-        </w:rPr>
-        <w:t>&lt;?= ... ?&gt;</w:t>
-      </w:r>
-      <w:r>
-        <w:rPr>
-          <w:rFonts w:ascii="Times New Roman" w:hAnsi="Times New Roman"/>
-          <w:b w:val="0"/>
-          <w:color w:val="000000"/>
-          <w:sz w:val="26"/>
-        </w:rPr>
-        <w:t xml:space="preserve"> in một giá trị vào HTML.</w:t>
-      </w:r>
-    </w:p>
-    <w:p>
-      <w:pPr>
-        <w:widowControl/>
-      </w:pPr>
-      <w:r>
-        <w:rPr>
-          <w:rFonts w:ascii="Times New Roman" w:hAnsi="Times New Roman"/>
-          <w:b w:val="0"/>
-          <w:color w:val="000000"/>
-          <w:sz w:val="26"/>
-        </w:rPr>
-        <w:t xml:space="preserve">Đoạn </w:t>
-      </w:r>
-      <w:r>
-        <w:rPr>
-          <w:rFonts w:ascii="Times New Roman" w:hAnsi="Times New Roman"/>
-          <w:b w:val="0"/>
-          <w:color w:val="000000"/>
-          <w:sz w:val="26"/>
-        </w:rPr>
-        <w:t>foreach ... endforeach</w:t>
-      </w:r>
-      <w:r>
-        <w:rPr>
-          <w:rFonts w:ascii="Times New Roman" w:hAnsi="Times New Roman"/>
-          <w:b w:val="0"/>
-          <w:color w:val="000000"/>
-          <w:sz w:val="26"/>
-        </w:rPr>
-        <w:t xml:space="preserve"> chỉ lặp qua kết quả tìm được, không phải mảng gốc. </w:t>
-      </w:r>
-      <w:r>
-        <w:rPr>
-          <w:rFonts w:ascii="Times New Roman" w:hAnsi="Times New Roman"/>
-          <w:b w:val="0"/>
-          <w:color w:val="000000"/>
-          <w:sz w:val="26"/>
-        </w:rPr>
-        <w:t>if (!$visible)</w:t>
-      </w:r>
-      <w:r>
-        <w:rPr>
-          <w:rFonts w:ascii="Times New Roman" w:hAnsi="Times New Roman"/>
-          <w:b w:val="0"/>
-          <w:color w:val="000000"/>
-          <w:sz w:val="26"/>
-        </w:rPr>
-        <w:t xml:space="preserve"> xử lý mảng rỗng. Cú pháp dạng dấu </w:t>
-      </w:r>
-      <w:r>
-        <w:rPr>
-          <w:rFonts w:ascii="Times New Roman" w:hAnsi="Times New Roman"/>
-          <w:b w:val="0"/>
-          <w:color w:val="000000"/>
-          <w:sz w:val="26"/>
-        </w:rPr>
-        <w:t>:</w:t>
-      </w:r>
-      <w:r>
-        <w:rPr>
-          <w:rFonts w:ascii="Times New Roman" w:hAnsi="Times New Roman"/>
-          <w:b w:val="0"/>
-          <w:color w:val="000000"/>
-          <w:sz w:val="26"/>
-        </w:rPr>
-        <w:t xml:space="preserve"> giúp trộn vòng lặp với HTML dễ nhìn hơn; ý nghĩa vẫn là vòng lặp PHP đã học.</w:t>
-      </w:r>
-    </w:p>
-    <w:p>
-      <w:pPr>
-        <w:keepNext/>
-        <w:widowControl/>
-      </w:pPr>
-      <w:r>
-        <w:rPr>
-          <w:rFonts w:ascii="Times New Roman" w:hAnsi="Times New Roman"/>
-          <w:b w:val="0"/>
-          <w:sz w:val="26"/>
-        </w:rPr>
-        <w:t>Kiểm tra kết quả bước 4:</w:t>
-      </w:r>
-    </w:p>
-    <w:p>
-      <w:pPr>
-        <w:widowControl/>
-        <w:ind w:firstLine="0" w:left="0"/>
-        <w:jc w:val="left"/>
-      </w:pPr>
-      <w:r>
-        <w:rPr>
-          <w:rFonts w:ascii="Times New Roman" w:hAnsi="Times New Roman"/>
-          <w:b w:val="0"/>
-          <w:color w:val="000000"/>
-          <w:sz w:val="26"/>
-        </w:rPr>
-        <w:t>[</w:t>
-      </w:r>
-      <w:r>
-        <w:rPr>
-          <w:rFonts w:ascii="Times New Roman" w:hAnsi="Times New Roman"/>
-          <w:b w:val="0"/>
-          <w:color w:val="000000"/>
-          <w:sz w:val="26"/>
-        </w:rPr>
-        <w:t xml:space="preserve"> ] Trang dùng require/foreach và form GET; biết dòng nào gọi hàm lọc.</w:t>
-      </w:r>
-    </w:p>
-    <w:p>
-      <w:pPr>
-        <w:pStyle w:val="Heading3"/>
-        <w:keepNext/>
-        <w:widowControl/>
-      </w:pPr>
-      <w:r>
-        <w:rPr>
-          <w:rFonts w:ascii="Times New Roman" w:hAnsi="Times New Roman"/>
-          <w:b/>
-          <w:color w:val="000000"/>
-          <w:sz w:val="26"/>
-        </w:rPr>
-        <w:t>Bước 5. Chạy trang và đối chiếu</w:t>
-      </w:r>
-    </w:p>
-    <w:p>
-      <w:pPr>
-        <w:widowControl/>
-        <w:spacing w:after="120" w:before="0" w:line="240" w:lineRule="auto"/>
-        <w:ind w:firstLine="0" w:left="142" w:right="85"/>
-        <w:jc w:val="left"/>
-      </w:pPr>
-      <w:r>
-        <w:rPr>
-          <w:rFonts w:ascii="Times New Roman" w:hAnsi="Times New Roman"/>
-          <w:b w:val="0"/>
-          <w:sz w:val="26"/>
-        </w:rPr>
-        <w:t>bash lab.sh run</w:t>
-      </w:r>
-    </w:p>
-    <w:p>
-      <w:pPr>
-        <w:widowControl/>
-      </w:pPr>
-      <w:r>
-        <w:rPr>
-          <w:rFonts w:ascii="Times New Roman" w:hAnsi="Times New Roman"/>
-          <w:b w:val="0"/>
-          <w:color w:val="000000"/>
-          <w:sz w:val="26"/>
-        </w:rPr>
-        <w:t xml:space="preserve">Mở </w:t>
-      </w:r>
-      <w:r>
-        <w:rPr>
-          <w:rFonts w:ascii="Times New Roman" w:hAnsi="Times New Roman"/>
-          <w:b w:val="0"/>
-          <w:color w:val="000000"/>
-          <w:sz w:val="26"/>
-        </w:rPr>
-        <w:t>http://127.0.0.1:8103</w:t>
-      </w:r>
-      <w:r>
-        <w:rPr>
-          <w:rFonts w:ascii="Times New Roman" w:hAnsi="Times New Roman"/>
-          <w:b w:val="0"/>
-          <w:color w:val="000000"/>
-          <w:sz w:val="26"/>
-        </w:rPr>
-        <w:t xml:space="preserve">. Không nhập từ khóa: 3 sự kiện. Nhập </w:t>
-      </w:r>
-      <w:r>
-        <w:rPr>
-          <w:rFonts w:ascii="Times New Roman" w:hAnsi="Times New Roman"/>
-          <w:b w:val="0"/>
-          <w:color w:val="000000"/>
-          <w:sz w:val="26"/>
-        </w:rPr>
-        <w:t>php</w:t>
-      </w:r>
-      <w:r>
-        <w:rPr>
-          <w:rFonts w:ascii="Times New Roman" w:hAnsi="Times New Roman"/>
-          <w:b w:val="0"/>
-          <w:color w:val="000000"/>
-          <w:sz w:val="26"/>
-        </w:rPr>
-        <w:t xml:space="preserve">: 1 sự kiện. Nhập </w:t>
-      </w:r>
-      <w:r>
-        <w:rPr>
-          <w:rFonts w:ascii="Times New Roman" w:hAnsi="Times New Roman"/>
-          <w:b w:val="0"/>
-          <w:color w:val="000000"/>
-          <w:sz w:val="26"/>
-        </w:rPr>
-        <w:t>xyz</w:t>
-      </w:r>
-      <w:r>
-        <w:rPr>
-          <w:rFonts w:ascii="Times New Roman" w:hAnsi="Times New Roman"/>
-          <w:b w:val="0"/>
-          <w:color w:val="000000"/>
-          <w:sz w:val="26"/>
-        </w:rPr>
-        <w:t xml:space="preserve">: 0 và có thông báo không tìm thấy. Quan sát URL có </w:t>
-      </w:r>
-      <w:r>
-        <w:rPr>
-          <w:rFonts w:ascii="Times New Roman" w:hAnsi="Times New Roman"/>
-          <w:b w:val="0"/>
-          <w:color w:val="000000"/>
-          <w:sz w:val="26"/>
-        </w:rPr>
-        <w:t>?q=php</w:t>
-      </w:r>
-      <w:r>
-        <w:rPr>
-          <w:rFonts w:ascii="Times New Roman" w:hAnsi="Times New Roman"/>
-          <w:b w:val="0"/>
-          <w:color w:val="000000"/>
-          <w:sz w:val="26"/>
-        </w:rPr>
         <w:t>; đây là dữ liệu GET.</w:t>
       </w:r>
     </w:p>
@@ -3352,7 +3758,7 @@
         </w:rPr>
         <w:drawing>
           <wp:inline xmlns:a="http://schemas.openxmlformats.org/drawingml/2006/main" xmlns:pic="http://schemas.openxmlformats.org/drawingml/2006/picture">
-            <wp:extent cx="5760000" cy="2639127"/>
+            <wp:extent cx="5760000" cy="5828716"/>
             <wp:docPr id="3" name="Picture 3" descr="Kết quả tìm kiếm từ khóa php"/>
             <wp:cNvGraphicFramePr>
               <a:graphicFrameLocks noChangeAspect="1"/>
@@ -3373,7 +3779,7 @@
                   <pic:spPr>
                     <a:xfrm>
                       <a:off x="0" y="0"/>
-                      <a:ext cx="5760000" cy="2639127"/>
+                      <a:ext cx="5760000" cy="5828716"/>
                     </a:xfrm>
                     <a:prstGeom prst="rect"/>
                   </pic:spPr>
@@ -3616,8 +4022,8 @@
     </w:p>
     <w:p>
       <w:pPr>
-        <w:keepNext/>
-        <w:keepLines/>
+        <w:keepNext w:val="0"/>
+        <w:keepLines w:val="0"/>
         <w:widowControl/>
         <w:spacing w:after="0" w:before="0" w:line="240" w:lineRule="auto"/>
         <w:ind w:firstLine="0" w:left="142" w:right="85"/>
@@ -3625,17 +4031,16 @@
       </w:pPr>
       <w:r>
         <w:rPr>
-          <w:rFonts w:ascii="Times New Roman" w:hAnsi="Times New Roman"/>
-          <w:b w:val="0"/>
-          <w:sz w:val="26"/>
+          <w:rFonts w:ascii="Consolas" w:hAnsi="Consolas"/>
+          <w:sz w:val="17"/>
         </w:rPr>
         <w:t>&lt;?php</w:t>
       </w:r>
     </w:p>
     <w:p>
       <w:pPr>
-        <w:keepNext/>
-        <w:keepLines/>
+        <w:keepNext w:val="0"/>
+        <w:keepLines w:val="0"/>
         <w:widowControl/>
         <w:spacing w:after="0" w:before="0" w:line="240" w:lineRule="auto"/>
         <w:ind w:firstLine="0" w:left="142" w:right="85"/>
@@ -3643,17 +4048,16 @@
       </w:pPr>
       <w:r>
         <w:rPr>
-          <w:rFonts w:ascii="Times New Roman" w:hAnsi="Times New Roman"/>
-          <w:b w:val="0"/>
-          <w:sz w:val="26"/>
+          <w:rFonts w:ascii="Consolas" w:hAnsi="Consolas"/>
+          <w:sz w:val="17"/>
         </w:rPr>
         <w:t>require __DIR__ . '/../src/Input.php';</w:t>
       </w:r>
     </w:p>
     <w:p>
       <w:pPr>
-        <w:keepNext/>
-        <w:keepLines/>
+        <w:keepNext w:val="0"/>
+        <w:keepLines w:val="0"/>
         <w:widowControl/>
         <w:spacing w:after="0" w:before="0" w:line="240" w:lineRule="auto"/>
         <w:ind w:firstLine="0" w:left="142" w:right="85"/>
@@ -3661,17 +4065,16 @@
       </w:pPr>
       <w:r>
         <w:rPr>
-          <w:rFonts w:ascii="Times New Roman" w:hAnsi="Times New Roman"/>
-          <w:b w:val="0"/>
-          <w:sz w:val="26"/>
+          <w:rFonts w:ascii="Consolas" w:hAnsi="Consolas"/>
+          <w:sz w:val="17"/>
         </w:rPr>
         <w:t>$events = require __DIR__ . '/../data/events.php';</w:t>
       </w:r>
     </w:p>
     <w:p>
       <w:pPr>
-        <w:keepNext/>
-        <w:keepLines/>
+        <w:keepNext w:val="0"/>
+        <w:keepLines w:val="0"/>
         <w:widowControl/>
         <w:spacing w:after="0" w:before="0" w:line="240" w:lineRule="auto"/>
         <w:ind w:firstLine="0" w:left="142" w:right="85"/>
@@ -3679,17 +4082,16 @@
       </w:pPr>
       <w:r>
         <w:rPr>
-          <w:rFonts w:ascii="Times New Roman" w:hAnsi="Times New Roman"/>
-          <w:b w:val="0"/>
-          <w:sz w:val="26"/>
+          <w:rFonts w:ascii="Consolas" w:hAnsi="Consolas"/>
+          <w:sz w:val="17"/>
         </w:rPr>
         <w:t>$result = null;</w:t>
       </w:r>
     </w:p>
     <w:p>
       <w:pPr>
-        <w:keepNext/>
-        <w:keepLines/>
+        <w:keepNext w:val="0"/>
+        <w:keepLines w:val="0"/>
         <w:widowControl/>
         <w:spacing w:after="0" w:before="0" w:line="240" w:lineRule="auto"/>
         <w:ind w:firstLine="0" w:left="142" w:right="85"/>
@@ -3697,17 +4099,16 @@
       </w:pPr>
       <w:r>
         <w:rPr>
-          <w:rFonts w:ascii="Times New Roman" w:hAnsi="Times New Roman"/>
-          <w:b w:val="0"/>
-          <w:sz w:val="26"/>
+          <w:rFonts w:ascii="Consolas" w:hAnsi="Consolas"/>
+          <w:sz w:val="17"/>
         </w:rPr>
         <w:t>if ($_SERVER['REQUEST_METHOD'] === 'POST') {</w:t>
       </w:r>
     </w:p>
     <w:p>
       <w:pPr>
-        <w:keepNext/>
-        <w:keepLines/>
+        <w:keepNext w:val="0"/>
+        <w:keepLines w:val="0"/>
         <w:widowControl/>
         <w:spacing w:after="0" w:before="0" w:line="240" w:lineRule="auto"/>
         <w:ind w:firstLine="0" w:left="142" w:right="85"/>
@@ -3715,17 +4116,16 @@
       </w:pPr>
       <w:r>
         <w:rPr>
-          <w:rFonts w:ascii="Times New Roman" w:hAnsi="Times New Roman"/>
-          <w:b w:val="0"/>
-          <w:sz w:val="26"/>
+          <w:rFonts w:ascii="Consolas" w:hAnsi="Consolas"/>
+          <w:sz w:val="17"/>
         </w:rPr>
         <w:t xml:space="preserve">    $result = validateRegistration($_POST, $events);</w:t>
       </w:r>
     </w:p>
     <w:p>
       <w:pPr>
-        <w:keepNext/>
-        <w:keepLines/>
+        <w:keepNext w:val="0"/>
+        <w:keepLines w:val="0"/>
         <w:widowControl/>
         <w:spacing w:after="0" w:before="0" w:line="240" w:lineRule="auto"/>
         <w:ind w:firstLine="0" w:left="142" w:right="85"/>
@@ -3733,17 +4133,16 @@
       </w:pPr>
       <w:r>
         <w:rPr>
-          <w:rFonts w:ascii="Times New Roman" w:hAnsi="Times New Roman"/>
-          <w:b w:val="0"/>
-          <w:sz w:val="26"/>
+          <w:rFonts w:ascii="Consolas" w:hAnsi="Consolas"/>
+          <w:sz w:val="17"/>
         </w:rPr>
         <w:t>}</w:t>
       </w:r>
     </w:p>
     <w:p>
       <w:pPr>
-        <w:keepNext/>
-        <w:keepLines/>
+        <w:keepNext w:val="0"/>
+        <w:keepLines w:val="0"/>
         <w:widowControl/>
         <w:spacing w:after="0" w:before="0" w:line="240" w:lineRule="auto"/>
         <w:ind w:firstLine="0" w:left="142" w:right="85"/>
@@ -3751,17 +4150,16 @@
       </w:pPr>
       <w:r>
         <w:rPr>
-          <w:rFonts w:ascii="Times New Roman" w:hAnsi="Times New Roman"/>
-          <w:b w:val="0"/>
-          <w:sz w:val="26"/>
+          <w:rFonts w:ascii="Consolas" w:hAnsi="Consolas"/>
+          <w:sz w:val="17"/>
         </w:rPr>
         <w:t>require __DIR__ . '/../templates/header.php';</w:t>
       </w:r>
     </w:p>
     <w:p>
       <w:pPr>
-        <w:keepNext/>
-        <w:keepLines/>
+        <w:keepNext w:val="0"/>
+        <w:keepLines w:val="0"/>
         <w:widowControl/>
         <w:spacing w:after="0" w:before="0" w:line="240" w:lineRule="auto"/>
         <w:ind w:firstLine="0" w:left="142" w:right="85"/>
@@ -3769,17 +4167,16 @@
       </w:pPr>
       <w:r>
         <w:rPr>
-          <w:rFonts w:ascii="Times New Roman" w:hAnsi="Times New Roman"/>
-          <w:b w:val="0"/>
-          <w:sz w:val="26"/>
+          <w:rFonts w:ascii="Consolas" w:hAnsi="Consolas"/>
+          <w:sz w:val="17"/>
         </w:rPr>
         <w:t>?&gt;</w:t>
       </w:r>
     </w:p>
     <w:p>
       <w:pPr>
-        <w:keepNext/>
-        <w:keepLines/>
+        <w:keepNext w:val="0"/>
+        <w:keepLines w:val="0"/>
         <w:widowControl/>
         <w:spacing w:after="0" w:before="0" w:line="240" w:lineRule="auto"/>
         <w:ind w:firstLine="0" w:left="142" w:right="85"/>
@@ -3787,17 +4184,16 @@
       </w:pPr>
       <w:r>
         <w:rPr>
-          <w:rFonts w:ascii="Times New Roman" w:hAnsi="Times New Roman"/>
-          <w:b w:val="0"/>
-          <w:sz w:val="26"/>
-        </w:rPr>
-        <w:t>&lt;h2&gt;Nhận dữ liệu form&lt;/h2&gt;</w:t>
+          <w:rFonts w:ascii="Consolas" w:hAnsi="Consolas"/>
+          <w:sz w:val="17"/>
+        </w:rPr>
+        <w:t>&lt;div class="page-heading"&gt;</w:t>
       </w:r>
     </w:p>
     <w:p>
       <w:pPr>
-        <w:keepNext/>
-        <w:keepLines/>
+        <w:keepNext w:val="0"/>
+        <w:keepLines w:val="0"/>
         <w:widowControl/>
         <w:spacing w:after="0" w:before="0" w:line="240" w:lineRule="auto"/>
         <w:ind w:firstLine="0" w:left="142" w:right="85"/>
@@ -3805,17 +4201,16 @@
       </w:pPr>
       <w:r>
         <w:rPr>
-          <w:rFonts w:ascii="Times New Roman" w:hAnsi="Times New Roman"/>
-          <w:b w:val="0"/>
-          <w:sz w:val="26"/>
-        </w:rPr>
-        <w:t>&lt;form method="post"&gt;</w:t>
+          <w:rFonts w:ascii="Consolas" w:hAnsi="Consolas"/>
+          <w:sz w:val="17"/>
+        </w:rPr>
+        <w:t>&lt;h1&gt;Đăng ký tham dự&lt;/h1&gt;</w:t>
       </w:r>
     </w:p>
     <w:p>
       <w:pPr>
-        <w:keepNext/>
-        <w:keepLines/>
+        <w:keepNext w:val="0"/>
+        <w:keepLines w:val="0"/>
         <w:widowControl/>
         <w:spacing w:after="0" w:before="0" w:line="240" w:lineRule="auto"/>
         <w:ind w:firstLine="0" w:left="142" w:right="85"/>
@@ -3823,17 +4218,16 @@
       </w:pPr>
       <w:r>
         <w:rPr>
-          <w:rFonts w:ascii="Times New Roman" w:hAnsi="Times New Roman"/>
-          <w:b w:val="0"/>
-          <w:sz w:val="26"/>
-        </w:rPr>
-        <w:t xml:space="preserve">    &lt;label&gt;Sự kiện</w:t>
+          <w:rFonts w:ascii="Consolas" w:hAnsi="Consolas"/>
+          <w:sz w:val="17"/>
+        </w:rPr>
+        <w:t>&lt;p&gt;Điền thông tin để kiểm tra và xem trước. Chưa lưu đăng ký.&lt;/p&gt;</w:t>
       </w:r>
     </w:p>
     <w:p>
       <w:pPr>
-        <w:keepNext/>
-        <w:keepLines/>
+        <w:keepNext w:val="0"/>
+        <w:keepLines w:val="0"/>
         <w:widowControl/>
         <w:spacing w:after="0" w:before="0" w:line="240" w:lineRule="auto"/>
         <w:ind w:firstLine="0" w:left="142" w:right="85"/>
@@ -3841,17 +4235,16 @@
       </w:pPr>
       <w:r>
         <w:rPr>
-          <w:rFonts w:ascii="Times New Roman" w:hAnsi="Times New Roman"/>
-          <w:b w:val="0"/>
-          <w:sz w:val="26"/>
-        </w:rPr>
-        <w:t xml:space="preserve">        &lt;select name="event_id"&gt;</w:t>
+          <w:rFonts w:ascii="Consolas" w:hAnsi="Consolas"/>
+          <w:sz w:val="17"/>
+        </w:rPr>
+        <w:t>&lt;/div&gt;</w:t>
       </w:r>
     </w:p>
     <w:p>
       <w:pPr>
-        <w:keepNext/>
-        <w:keepLines/>
+        <w:keepNext w:val="0"/>
+        <w:keepLines w:val="0"/>
         <w:widowControl/>
         <w:spacing w:after="0" w:before="0" w:line="240" w:lineRule="auto"/>
         <w:ind w:firstLine="0" w:left="142" w:right="85"/>
@@ -3859,17 +4252,16 @@
       </w:pPr>
       <w:r>
         <w:rPr>
-          <w:rFonts w:ascii="Times New Roman" w:hAnsi="Times New Roman"/>
-          <w:b w:val="0"/>
-          <w:sz w:val="26"/>
-        </w:rPr>
-        <w:t xml:space="preserve">            &lt;?php foreach ($events as $event): ?&gt;</w:t>
+          <w:rFonts w:ascii="Consolas" w:hAnsi="Consolas"/>
+          <w:sz w:val="17"/>
+        </w:rPr>
+        <w:t>&lt;form class="registration-form" method="post"&gt;</w:t>
       </w:r>
     </w:p>
     <w:p>
       <w:pPr>
-        <w:keepNext/>
-        <w:keepLines/>
+        <w:keepNext w:val="0"/>
+        <w:keepLines w:val="0"/>
         <w:widowControl/>
         <w:spacing w:after="0" w:before="0" w:line="240" w:lineRule="auto"/>
         <w:ind w:firstLine="0" w:left="142" w:right="85"/>
@@ -3877,17 +4269,16 @@
       </w:pPr>
       <w:r>
         <w:rPr>
-          <w:rFonts w:ascii="Times New Roman" w:hAnsi="Times New Roman"/>
-          <w:b w:val="0"/>
-          <w:sz w:val="26"/>
-        </w:rPr>
-        <w:t xml:space="preserve">                &lt;option value="&lt;?= $event['id'] ?&gt;"&gt;</w:t>
+          <w:rFonts w:ascii="Consolas" w:hAnsi="Consolas"/>
+          <w:sz w:val="17"/>
+        </w:rPr>
+        <w:t xml:space="preserve">    &lt;label class="form-field" for="event_id"&gt;Sự kiện</w:t>
       </w:r>
     </w:p>
     <w:p>
       <w:pPr>
-        <w:keepNext/>
-        <w:keepLines/>
+        <w:keepNext w:val="0"/>
+        <w:keepLines w:val="0"/>
         <w:widowControl/>
         <w:spacing w:after="0" w:before="0" w:line="240" w:lineRule="auto"/>
         <w:ind w:firstLine="0" w:left="142" w:right="85"/>
@@ -3895,17 +4286,16 @@
       </w:pPr>
       <w:r>
         <w:rPr>
-          <w:rFonts w:ascii="Times New Roman" w:hAnsi="Times New Roman"/>
-          <w:b w:val="0"/>
-          <w:sz w:val="26"/>
-        </w:rPr>
-        <w:t xml:space="preserve">                    &lt;?= e($event['title']) ?&gt;</w:t>
+          <w:rFonts w:ascii="Consolas" w:hAnsi="Consolas"/>
+          <w:sz w:val="17"/>
+        </w:rPr>
+        <w:t>&lt;select id="event_id" name="event_id"&gt;</w:t>
       </w:r>
     </w:p>
     <w:p>
       <w:pPr>
-        <w:keepNext/>
-        <w:keepLines/>
+        <w:keepNext w:val="0"/>
+        <w:keepLines w:val="0"/>
         <w:widowControl/>
         <w:spacing w:after="0" w:before="0" w:line="240" w:lineRule="auto"/>
         <w:ind w:firstLine="0" w:left="142" w:right="85"/>
@@ -3913,17 +4303,16 @@
       </w:pPr>
       <w:r>
         <w:rPr>
-          <w:rFonts w:ascii="Times New Roman" w:hAnsi="Times New Roman"/>
-          <w:b w:val="0"/>
-          <w:sz w:val="26"/>
-        </w:rPr>
-        <w:t xml:space="preserve">                &lt;/option&gt;</w:t>
+          <w:rFonts w:ascii="Consolas" w:hAnsi="Consolas"/>
+          <w:sz w:val="17"/>
+        </w:rPr>
+        <w:t xml:space="preserve">            &lt;?php foreach ($events as $event): ?&gt;</w:t>
       </w:r>
     </w:p>
     <w:p>
       <w:pPr>
-        <w:keepNext/>
-        <w:keepLines/>
+        <w:keepNext w:val="0"/>
+        <w:keepLines w:val="0"/>
         <w:widowControl/>
         <w:spacing w:after="0" w:before="0" w:line="240" w:lineRule="auto"/>
         <w:ind w:firstLine="0" w:left="142" w:right="85"/>
@@ -3931,17 +4320,16 @@
       </w:pPr>
       <w:r>
         <w:rPr>
-          <w:rFonts w:ascii="Times New Roman" w:hAnsi="Times New Roman"/>
-          <w:b w:val="0"/>
-          <w:sz w:val="26"/>
-        </w:rPr>
-        <w:t xml:space="preserve">            &lt;?php endforeach; ?&gt;</w:t>
+          <w:rFonts w:ascii="Consolas" w:hAnsi="Consolas"/>
+          <w:sz w:val="17"/>
+        </w:rPr>
+        <w:t xml:space="preserve">                &lt;option value="&lt;?= $event['id'] ?&gt;"&gt;</w:t>
       </w:r>
     </w:p>
     <w:p>
       <w:pPr>
-        <w:keepNext/>
-        <w:keepLines/>
+        <w:keepNext w:val="0"/>
+        <w:keepLines w:val="0"/>
         <w:widowControl/>
         <w:spacing w:after="0" w:before="0" w:line="240" w:lineRule="auto"/>
         <w:ind w:firstLine="0" w:left="142" w:right="85"/>
@@ -3949,17 +4337,16 @@
       </w:pPr>
       <w:r>
         <w:rPr>
-          <w:rFonts w:ascii="Times New Roman" w:hAnsi="Times New Roman"/>
-          <w:b w:val="0"/>
-          <w:sz w:val="26"/>
-        </w:rPr>
-        <w:t xml:space="preserve">        &lt;/select&gt;</w:t>
+          <w:rFonts w:ascii="Consolas" w:hAnsi="Consolas"/>
+          <w:sz w:val="17"/>
+        </w:rPr>
+        <w:t xml:space="preserve">                    &lt;?= e($event['title']) ?&gt;</w:t>
       </w:r>
     </w:p>
     <w:p>
       <w:pPr>
-        <w:keepNext/>
-        <w:keepLines/>
+        <w:keepNext w:val="0"/>
+        <w:keepLines w:val="0"/>
         <w:widowControl/>
         <w:spacing w:after="0" w:before="0" w:line="240" w:lineRule="auto"/>
         <w:ind w:firstLine="0" w:left="142" w:right="85"/>
@@ -3967,17 +4354,16 @@
       </w:pPr>
       <w:r>
         <w:rPr>
-          <w:rFonts w:ascii="Times New Roman" w:hAnsi="Times New Roman"/>
-          <w:b w:val="0"/>
-          <w:sz w:val="26"/>
-        </w:rPr>
-        <w:t xml:space="preserve">    &lt;/label&gt;&lt;br&gt;</w:t>
+          <w:rFonts w:ascii="Consolas" w:hAnsi="Consolas"/>
+          <w:sz w:val="17"/>
+        </w:rPr>
+        <w:t xml:space="preserve">                &lt;/option&gt;</w:t>
       </w:r>
     </w:p>
     <w:p>
       <w:pPr>
-        <w:keepNext/>
-        <w:keepLines/>
+        <w:keepNext w:val="0"/>
+        <w:keepLines w:val="0"/>
         <w:widowControl/>
         <w:spacing w:after="0" w:before="0" w:line="240" w:lineRule="auto"/>
         <w:ind w:firstLine="0" w:left="142" w:right="85"/>
@@ -3985,17 +4371,16 @@
       </w:pPr>
       <w:r>
         <w:rPr>
-          <w:rFonts w:ascii="Times New Roman" w:hAnsi="Times New Roman"/>
-          <w:b w:val="0"/>
-          <w:sz w:val="26"/>
-        </w:rPr>
-        <w:t xml:space="preserve">    &lt;label&gt;Họ tên</w:t>
+          <w:rFonts w:ascii="Consolas" w:hAnsi="Consolas"/>
+          <w:sz w:val="17"/>
+        </w:rPr>
+        <w:t xml:space="preserve">            &lt;?php endforeach; ?&gt;</w:t>
       </w:r>
     </w:p>
     <w:p>
       <w:pPr>
-        <w:keepNext/>
-        <w:keepLines/>
+        <w:keepNext w:val="0"/>
+        <w:keepLines w:val="0"/>
         <w:widowControl/>
         <w:spacing w:after="0" w:before="0" w:line="240" w:lineRule="auto"/>
         <w:ind w:firstLine="0" w:left="142" w:right="85"/>
@@ -4003,17 +4388,16 @@
       </w:pPr>
       <w:r>
         <w:rPr>
-          <w:rFonts w:ascii="Times New Roman" w:hAnsi="Times New Roman"/>
-          <w:b w:val="0"/>
-          <w:sz w:val="26"/>
-        </w:rPr>
-        <w:t xml:space="preserve">        &lt;input name="name" maxlength="120"</w:t>
+          <w:rFonts w:ascii="Consolas" w:hAnsi="Consolas"/>
+          <w:sz w:val="17"/>
+        </w:rPr>
+        <w:t xml:space="preserve">        &lt;/select&gt;</w:t>
       </w:r>
     </w:p>
     <w:p>
       <w:pPr>
-        <w:keepNext/>
-        <w:keepLines/>
+        <w:keepNext w:val="0"/>
+        <w:keepLines w:val="0"/>
         <w:widowControl/>
         <w:spacing w:after="0" w:before="0" w:line="240" w:lineRule="auto"/>
         <w:ind w:firstLine="0" w:left="142" w:right="85"/>
@@ -4021,17 +4405,16 @@
       </w:pPr>
       <w:r>
         <w:rPr>
-          <w:rFonts w:ascii="Times New Roman" w:hAnsi="Times New Roman"/>
-          <w:b w:val="0"/>
-          <w:sz w:val="26"/>
-        </w:rPr>
-        <w:t xml:space="preserve">               value="&lt;?= e(field($_POST, 'name')) ?&gt;"&gt;</w:t>
+          <w:rFonts w:ascii="Consolas" w:hAnsi="Consolas"/>
+          <w:sz w:val="17"/>
+        </w:rPr>
+        <w:t xml:space="preserve">    &lt;/label&gt;</w:t>
       </w:r>
     </w:p>
     <w:p>
       <w:pPr>
-        <w:keepNext/>
-        <w:keepLines/>
+        <w:keepNext w:val="0"/>
+        <w:keepLines w:val="0"/>
         <w:widowControl/>
         <w:spacing w:after="0" w:before="0" w:line="240" w:lineRule="auto"/>
         <w:ind w:firstLine="0" w:left="142" w:right="85"/>
@@ -4039,17 +4422,16 @@
       </w:pPr>
       <w:r>
         <w:rPr>
-          <w:rFonts w:ascii="Times New Roman" w:hAnsi="Times New Roman"/>
-          <w:b w:val="0"/>
-          <w:sz w:val="26"/>
-        </w:rPr>
-        <w:t xml:space="preserve">    &lt;/label&gt;&lt;br&gt;</w:t>
+          <w:rFonts w:ascii="Consolas" w:hAnsi="Consolas"/>
+          <w:sz w:val="17"/>
+        </w:rPr>
+        <w:t xml:space="preserve">    &lt;label class="form-field" for="name"&gt;Họ tên</w:t>
       </w:r>
     </w:p>
     <w:p>
       <w:pPr>
-        <w:keepNext/>
-        <w:keepLines/>
+        <w:keepNext w:val="0"/>
+        <w:keepLines w:val="0"/>
         <w:widowControl/>
         <w:spacing w:after="0" w:before="0" w:line="240" w:lineRule="auto"/>
         <w:ind w:firstLine="0" w:left="142" w:right="85"/>
@@ -4057,17 +4439,16 @@
       </w:pPr>
       <w:r>
         <w:rPr>
-          <w:rFonts w:ascii="Times New Roman" w:hAnsi="Times New Roman"/>
-          <w:b w:val="0"/>
-          <w:sz w:val="26"/>
-        </w:rPr>
-        <w:t xml:space="preserve">    &lt;label&gt;Email</w:t>
+          <w:rFonts w:ascii="Consolas" w:hAnsi="Consolas"/>
+          <w:sz w:val="17"/>
+        </w:rPr>
+        <w:t>&lt;input id="name" name="name" maxlength="120"</w:t>
       </w:r>
     </w:p>
     <w:p>
       <w:pPr>
-        <w:keepNext/>
-        <w:keepLines/>
+        <w:keepNext w:val="0"/>
+        <w:keepLines w:val="0"/>
         <w:widowControl/>
         <w:spacing w:after="0" w:before="0" w:line="240" w:lineRule="auto"/>
         <w:ind w:firstLine="0" w:left="142" w:right="85"/>
@@ -4075,17 +4456,16 @@
       </w:pPr>
       <w:r>
         <w:rPr>
-          <w:rFonts w:ascii="Times New Roman" w:hAnsi="Times New Roman"/>
-          <w:b w:val="0"/>
-          <w:sz w:val="26"/>
-        </w:rPr>
-        <w:t xml:space="preserve">        &lt;input name="email"</w:t>
+          <w:rFonts w:ascii="Consolas" w:hAnsi="Consolas"/>
+          <w:sz w:val="17"/>
+        </w:rPr>
+        <w:t xml:space="preserve">               value="&lt;?= e(field($_POST, 'name')) ?&gt;"&gt;</w:t>
       </w:r>
     </w:p>
     <w:p>
       <w:pPr>
-        <w:keepNext/>
-        <w:keepLines/>
+        <w:keepNext w:val="0"/>
+        <w:keepLines w:val="0"/>
         <w:widowControl/>
         <w:spacing w:after="0" w:before="0" w:line="240" w:lineRule="auto"/>
         <w:ind w:firstLine="0" w:left="142" w:right="85"/>
@@ -4093,17 +4473,16 @@
       </w:pPr>
       <w:r>
         <w:rPr>
-          <w:rFonts w:ascii="Times New Roman" w:hAnsi="Times New Roman"/>
-          <w:b w:val="0"/>
-          <w:sz w:val="26"/>
-        </w:rPr>
-        <w:t xml:space="preserve">               value="&lt;?= e(field($_POST, 'email')) ?&gt;"&gt;</w:t>
+          <w:rFonts w:ascii="Consolas" w:hAnsi="Consolas"/>
+          <w:sz w:val="17"/>
+        </w:rPr>
+        <w:t xml:space="preserve">    &lt;/label&gt;</w:t>
       </w:r>
     </w:p>
     <w:p>
       <w:pPr>
-        <w:keepNext/>
-        <w:keepLines/>
+        <w:keepNext w:val="0"/>
+        <w:keepLines w:val="0"/>
         <w:widowControl/>
         <w:spacing w:after="0" w:before="0" w:line="240" w:lineRule="auto"/>
         <w:ind w:firstLine="0" w:left="142" w:right="85"/>
@@ -4111,17 +4490,16 @@
       </w:pPr>
       <w:r>
         <w:rPr>
-          <w:rFonts w:ascii="Times New Roman" w:hAnsi="Times New Roman"/>
-          <w:b w:val="0"/>
-          <w:sz w:val="26"/>
-        </w:rPr>
-        <w:t xml:space="preserve">    &lt;/label&gt;&lt;br&gt;</w:t>
+          <w:rFonts w:ascii="Consolas" w:hAnsi="Consolas"/>
+          <w:sz w:val="17"/>
+        </w:rPr>
+        <w:t xml:space="preserve">    &lt;label class="form-field" for="email"&gt;Email</w:t>
       </w:r>
     </w:p>
     <w:p>
       <w:pPr>
-        <w:keepNext/>
-        <w:keepLines/>
+        <w:keepNext w:val="0"/>
+        <w:keepLines w:val="0"/>
         <w:widowControl/>
         <w:spacing w:after="0" w:before="0" w:line="240" w:lineRule="auto"/>
         <w:ind w:firstLine="0" w:left="142" w:right="85"/>
@@ -4129,17 +4507,16 @@
       </w:pPr>
       <w:r>
         <w:rPr>
-          <w:rFonts w:ascii="Times New Roman" w:hAnsi="Times New Roman"/>
-          <w:b w:val="0"/>
-          <w:sz w:val="26"/>
-        </w:rPr>
-        <w:t xml:space="preserve">    &lt;button&gt;Kiểm tra&lt;/button&gt;</w:t>
+          <w:rFonts w:ascii="Consolas" w:hAnsi="Consolas"/>
+          <w:sz w:val="17"/>
+        </w:rPr>
+        <w:t>&lt;input id="email" name="email"</w:t>
       </w:r>
     </w:p>
     <w:p>
       <w:pPr>
-        <w:keepNext/>
-        <w:keepLines/>
+        <w:keepNext w:val="0"/>
+        <w:keepLines w:val="0"/>
         <w:widowControl/>
         <w:spacing w:after="0" w:before="0" w:line="240" w:lineRule="auto"/>
         <w:ind w:firstLine="0" w:left="142" w:right="85"/>
@@ -4147,17 +4524,16 @@
       </w:pPr>
       <w:r>
         <w:rPr>
-          <w:rFonts w:ascii="Times New Roman" w:hAnsi="Times New Roman"/>
-          <w:b w:val="0"/>
-          <w:sz w:val="26"/>
-        </w:rPr>
-        <w:t>&lt;/form&gt;</w:t>
+          <w:rFonts w:ascii="Consolas" w:hAnsi="Consolas"/>
+          <w:sz w:val="17"/>
+        </w:rPr>
+        <w:t xml:space="preserve">               value="&lt;?= e(field($_POST, 'email')) ?&gt;"&gt;</w:t>
       </w:r>
     </w:p>
     <w:p>
       <w:pPr>
-        <w:keepNext/>
-        <w:keepLines/>
+        <w:keepNext w:val="0"/>
+        <w:keepLines w:val="0"/>
         <w:widowControl/>
         <w:spacing w:after="0" w:before="0" w:line="240" w:lineRule="auto"/>
         <w:ind w:firstLine="0" w:left="142" w:right="85"/>
@@ -4165,17 +4541,16 @@
       </w:pPr>
       <w:r>
         <w:rPr>
-          <w:rFonts w:ascii="Times New Roman" w:hAnsi="Times New Roman"/>
-          <w:b w:val="0"/>
-          <w:sz w:val="26"/>
-        </w:rPr>
-        <w:t>&lt;?php if ($result !== null): ?&gt;</w:t>
+          <w:rFonts w:ascii="Consolas" w:hAnsi="Consolas"/>
+          <w:sz w:val="17"/>
+        </w:rPr>
+        <w:t xml:space="preserve">    &lt;/label&gt;</w:t>
       </w:r>
     </w:p>
     <w:p>
       <w:pPr>
-        <w:keepNext/>
-        <w:keepLines/>
+        <w:keepNext w:val="0"/>
+        <w:keepLines w:val="0"/>
         <w:widowControl/>
         <w:spacing w:after="0" w:before="0" w:line="240" w:lineRule="auto"/>
         <w:ind w:firstLine="0" w:left="142" w:right="85"/>
@@ -4183,17 +4558,16 @@
       </w:pPr>
       <w:r>
         <w:rPr>
-          <w:rFonts w:ascii="Times New Roman" w:hAnsi="Times New Roman"/>
-          <w:b w:val="0"/>
-          <w:sz w:val="26"/>
-        </w:rPr>
-        <w:t xml:space="preserve">    &lt;?php if ($result['errors']): ?&gt;</w:t>
+          <w:rFonts w:ascii="Consolas" w:hAnsi="Consolas"/>
+          <w:sz w:val="17"/>
+        </w:rPr>
+        <w:t xml:space="preserve">    &lt;button&gt;Kiểm tra&lt;/button&gt;</w:t>
       </w:r>
     </w:p>
     <w:p>
       <w:pPr>
-        <w:keepNext/>
-        <w:keepLines/>
+        <w:keepNext w:val="0"/>
+        <w:keepLines w:val="0"/>
         <w:widowControl/>
         <w:spacing w:after="0" w:before="0" w:line="240" w:lineRule="auto"/>
         <w:ind w:firstLine="0" w:left="142" w:right="85"/>
@@ -4201,17 +4575,16 @@
       </w:pPr>
       <w:r>
         <w:rPr>
-          <w:rFonts w:ascii="Times New Roman" w:hAnsi="Times New Roman"/>
-          <w:b w:val="0"/>
-          <w:sz w:val="26"/>
-        </w:rPr>
-        <w:t xml:space="preserve">        &lt;p&gt;&lt;?= e(implode(', ', $result['errors'])) ?&gt;&lt;/p&gt;</w:t>
+          <w:rFonts w:ascii="Consolas" w:hAnsi="Consolas"/>
+          <w:sz w:val="17"/>
+        </w:rPr>
+        <w:t>&lt;/form&gt;</w:t>
       </w:r>
     </w:p>
     <w:p>
       <w:pPr>
-        <w:keepNext/>
-        <w:keepLines/>
+        <w:keepNext w:val="0"/>
+        <w:keepLines w:val="0"/>
         <w:widowControl/>
         <w:spacing w:after="0" w:before="0" w:line="240" w:lineRule="auto"/>
         <w:ind w:firstLine="0" w:left="142" w:right="85"/>
@@ -4219,17 +4592,16 @@
       </w:pPr>
       <w:r>
         <w:rPr>
-          <w:rFonts w:ascii="Times New Roman" w:hAnsi="Times New Roman"/>
-          <w:b w:val="0"/>
-          <w:sz w:val="26"/>
-        </w:rPr>
-        <w:t xml:space="preserve">    &lt;?php else: ?&gt;</w:t>
+          <w:rFonts w:ascii="Consolas" w:hAnsi="Consolas"/>
+          <w:sz w:val="17"/>
+        </w:rPr>
+        <w:t>&lt;?php if ($result !== null): ?&gt;</w:t>
       </w:r>
     </w:p>
     <w:p>
       <w:pPr>
-        <w:keepNext/>
-        <w:keepLines/>
+        <w:keepNext w:val="0"/>
+        <w:keepLines w:val="0"/>
         <w:widowControl/>
         <w:spacing w:after="0" w:before="0" w:line="240" w:lineRule="auto"/>
         <w:ind w:firstLine="0" w:left="142" w:right="85"/>
@@ -4237,17 +4609,16 @@
       </w:pPr>
       <w:r>
         <w:rPr>
-          <w:rFonts w:ascii="Times New Roman" w:hAnsi="Times New Roman"/>
-          <w:b w:val="0"/>
-          <w:sz w:val="26"/>
-        </w:rPr>
-        <w:t xml:space="preserve">        &lt;p&gt;PREVIEW_OK: &lt;?= e($result['data']['name']) ?&gt;</w:t>
+          <w:rFonts w:ascii="Consolas" w:hAnsi="Consolas"/>
+          <w:sz w:val="17"/>
+        </w:rPr>
+        <w:t xml:space="preserve">    &lt;?php if ($result['errors']): ?&gt;</w:t>
       </w:r>
     </w:p>
     <w:p>
       <w:pPr>
-        <w:keepNext/>
-        <w:keepLines/>
+        <w:keepNext w:val="0"/>
+        <w:keepLines w:val="0"/>
         <w:widowControl/>
         <w:spacing w:after="0" w:before="0" w:line="240" w:lineRule="auto"/>
         <w:ind w:firstLine="0" w:left="142" w:right="85"/>
@@ -4255,17 +4626,16 @@
       </w:pPr>
       <w:r>
         <w:rPr>
-          <w:rFonts w:ascii="Times New Roman" w:hAnsi="Times New Roman"/>
-          <w:b w:val="0"/>
-          <w:sz w:val="26"/>
-        </w:rPr>
-        <w:t xml:space="preserve">            — &lt;?= e($result['data']['email']) ?&gt;&lt;/p&gt;</w:t>
+          <w:rFonts w:ascii="Consolas" w:hAnsi="Consolas"/>
+          <w:sz w:val="17"/>
+        </w:rPr>
+        <w:t xml:space="preserve">        &lt;div class="error-summary" role="alert"&gt;</w:t>
       </w:r>
     </w:p>
     <w:p>
       <w:pPr>
-        <w:keepNext/>
-        <w:keepLines/>
+        <w:keepNext w:val="0"/>
+        <w:keepLines w:val="0"/>
         <w:widowControl/>
         <w:spacing w:after="0" w:before="0" w:line="240" w:lineRule="auto"/>
         <w:ind w:firstLine="0" w:left="142" w:right="85"/>
@@ -4273,17 +4643,16 @@
       </w:pPr>
       <w:r>
         <w:rPr>
-          <w:rFonts w:ascii="Times New Roman" w:hAnsi="Times New Roman"/>
-          <w:b w:val="0"/>
-          <w:sz w:val="26"/>
-        </w:rPr>
-        <w:t xml:space="preserve">        &lt;p&gt;Chỉ xem trước; chưa lưu Session hoặc CSDL.&lt;/p&gt;</w:t>
+          <w:rFonts w:ascii="Consolas" w:hAnsi="Consolas"/>
+          <w:sz w:val="17"/>
+        </w:rPr>
+        <w:t>&lt;p class="error-messages"&gt;&lt;?= e(implode(', ', $result['errors'])) ?&gt;&lt;/p&gt;</w:t>
       </w:r>
     </w:p>
     <w:p>
       <w:pPr>
-        <w:keepNext/>
-        <w:keepLines/>
+        <w:keepNext w:val="0"/>
+        <w:keepLines w:val="0"/>
         <w:widowControl/>
         <w:spacing w:after="0" w:before="0" w:line="240" w:lineRule="auto"/>
         <w:ind w:firstLine="0" w:left="142" w:right="85"/>
@@ -4291,17 +4660,16 @@
       </w:pPr>
       <w:r>
         <w:rPr>
-          <w:rFonts w:ascii="Times New Roman" w:hAnsi="Times New Roman"/>
-          <w:b w:val="0"/>
-          <w:sz w:val="26"/>
-        </w:rPr>
-        <w:t xml:space="preserve">    &lt;?php endif; ?&gt;</w:t>
+          <w:rFonts w:ascii="Consolas" w:hAnsi="Consolas"/>
+          <w:sz w:val="17"/>
+        </w:rPr>
+        <w:t>&lt;p&gt;Thông tin chưa hợp lệ. Kiểm tra lại các thông tin đã nhập rồi gửi lại.&lt;/p&gt;</w:t>
       </w:r>
     </w:p>
     <w:p>
       <w:pPr>
         <w:keepNext w:val="0"/>
-        <w:keepLines/>
+        <w:keepLines w:val="0"/>
         <w:widowControl/>
         <w:spacing w:after="0" w:before="0" w:line="240" w:lineRule="auto"/>
         <w:ind w:firstLine="0" w:left="142" w:right="85"/>
@@ -4309,25 +4677,178 @@
       </w:pPr>
       <w:r>
         <w:rPr>
-          <w:rFonts w:ascii="Times New Roman" w:hAnsi="Times New Roman"/>
-          <w:b w:val="0"/>
-          <w:sz w:val="26"/>
-        </w:rPr>
-        <w:t>&lt;?php endif; ?&gt;</w:t>
+          <w:rFonts w:ascii="Consolas" w:hAnsi="Consolas"/>
+          <w:sz w:val="17"/>
+        </w:rPr>
+        <w:t>&lt;/div&gt;</w:t>
       </w:r>
     </w:p>
     <w:p>
       <w:pPr>
+        <w:keepNext w:val="0"/>
+        <w:keepLines w:val="0"/>
         <w:widowControl/>
-        <w:spacing w:after="120" w:before="0" w:line="240" w:lineRule="auto"/>
+        <w:spacing w:after="0" w:before="0" w:line="240" w:lineRule="auto"/>
         <w:ind w:firstLine="0" w:left="142" w:right="85"/>
         <w:jc w:val="left"/>
       </w:pPr>
       <w:r>
         <w:rPr>
-          <w:rFonts w:ascii="Times New Roman" w:hAnsi="Times New Roman"/>
-          <w:b w:val="0"/>
-          <w:sz w:val="26"/>
+          <w:rFonts w:ascii="Consolas" w:hAnsi="Consolas"/>
+          <w:sz w:val="17"/>
+        </w:rPr>
+        <w:t xml:space="preserve">    &lt;?php else: ?&gt;</w:t>
+      </w:r>
+    </w:p>
+    <w:p>
+      <w:pPr>
+        <w:keepNext w:val="0"/>
+        <w:keepLines w:val="0"/>
+        <w:widowControl/>
+        <w:spacing w:after="0" w:before="0" w:line="240" w:lineRule="auto"/>
+        <w:ind w:firstLine="0" w:left="142" w:right="85"/>
+        <w:jc w:val="left"/>
+      </w:pPr>
+      <w:r>
+        <w:rPr>
+          <w:rFonts w:ascii="Consolas" w:hAnsi="Consolas"/>
+          <w:sz w:val="17"/>
+        </w:rPr>
+        <w:t xml:space="preserve">        &lt;section class="preview" role="status"&gt;</w:t>
+      </w:r>
+    </w:p>
+    <w:p>
+      <w:pPr>
+        <w:keepNext w:val="0"/>
+        <w:keepLines w:val="0"/>
+        <w:widowControl/>
+        <w:spacing w:after="0" w:before="0" w:line="240" w:lineRule="auto"/>
+        <w:ind w:firstLine="0" w:left="142" w:right="85"/>
+        <w:jc w:val="left"/>
+      </w:pPr>
+      <w:r>
+        <w:rPr>
+          <w:rFonts w:ascii="Consolas" w:hAnsi="Consolas"/>
+          <w:sz w:val="17"/>
+        </w:rPr>
+        <w:t>&lt;h2&gt;Xem trước thông tin&lt;/h2&gt;</w:t>
+      </w:r>
+    </w:p>
+    <w:p>
+      <w:pPr>
+        <w:keepNext w:val="0"/>
+        <w:keepLines w:val="0"/>
+        <w:widowControl/>
+        <w:spacing w:after="0" w:before="0" w:line="240" w:lineRule="auto"/>
+        <w:ind w:firstLine="0" w:left="142" w:right="85"/>
+        <w:jc w:val="left"/>
+      </w:pPr>
+      <w:r>
+        <w:rPr>
+          <w:rFonts w:ascii="Consolas" w:hAnsi="Consolas"/>
+          <w:sz w:val="17"/>
+        </w:rPr>
+        <w:t>&lt;p class="status-message"&gt;PREVIEW_OK: &lt;?= e($result['data']['name']) ?&gt;</w:t>
+      </w:r>
+    </w:p>
+    <w:p>
+      <w:pPr>
+        <w:keepNext w:val="0"/>
+        <w:keepLines w:val="0"/>
+        <w:widowControl/>
+        <w:spacing w:after="0" w:before="0" w:line="240" w:lineRule="auto"/>
+        <w:ind w:firstLine="0" w:left="142" w:right="85"/>
+        <w:jc w:val="left"/>
+      </w:pPr>
+      <w:r>
+        <w:rPr>
+          <w:rFonts w:ascii="Consolas" w:hAnsi="Consolas"/>
+          <w:sz w:val="17"/>
+        </w:rPr>
+        <w:t xml:space="preserve">            — &lt;?= e($result['data']['email']) ?&gt;&lt;/p&gt;</w:t>
+      </w:r>
+    </w:p>
+    <w:p>
+      <w:pPr>
+        <w:keepNext w:val="0"/>
+        <w:keepLines w:val="0"/>
+        <w:widowControl/>
+        <w:spacing w:after="0" w:before="0" w:line="240" w:lineRule="auto"/>
+        <w:ind w:firstLine="0" w:left="142" w:right="85"/>
+        <w:jc w:val="left"/>
+      </w:pPr>
+      <w:r>
+        <w:rPr>
+          <w:rFonts w:ascii="Consolas" w:hAnsi="Consolas"/>
+          <w:sz w:val="17"/>
+        </w:rPr>
+        <w:t xml:space="preserve">        &lt;p&gt;Chỉ xem trước; chưa lưu Session hoặc CSDL.&lt;/p&gt;</w:t>
+      </w:r>
+    </w:p>
+    <w:p>
+      <w:pPr>
+        <w:keepNext w:val="0"/>
+        <w:keepLines w:val="0"/>
+        <w:widowControl/>
+        <w:spacing w:after="0" w:before="0" w:line="240" w:lineRule="auto"/>
+        <w:ind w:firstLine="0" w:left="142" w:right="85"/>
+        <w:jc w:val="left"/>
+      </w:pPr>
+      <w:r>
+        <w:rPr>
+          <w:rFonts w:ascii="Consolas" w:hAnsi="Consolas"/>
+          <w:sz w:val="17"/>
+        </w:rPr>
+        <w:t>&lt;/section&gt;</w:t>
+      </w:r>
+    </w:p>
+    <w:p>
+      <w:pPr>
+        <w:keepNext w:val="0"/>
+        <w:keepLines w:val="0"/>
+        <w:widowControl/>
+        <w:spacing w:after="0" w:before="0" w:line="240" w:lineRule="auto"/>
+        <w:ind w:firstLine="0" w:left="142" w:right="85"/>
+        <w:jc w:val="left"/>
+      </w:pPr>
+      <w:r>
+        <w:rPr>
+          <w:rFonts w:ascii="Consolas" w:hAnsi="Consolas"/>
+          <w:sz w:val="17"/>
+        </w:rPr>
+        <w:t xml:space="preserve">    &lt;?php endif; ?&gt;</w:t>
+      </w:r>
+    </w:p>
+    <w:p>
+      <w:pPr>
+        <w:keepNext w:val="0"/>
+        <w:keepLines w:val="0"/>
+        <w:widowControl/>
+        <w:spacing w:after="0" w:before="0" w:line="240" w:lineRule="auto"/>
+        <w:ind w:firstLine="0" w:left="142" w:right="85"/>
+        <w:jc w:val="left"/>
+      </w:pPr>
+      <w:r>
+        <w:rPr>
+          <w:rFonts w:ascii="Consolas" w:hAnsi="Consolas"/>
+          <w:sz w:val="17"/>
+        </w:rPr>
+        <w:t>&lt;?php endif; ?&gt;</w:t>
+      </w:r>
+    </w:p>
+    <w:p>
+      <w:pPr>
+        <w:keepNext w:val="0"/>
+        <w:keepLines w:val="0"/>
+        <w:widowControl/>
+        <w:spacing w:after="0" w:before="0" w:line="240" w:lineRule="auto"/>
+        <w:ind w:firstLine="0" w:left="142" w:right="85"/>
+        <w:jc w:val="left"/>
+      </w:pPr>
+      <w:r>
+        <w:rPr>
+          <w:rFonts w:ascii="Consolas" w:hAnsi="Consolas"/>
+          <w:sz w:val="17"/>
         </w:rPr>
         <w:t>&lt;?php require __DIR__ . '/../templates/footer.php'; ?&gt;</w:t>
       </w:r>

</xml_diff>

<commit_message>
Update Lab04 presentation and teaching guides; preserve student TODOs
</commit_message>
<xml_diff>
--- a/Huong_dan.docx
+++ b/Huong_dan.docx
@@ -271,7 +271,7 @@
         </w:rPr>
         <w:drawing>
           <wp:inline xmlns:a="http://schemas.openxmlformats.org/drawingml/2006/main" xmlns:pic="http://schemas.openxmlformats.org/drawingml/2006/picture">
-            <wp:extent cx="5760000" cy="2942836"/>
+            <wp:extent cx="5760000" cy="3600000"/>
             <wp:docPr id="1" name="Picture 1" descr="Màn hình xác nhận của mã mẫu"/>
             <wp:cNvGraphicFramePr>
               <a:graphicFrameLocks noChangeAspect="1"/>
@@ -292,7 +292,7 @@
                   <pic:spPr>
                     <a:xfrm>
                       <a:off x="0" y="0"/>
-                      <a:ext cx="5760000" cy="2942836"/>
+                      <a:ext cx="5760000" cy="3600000"/>
                     </a:xfrm>
                     <a:prstGeom prst="rect"/>
                   </pic:spPr>
@@ -317,6 +317,12 @@
           <w:sz w:val="26"/>
         </w:rPr>
         <w:t>Màn hình xác nhận của mã mẫu</w:t>
+      </w:r>
+    </w:p>
+    <w:p>
+      <w:pPr/>
+      <w:r>
+        <w:t>Giao diện Material 3 giữ nguyên Session, Cookie, CSRF và vòng đời bản nháp. Metadata, chi tiết và khu thử vé/ghế tách khỏi form nghiệp vụ. Khu thử không giữ ghế, tạo vé, lưu dữ liệu hay thanh toán.</w:t>
       </w:r>
     </w:p>
     <w:p>
@@ -2089,8 +2095,8 @@
     </w:p>
     <w:p>
       <w:pPr>
-        <w:keepNext/>
-        <w:keepLines/>
+        <w:keepNext w:val="0"/>
+        <w:keepLines w:val="0"/>
         <w:widowControl/>
         <w:spacing w:after="0" w:before="0" w:line="240" w:lineRule="auto"/>
         <w:ind w:firstLine="0" w:left="142" w:right="85"/>
@@ -2098,17 +2104,16 @@
       </w:pPr>
       <w:r>
         <w:rPr>
-          <w:rFonts w:ascii="Times New Roman" w:hAnsi="Times New Roman"/>
-          <w:b w:val="0"/>
-          <w:sz w:val="26"/>
+          <w:rFonts w:ascii="Consolas" w:hAnsi="Consolas"/>
+          <w:sz w:val="17"/>
         </w:rPr>
         <w:t>&lt;?php</w:t>
       </w:r>
     </w:p>
     <w:p>
       <w:pPr>
-        <w:keepNext/>
-        <w:keepLines/>
+        <w:keepNext w:val="0"/>
+        <w:keepLines w:val="0"/>
         <w:widowControl/>
         <w:spacing w:after="0" w:before="0" w:line="240" w:lineRule="auto"/>
         <w:ind w:firstLine="0" w:left="142" w:right="85"/>
@@ -2116,17 +2121,16 @@
       </w:pPr>
       <w:r>
         <w:rPr>
-          <w:rFonts w:ascii="Times New Roman" w:hAnsi="Times New Roman"/>
-          <w:b w:val="0"/>
-          <w:sz w:val="26"/>
+          <w:rFonts w:ascii="Consolas" w:hAnsi="Consolas"/>
+          <w:sz w:val="17"/>
         </w:rPr>
         <w:t>require __DIR__.'/../src/Session.php';</w:t>
       </w:r>
     </w:p>
     <w:p>
       <w:pPr>
-        <w:keepNext/>
-        <w:keepLines/>
+        <w:keepNext w:val="0"/>
+        <w:keepLines w:val="0"/>
         <w:widowControl/>
         <w:spacing w:after="0" w:before="0" w:line="240" w:lineRule="auto"/>
         <w:ind w:firstLine="0" w:left="142" w:right="85"/>
@@ -2134,16 +2138,16 @@
       </w:pPr>
       <w:r>
         <w:rPr>
-          <w:rFonts w:ascii="Times New Roman" w:hAnsi="Times New Roman"/>
-          <w:b w:val="0"/>
-          <w:sz w:val="26"/>
+          <w:rFonts w:ascii="Consolas" w:hAnsi="Consolas"/>
+          <w:sz w:val="17"/>
         </w:rPr>
         <w:t>require __DIR__.'/../src/Input.php';</w:t>
       </w:r>
     </w:p>
     <w:p>
       <w:pPr>
-        <w:keepLines/>
+        <w:keepNext w:val="0"/>
+        <w:keepLines w:val="0"/>
         <w:widowControl/>
         <w:spacing w:after="0" w:before="0" w:line="240" w:lineRule="auto"/>
         <w:ind w:firstLine="0" w:left="142" w:right="85"/>
@@ -2151,16 +2155,16 @@
       </w:pPr>
       <w:r>
         <w:rPr>
-          <w:rFonts w:ascii="Times New Roman" w:hAnsi="Times New Roman"/>
-          <w:b w:val="0"/>
-          <w:sz w:val="26"/>
+          <w:rFonts w:ascii="Consolas" w:hAnsi="Consolas"/>
+          <w:sz w:val="17"/>
         </w:rPr>
         <w:t>require __DIR__.'/../src/Draft.php';</w:t>
       </w:r>
     </w:p>
     <w:p>
       <w:pPr>
-        <w:keepLines/>
+        <w:keepNext w:val="0"/>
+        <w:keepLines w:val="0"/>
         <w:widowControl/>
         <w:spacing w:after="0" w:before="0" w:line="240" w:lineRule="auto"/>
         <w:ind w:firstLine="0" w:left="142" w:right="85"/>
@@ -2168,16 +2172,16 @@
       </w:pPr>
       <w:r>
         <w:rPr>
-          <w:rFonts w:ascii="Times New Roman" w:hAnsi="Times New Roman"/>
-          <w:b w:val="0"/>
-          <w:sz w:val="26"/>
+          <w:rFonts w:ascii="Consolas" w:hAnsi="Consolas"/>
+          <w:sz w:val="17"/>
         </w:rPr>
         <w:t>$events = require __DIR__.'/../data/events.php';</w:t>
       </w:r>
     </w:p>
     <w:p>
       <w:pPr>
-        <w:keepLines/>
+        <w:keepNext w:val="0"/>
+        <w:keepLines w:val="0"/>
         <w:widowControl/>
         <w:spacing w:after="0" w:before="0" w:line="240" w:lineRule="auto"/>
         <w:ind w:firstLine="0" w:left="142" w:right="85"/>
@@ -2185,16 +2189,16 @@
       </w:pPr>
       <w:r>
         <w:rPr>
-          <w:rFonts w:ascii="Times New Roman" w:hAnsi="Times New Roman"/>
-          <w:b w:val="0"/>
-          <w:sz w:val="26"/>
+          <w:rFonts w:ascii="Consolas" w:hAnsi="Consolas"/>
+          <w:sz w:val="17"/>
         </w:rPr>
         <w:t>$errors = [];</w:t>
       </w:r>
     </w:p>
     <w:p>
       <w:pPr>
-        <w:keepLines/>
+        <w:keepNext w:val="0"/>
+        <w:keepLines w:val="0"/>
         <w:widowControl/>
         <w:spacing w:after="0" w:before="0" w:line="240" w:lineRule="auto"/>
         <w:ind w:firstLine="0" w:left="142" w:right="85"/>
@@ -2202,16 +2206,16 @@
       </w:pPr>
       <w:r>
         <w:rPr>
-          <w:rFonts w:ascii="Times New Roman" w:hAnsi="Times New Roman"/>
-          <w:b w:val="0"/>
-          <w:sz w:val="26"/>
+          <w:rFonts w:ascii="Consolas" w:hAnsi="Consolas"/>
+          <w:sz w:val="17"/>
         </w:rPr>
         <w:t>$data = $_SESSION['draft']['data'] ?? ['event_id'=&gt;1,'name'=&gt;'','email'=&gt;''];</w:t>
       </w:r>
     </w:p>
     <w:p>
       <w:pPr>
-        <w:keepLines/>
+        <w:keepNext w:val="0"/>
+        <w:keepLines w:val="0"/>
         <w:widowControl/>
         <w:spacing w:after="0" w:before="0" w:line="240" w:lineRule="auto"/>
         <w:ind w:firstLine="0" w:left="142" w:right="85"/>
@@ -2219,16 +2223,16 @@
       </w:pPr>
       <w:r>
         <w:rPr>
-          <w:rFonts w:ascii="Times New Roman" w:hAnsi="Times New Roman"/>
-          <w:b w:val="0"/>
-          <w:sz w:val="26"/>
+          <w:rFonts w:ascii="Consolas" w:hAnsi="Consolas"/>
+          <w:sz w:val="17"/>
         </w:rPr>
         <w:t>if ($_SERVER['REQUEST_METHOD'] === 'POST') {</w:t>
       </w:r>
     </w:p>
     <w:p>
       <w:pPr>
-        <w:keepLines/>
+        <w:keepNext w:val="0"/>
+        <w:keepLines w:val="0"/>
         <w:widowControl/>
         <w:spacing w:after="0" w:before="0" w:line="240" w:lineRule="auto"/>
         <w:ind w:firstLine="0" w:left="142" w:right="85"/>
@@ -2236,16 +2240,16 @@
       </w:pPr>
       <w:r>
         <w:rPr>
-          <w:rFonts w:ascii="Times New Roman" w:hAnsi="Times New Roman"/>
-          <w:b w:val="0"/>
-          <w:sz w:val="26"/>
+          <w:rFonts w:ascii="Consolas" w:hAnsi="Consolas"/>
+          <w:sz w:val="17"/>
         </w:rPr>
         <w:t xml:space="preserve">    checkCsrf($_POST);</w:t>
       </w:r>
     </w:p>
     <w:p>
       <w:pPr>
-        <w:keepLines/>
+        <w:keepNext w:val="0"/>
+        <w:keepLines w:val="0"/>
         <w:widowControl/>
         <w:spacing w:after="0" w:before="0" w:line="240" w:lineRule="auto"/>
         <w:ind w:firstLine="0" w:left="142" w:right="85"/>
@@ -2253,16 +2257,16 @@
       </w:pPr>
       <w:r>
         <w:rPr>
-          <w:rFonts w:ascii="Times New Roman" w:hAnsi="Times New Roman"/>
-          <w:b w:val="0"/>
-          <w:sz w:val="26"/>
+          <w:rFonts w:ascii="Consolas" w:hAnsi="Consolas"/>
+          <w:sz w:val="17"/>
         </w:rPr>
         <w:t xml:space="preserve">    $result = validateRegistration($_POST, $events);</w:t>
       </w:r>
     </w:p>
     <w:p>
       <w:pPr>
-        <w:keepLines/>
+        <w:keepNext w:val="0"/>
+        <w:keepLines w:val="0"/>
         <w:widowControl/>
         <w:spacing w:after="0" w:before="0" w:line="240" w:lineRule="auto"/>
         <w:ind w:firstLine="0" w:left="142" w:right="85"/>
@@ -2270,16 +2274,16 @@
       </w:pPr>
       <w:r>
         <w:rPr>
-          <w:rFonts w:ascii="Times New Roman" w:hAnsi="Times New Roman"/>
-          <w:b w:val="0"/>
-          <w:sz w:val="26"/>
+          <w:rFonts w:ascii="Consolas" w:hAnsi="Consolas"/>
+          <w:sz w:val="17"/>
         </w:rPr>
         <w:t xml:space="preserve">    $errors = $result['errors']; $data = $result['data'];</w:t>
       </w:r>
     </w:p>
     <w:p>
       <w:pPr>
-        <w:keepLines/>
+        <w:keepNext w:val="0"/>
+        <w:keepLines w:val="0"/>
         <w:widowControl/>
         <w:spacing w:after="0" w:before="0" w:line="240" w:lineRule="auto"/>
         <w:ind w:firstLine="0" w:left="142" w:right="85"/>
@@ -2287,16 +2291,16 @@
       </w:pPr>
       <w:r>
         <w:rPr>
-          <w:rFonts w:ascii="Times New Roman" w:hAnsi="Times New Roman"/>
-          <w:b w:val="0"/>
-          <w:sz w:val="26"/>
+          <w:rFonts w:ascii="Consolas" w:hAnsi="Consolas"/>
+          <w:sz w:val="17"/>
         </w:rPr>
         <w:t xml:space="preserve">    if (!$errors) {</w:t>
       </w:r>
     </w:p>
     <w:p>
       <w:pPr>
-        <w:keepLines/>
+        <w:keepNext w:val="0"/>
+        <w:keepLines w:val="0"/>
         <w:widowControl/>
         <w:spacing w:after="0" w:before="0" w:line="240" w:lineRule="auto"/>
         <w:ind w:firstLine="0" w:left="142" w:right="85"/>
@@ -2304,16 +2308,16 @@
       </w:pPr>
       <w:r>
         <w:rPr>
-          <w:rFonts w:ascii="Times New Roman" w:hAnsi="Times New Roman"/>
-          <w:b w:val="0"/>
-          <w:sz w:val="26"/>
+          <w:rFonts w:ascii="Consolas" w:hAnsi="Consolas"/>
+          <w:sz w:val="17"/>
         </w:rPr>
         <w:t xml:space="preserve">        saveDraft($_SESSION, $data, time());</w:t>
       </w:r>
     </w:p>
     <w:p>
       <w:pPr>
-        <w:keepLines/>
+        <w:keepNext w:val="0"/>
+        <w:keepLines w:val="0"/>
         <w:widowControl/>
         <w:spacing w:after="0" w:before="0" w:line="240" w:lineRule="auto"/>
         <w:ind w:firstLine="0" w:left="142" w:right="85"/>
@@ -2321,16 +2325,16 @@
       </w:pPr>
       <w:r>
         <w:rPr>
-          <w:rFonts w:ascii="Times New Roman" w:hAnsi="Times New Roman"/>
-          <w:b w:val="0"/>
-          <w:sz w:val="26"/>
+          <w:rFonts w:ascii="Consolas" w:hAnsi="Consolas"/>
+          <w:sz w:val="17"/>
         </w:rPr>
         <w:t xml:space="preserve">        header('Location: /confirm.php', true, 303); exit;</w:t>
       </w:r>
     </w:p>
     <w:p>
       <w:pPr>
-        <w:keepLines/>
+        <w:keepNext w:val="0"/>
+        <w:keepLines w:val="0"/>
         <w:widowControl/>
         <w:spacing w:after="0" w:before="0" w:line="240" w:lineRule="auto"/>
         <w:ind w:firstLine="0" w:left="142" w:right="85"/>
@@ -2338,16 +2342,16 @@
       </w:pPr>
       <w:r>
         <w:rPr>
-          <w:rFonts w:ascii="Times New Roman" w:hAnsi="Times New Roman"/>
-          <w:b w:val="0"/>
-          <w:sz w:val="26"/>
+          <w:rFonts w:ascii="Consolas" w:hAnsi="Consolas"/>
+          <w:sz w:val="17"/>
         </w:rPr>
         <w:t xml:space="preserve">    }</w:t>
       </w:r>
     </w:p>
     <w:p>
       <w:pPr>
-        <w:keepLines/>
+        <w:keepNext w:val="0"/>
+        <w:keepLines w:val="0"/>
         <w:widowControl/>
         <w:spacing w:after="0" w:before="0" w:line="240" w:lineRule="auto"/>
         <w:ind w:firstLine="0" w:left="142" w:right="85"/>
@@ -2355,16 +2359,16 @@
       </w:pPr>
       <w:r>
         <w:rPr>
-          <w:rFonts w:ascii="Times New Roman" w:hAnsi="Times New Roman"/>
-          <w:b w:val="0"/>
-          <w:sz w:val="26"/>
+          <w:rFonts w:ascii="Consolas" w:hAnsi="Consolas"/>
+          <w:sz w:val="17"/>
         </w:rPr>
         <w:t>}</w:t>
       </w:r>
     </w:p>
     <w:p>
       <w:pPr>
-        <w:keepLines/>
+        <w:keepNext w:val="0"/>
+        <w:keepLines w:val="0"/>
         <w:widowControl/>
         <w:spacing w:after="0" w:before="0" w:line="240" w:lineRule="auto"/>
         <w:ind w:firstLine="0" w:left="142" w:right="85"/>
@@ -2372,16 +2376,16 @@
       </w:pPr>
       <w:r>
         <w:rPr>
-          <w:rFonts w:ascii="Times New Roman" w:hAnsi="Times New Roman"/>
-          <w:b w:val="0"/>
-          <w:sz w:val="26"/>
+          <w:rFonts w:ascii="Consolas" w:hAnsi="Consolas"/>
+          <w:sz w:val="17"/>
         </w:rPr>
         <w:t>require __DIR__.'/../templates/header.php';</w:t>
       </w:r>
     </w:p>
     <w:p>
       <w:pPr>
-        <w:keepLines/>
+        <w:keepNext w:val="0"/>
+        <w:keepLines w:val="0"/>
         <w:widowControl/>
         <w:spacing w:after="0" w:before="0" w:line="240" w:lineRule="auto"/>
         <w:ind w:firstLine="0" w:left="142" w:right="85"/>
@@ -2389,16 +2393,16 @@
       </w:pPr>
       <w:r>
         <w:rPr>
-          <w:rFonts w:ascii="Times New Roman" w:hAnsi="Times New Roman"/>
-          <w:b w:val="0"/>
-          <w:sz w:val="26"/>
+          <w:rFonts w:ascii="Consolas" w:hAnsi="Consolas"/>
+          <w:sz w:val="17"/>
         </w:rPr>
         <w:t>?&gt;</w:t>
       </w:r>
     </w:p>
     <w:p>
       <w:pPr>
-        <w:keepLines/>
+        <w:keepNext w:val="0"/>
+        <w:keepLines w:val="0"/>
         <w:widowControl/>
         <w:spacing w:after="0" w:before="0" w:line="240" w:lineRule="auto"/>
         <w:ind w:firstLine="0" w:left="142" w:right="85"/>
@@ -2406,16 +2410,16 @@
       </w:pPr>
       <w:r>
         <w:rPr>
-          <w:rFonts w:ascii="Times New Roman" w:hAnsi="Times New Roman"/>
-          <w:b w:val="0"/>
-          <w:sz w:val="26"/>
-        </w:rPr>
-        <w:t>&lt;h2&gt;Bước 1. Nhập thông tin&lt;/h2&gt;</w:t>
+          <w:rFonts w:ascii="Consolas" w:hAnsi="Consolas"/>
+          <w:sz w:val="17"/>
+        </w:rPr>
+        <w:t>&lt;div class="page-heading"&gt;</w:t>
       </w:r>
     </w:p>
     <w:p>
       <w:pPr>
-        <w:keepLines/>
+        <w:keepNext w:val="0"/>
+        <w:keepLines w:val="0"/>
         <w:widowControl/>
         <w:spacing w:after="0" w:before="0" w:line="240" w:lineRule="auto"/>
         <w:ind w:firstLine="0" w:left="142" w:right="85"/>
@@ -2423,16 +2427,16 @@
       </w:pPr>
       <w:r>
         <w:rPr>
-          <w:rFonts w:ascii="Times New Roman" w:hAnsi="Times New Roman"/>
-          <w:b w:val="0"/>
-          <w:sz w:val="26"/>
-        </w:rPr>
-        <w:t>&lt;p&gt;</w:t>
+          <w:rFonts w:ascii="Consolas" w:hAnsi="Consolas"/>
+          <w:sz w:val="17"/>
+        </w:rPr>
+        <w:t>&lt;h1&gt;Bước 1. Nhập thông tin&lt;/h1&gt;</w:t>
       </w:r>
     </w:p>
     <w:p>
       <w:pPr>
-        <w:keepLines/>
+        <w:keepNext w:val="0"/>
+        <w:keepLines w:val="0"/>
         <w:widowControl/>
         <w:spacing w:after="0" w:before="0" w:line="240" w:lineRule="auto"/>
         <w:ind w:firstLine="0" w:left="142" w:right="85"/>
@@ -2440,16 +2444,16 @@
       </w:pPr>
       <w:r>
         <w:rPr>
-          <w:rFonts w:ascii="Times New Roman" w:hAnsi="Times New Roman"/>
-          <w:b w:val="0"/>
-          <w:sz w:val="26"/>
-        </w:rPr>
-        <w:t>&lt;?= e(implode(', ', $errors)) ?&gt;</w:t>
+          <w:rFonts w:ascii="Consolas" w:hAnsi="Consolas"/>
+          <w:sz w:val="17"/>
+        </w:rPr>
+        <w:t>&lt;p&gt;Điền thông tin để chuyển đến bước xem lại bản nháp.&lt;/p&gt;</w:t>
       </w:r>
     </w:p>
     <w:p>
       <w:pPr>
-        <w:keepLines/>
+        <w:keepNext w:val="0"/>
+        <w:keepLines w:val="0"/>
         <w:widowControl/>
         <w:spacing w:after="0" w:before="0" w:line="240" w:lineRule="auto"/>
         <w:ind w:firstLine="0" w:left="142" w:right="85"/>
@@ -2457,16 +2461,16 @@
       </w:pPr>
       <w:r>
         <w:rPr>
-          <w:rFonts w:ascii="Times New Roman" w:hAnsi="Times New Roman"/>
-          <w:b w:val="0"/>
-          <w:sz w:val="26"/>
-        </w:rPr>
-        <w:t>&lt;/p&gt;</w:t>
+          <w:rFonts w:ascii="Consolas" w:hAnsi="Consolas"/>
+          <w:sz w:val="17"/>
+        </w:rPr>
+        <w:t>&lt;/div&gt;</w:t>
       </w:r>
     </w:p>
     <w:p>
       <w:pPr>
-        <w:keepLines/>
+        <w:keepNext w:val="0"/>
+        <w:keepLines w:val="0"/>
         <w:widowControl/>
         <w:spacing w:after="0" w:before="0" w:line="240" w:lineRule="auto"/>
         <w:ind w:firstLine="0" w:left="142" w:right="85"/>
@@ -2474,16 +2478,16 @@
       </w:pPr>
       <w:r>
         <w:rPr>
-          <w:rFonts w:ascii="Times New Roman" w:hAnsi="Times New Roman"/>
-          <w:b w:val="0"/>
-          <w:sz w:val="26"/>
-        </w:rPr>
-        <w:t>&lt;form method="post"&gt;</w:t>
+          <w:rFonts w:ascii="Consolas" w:hAnsi="Consolas"/>
+          <w:sz w:val="17"/>
+        </w:rPr>
+        <w:t>&lt;div class="error-summary" role="alert"&gt;</w:t>
       </w:r>
     </w:p>
     <w:p>
       <w:pPr>
-        <w:keepLines/>
+        <w:keepNext w:val="0"/>
+        <w:keepLines w:val="0"/>
         <w:widowControl/>
         <w:spacing w:after="0" w:before="0" w:line="240" w:lineRule="auto"/>
         <w:ind w:firstLine="0" w:left="142" w:right="85"/>
@@ -2491,16 +2495,16 @@
       </w:pPr>
       <w:r>
         <w:rPr>
-          <w:rFonts w:ascii="Times New Roman" w:hAnsi="Times New Roman"/>
-          <w:b w:val="0"/>
-          <w:sz w:val="26"/>
-        </w:rPr>
-        <w:t>&lt;input type="hidden" name="csrf" value="&lt;?= e($_SESSION['csrf']) ?&gt;"&gt;</w:t>
+          <w:rFonts w:ascii="Consolas" w:hAnsi="Consolas"/>
+          <w:sz w:val="17"/>
+        </w:rPr>
+        <w:t>&lt;p class="error-messages"&gt;&lt;?= e(implode(', ', $errors)) ?&gt;&lt;/p&gt;</w:t>
       </w:r>
     </w:p>
     <w:p>
       <w:pPr>
-        <w:keepLines/>
+        <w:keepNext w:val="0"/>
+        <w:keepLines w:val="0"/>
         <w:widowControl/>
         <w:spacing w:after="0" w:before="0" w:line="240" w:lineRule="auto"/>
         <w:ind w:firstLine="0" w:left="142" w:right="85"/>
@@ -2508,16 +2512,16 @@
       </w:pPr>
       <w:r>
         <w:rPr>
-          <w:rFonts w:ascii="Times New Roman" w:hAnsi="Times New Roman"/>
-          <w:b w:val="0"/>
-          <w:sz w:val="26"/>
-        </w:rPr>
-        <w:t>&lt;label&gt;Sự kiện &lt;select name="event_id"&gt;</w:t>
+          <w:rFonts w:ascii="Consolas" w:hAnsi="Consolas"/>
+          <w:sz w:val="17"/>
+        </w:rPr>
+        <w:t>&lt;p&gt;Thông tin chưa hợp lệ. Kiểm tra lại các thông tin đã nhập rồi gửi lại.&lt;/p&gt;</w:t>
       </w:r>
     </w:p>
     <w:p>
       <w:pPr>
-        <w:keepLines/>
+        <w:keepNext w:val="0"/>
+        <w:keepLines w:val="0"/>
         <w:widowControl/>
         <w:spacing w:after="0" w:before="0" w:line="240" w:lineRule="auto"/>
         <w:ind w:firstLine="0" w:left="142" w:right="85"/>
@@ -2525,16 +2529,16 @@
       </w:pPr>
       <w:r>
         <w:rPr>
-          <w:rFonts w:ascii="Times New Roman" w:hAnsi="Times New Roman"/>
-          <w:b w:val="0"/>
-          <w:sz w:val="26"/>
-        </w:rPr>
-        <w:t>&lt;?php foreach($events as $event): ?&gt;</w:t>
+          <w:rFonts w:ascii="Consolas" w:hAnsi="Consolas"/>
+          <w:sz w:val="17"/>
+        </w:rPr>
+        <w:t>&lt;/div&gt;</w:t>
       </w:r>
     </w:p>
     <w:p>
       <w:pPr>
-        <w:keepLines/>
+        <w:keepNext w:val="0"/>
+        <w:keepLines w:val="0"/>
         <w:widowControl/>
         <w:spacing w:after="0" w:before="0" w:line="240" w:lineRule="auto"/>
         <w:ind w:firstLine="0" w:left="142" w:right="85"/>
@@ -2542,16 +2546,16 @@
       </w:pPr>
       <w:r>
         <w:rPr>
-          <w:rFonts w:ascii="Times New Roman" w:hAnsi="Times New Roman"/>
-          <w:b w:val="0"/>
-          <w:sz w:val="26"/>
-        </w:rPr>
-        <w:t>&lt;option value="&lt;?= $event['id'] ?&gt;" &lt;?= (int)$data['event_id']===$event['id']?'selected':'' ?&gt;&gt;</w:t>
+          <w:rFonts w:ascii="Consolas" w:hAnsi="Consolas"/>
+          <w:sz w:val="17"/>
+        </w:rPr>
+        <w:t>&lt;form class="registration-form" method="post"&gt;</w:t>
       </w:r>
     </w:p>
     <w:p>
       <w:pPr>
-        <w:keepLines/>
+        <w:keepNext w:val="0"/>
+        <w:keepLines w:val="0"/>
         <w:widowControl/>
         <w:spacing w:after="0" w:before="0" w:line="240" w:lineRule="auto"/>
         <w:ind w:firstLine="0" w:left="142" w:right="85"/>
@@ -2559,16 +2563,16 @@
       </w:pPr>
       <w:r>
         <w:rPr>
-          <w:rFonts w:ascii="Times New Roman" w:hAnsi="Times New Roman"/>
-          <w:b w:val="0"/>
-          <w:sz w:val="26"/>
-        </w:rPr>
-        <w:t>&lt;?= e($event['title']) ?&gt;</w:t>
+          <w:rFonts w:ascii="Consolas" w:hAnsi="Consolas"/>
+          <w:sz w:val="17"/>
+        </w:rPr>
+        <w:t>&lt;input type="hidden" name="csrf" value="&lt;?= e($_SESSION['csrf']) ?&gt;"&gt;</w:t>
       </w:r>
     </w:p>
     <w:p>
       <w:pPr>
-        <w:keepLines/>
+        <w:keepNext w:val="0"/>
+        <w:keepLines w:val="0"/>
         <w:widowControl/>
         <w:spacing w:after="0" w:before="0" w:line="240" w:lineRule="auto"/>
         <w:ind w:firstLine="0" w:left="142" w:right="85"/>
@@ -2576,16 +2580,16 @@
       </w:pPr>
       <w:r>
         <w:rPr>
-          <w:rFonts w:ascii="Times New Roman" w:hAnsi="Times New Roman"/>
-          <w:b w:val="0"/>
-          <w:sz w:val="26"/>
-        </w:rPr>
-        <w:t>&lt;/option&gt;</w:t>
+          <w:rFonts w:ascii="Consolas" w:hAnsi="Consolas"/>
+          <w:sz w:val="17"/>
+        </w:rPr>
+        <w:t>&lt;label class="form-field" for="event_id"&gt;Sự kiện</w:t>
       </w:r>
     </w:p>
     <w:p>
       <w:pPr>
-        <w:keepLines/>
+        <w:keepNext w:val="0"/>
+        <w:keepLines w:val="0"/>
         <w:widowControl/>
         <w:spacing w:after="0" w:before="0" w:line="240" w:lineRule="auto"/>
         <w:ind w:firstLine="0" w:left="142" w:right="85"/>
@@ -2593,16 +2597,16 @@
       </w:pPr>
       <w:r>
         <w:rPr>
-          <w:rFonts w:ascii="Times New Roman" w:hAnsi="Times New Roman"/>
-          <w:b w:val="0"/>
-          <w:sz w:val="26"/>
-        </w:rPr>
-        <w:t>&lt;?php endforeach; ?&gt;</w:t>
+          <w:rFonts w:ascii="Consolas" w:hAnsi="Consolas"/>
+          <w:sz w:val="17"/>
+        </w:rPr>
+        <w:t>&lt;select id="event_id" name="event_id"&gt;</w:t>
       </w:r>
     </w:p>
     <w:p>
       <w:pPr>
-        <w:keepLines/>
+        <w:keepNext w:val="0"/>
+        <w:keepLines w:val="0"/>
         <w:widowControl/>
         <w:spacing w:after="0" w:before="0" w:line="240" w:lineRule="auto"/>
         <w:ind w:firstLine="0" w:left="142" w:right="85"/>
@@ -2610,16 +2614,16 @@
       </w:pPr>
       <w:r>
         <w:rPr>
-          <w:rFonts w:ascii="Times New Roman" w:hAnsi="Times New Roman"/>
-          <w:b w:val="0"/>
-          <w:sz w:val="26"/>
-        </w:rPr>
-        <w:t>&lt;/select&gt;</w:t>
+          <w:rFonts w:ascii="Consolas" w:hAnsi="Consolas"/>
+          <w:sz w:val="17"/>
+        </w:rPr>
+        <w:t>&lt;?php foreach($events as $event): ?&gt;</w:t>
       </w:r>
     </w:p>
     <w:p>
       <w:pPr>
-        <w:keepLines/>
+        <w:keepNext w:val="0"/>
+        <w:keepLines w:val="0"/>
         <w:widowControl/>
         <w:spacing w:after="0" w:before="0" w:line="240" w:lineRule="auto"/>
         <w:ind w:firstLine="0" w:left="142" w:right="85"/>
@@ -2627,16 +2631,16 @@
       </w:pPr>
       <w:r>
         <w:rPr>
-          <w:rFonts w:ascii="Times New Roman" w:hAnsi="Times New Roman"/>
-          <w:b w:val="0"/>
-          <w:sz w:val="26"/>
-        </w:rPr>
-        <w:t>&lt;/label&gt;</w:t>
+          <w:rFonts w:ascii="Consolas" w:hAnsi="Consolas"/>
+          <w:sz w:val="17"/>
+        </w:rPr>
+        <w:t>&lt;option value="&lt;?= $event['id'] ?&gt;" &lt;?= (int)$data['event_id']===$event['id']?'selected':'' ?&gt;&gt;</w:t>
       </w:r>
     </w:p>
     <w:p>
       <w:pPr>
-        <w:keepLines/>
+        <w:keepNext w:val="0"/>
+        <w:keepLines w:val="0"/>
         <w:widowControl/>
         <w:spacing w:after="0" w:before="0" w:line="240" w:lineRule="auto"/>
         <w:ind w:firstLine="0" w:left="142" w:right="85"/>
@@ -2644,16 +2648,16 @@
       </w:pPr>
       <w:r>
         <w:rPr>
-          <w:rFonts w:ascii="Times New Roman" w:hAnsi="Times New Roman"/>
-          <w:b w:val="0"/>
-          <w:sz w:val="26"/>
-        </w:rPr>
-        <w:t>&lt;br&gt;</w:t>
+          <w:rFonts w:ascii="Consolas" w:hAnsi="Consolas"/>
+          <w:sz w:val="17"/>
+        </w:rPr>
+        <w:t>&lt;?= e($event['title']) ?&gt;</w:t>
       </w:r>
     </w:p>
     <w:p>
       <w:pPr>
-        <w:keepLines/>
+        <w:keepNext w:val="0"/>
+        <w:keepLines w:val="0"/>
         <w:widowControl/>
         <w:spacing w:after="0" w:before="0" w:line="240" w:lineRule="auto"/>
         <w:ind w:firstLine="0" w:left="142" w:right="85"/>
@@ -2661,16 +2665,16 @@
       </w:pPr>
       <w:r>
         <w:rPr>
-          <w:rFonts w:ascii="Times New Roman" w:hAnsi="Times New Roman"/>
-          <w:b w:val="0"/>
-          <w:sz w:val="26"/>
-        </w:rPr>
-        <w:t>&lt;label&gt;Họ tên &lt;input name="name" value="&lt;?= e($data['name']) ?&gt;"&gt;</w:t>
+          <w:rFonts w:ascii="Consolas" w:hAnsi="Consolas"/>
+          <w:sz w:val="17"/>
+        </w:rPr>
+        <w:t>&lt;/option&gt;</w:t>
       </w:r>
     </w:p>
     <w:p>
       <w:pPr>
-        <w:keepLines/>
+        <w:keepNext w:val="0"/>
+        <w:keepLines w:val="0"/>
         <w:widowControl/>
         <w:spacing w:after="0" w:before="0" w:line="240" w:lineRule="auto"/>
         <w:ind w:firstLine="0" w:left="142" w:right="85"/>
@@ -2678,16 +2682,16 @@
       </w:pPr>
       <w:r>
         <w:rPr>
-          <w:rFonts w:ascii="Times New Roman" w:hAnsi="Times New Roman"/>
-          <w:b w:val="0"/>
-          <w:sz w:val="26"/>
-        </w:rPr>
-        <w:t>&lt;/label&gt;</w:t>
+          <w:rFonts w:ascii="Consolas" w:hAnsi="Consolas"/>
+          <w:sz w:val="17"/>
+        </w:rPr>
+        <w:t>&lt;?php endforeach; ?&gt;</w:t>
       </w:r>
     </w:p>
     <w:p>
       <w:pPr>
-        <w:keepLines/>
+        <w:keepNext w:val="0"/>
+        <w:keepLines w:val="0"/>
         <w:widowControl/>
         <w:spacing w:after="0" w:before="0" w:line="240" w:lineRule="auto"/>
         <w:ind w:firstLine="0" w:left="142" w:right="85"/>
@@ -2695,16 +2699,16 @@
       </w:pPr>
       <w:r>
         <w:rPr>
-          <w:rFonts w:ascii="Times New Roman" w:hAnsi="Times New Roman"/>
-          <w:b w:val="0"/>
-          <w:sz w:val="26"/>
-        </w:rPr>
-        <w:t>&lt;br&gt;</w:t>
+          <w:rFonts w:ascii="Consolas" w:hAnsi="Consolas"/>
+          <w:sz w:val="17"/>
+        </w:rPr>
+        <w:t>&lt;/select&gt;</w:t>
       </w:r>
     </w:p>
     <w:p>
       <w:pPr>
-        <w:keepLines/>
+        <w:keepNext w:val="0"/>
+        <w:keepLines w:val="0"/>
         <w:widowControl/>
         <w:spacing w:after="0" w:before="0" w:line="240" w:lineRule="auto"/>
         <w:ind w:firstLine="0" w:left="142" w:right="85"/>
@@ -2712,16 +2716,16 @@
       </w:pPr>
       <w:r>
         <w:rPr>
-          <w:rFonts w:ascii="Times New Roman" w:hAnsi="Times New Roman"/>
-          <w:b w:val="0"/>
-          <w:sz w:val="26"/>
-        </w:rPr>
-        <w:t>&lt;label&gt;Email &lt;input name="email" value="&lt;?= e($data['email']) ?&gt;"&gt;</w:t>
+          <w:rFonts w:ascii="Consolas" w:hAnsi="Consolas"/>
+          <w:sz w:val="17"/>
+        </w:rPr>
+        <w:t>&lt;/label&gt;</w:t>
       </w:r>
     </w:p>
     <w:p>
       <w:pPr>
-        <w:keepLines/>
+        <w:keepNext w:val="0"/>
+        <w:keepLines w:val="0"/>
         <w:widowControl/>
         <w:spacing w:after="0" w:before="0" w:line="240" w:lineRule="auto"/>
         <w:ind w:firstLine="0" w:left="142" w:right="85"/>
@@ -2729,16 +2733,16 @@
       </w:pPr>
       <w:r>
         <w:rPr>
-          <w:rFonts w:ascii="Times New Roman" w:hAnsi="Times New Roman"/>
-          <w:b w:val="0"/>
-          <w:sz w:val="26"/>
-        </w:rPr>
-        <w:t>&lt;/label&gt;</w:t>
+          <w:rFonts w:ascii="Consolas" w:hAnsi="Consolas"/>
+          <w:sz w:val="17"/>
+        </w:rPr>
+        <w:t>&lt;label class="form-field" for="name"&gt;Họ tên</w:t>
       </w:r>
     </w:p>
     <w:p>
       <w:pPr>
-        <w:keepLines/>
+        <w:keepNext w:val="0"/>
+        <w:keepLines w:val="0"/>
         <w:widowControl/>
         <w:spacing w:after="0" w:before="0" w:line="240" w:lineRule="auto"/>
         <w:ind w:firstLine="0" w:left="142" w:right="85"/>
@@ -2746,16 +2750,16 @@
       </w:pPr>
       <w:r>
         <w:rPr>
-          <w:rFonts w:ascii="Times New Roman" w:hAnsi="Times New Roman"/>
-          <w:b w:val="0"/>
-          <w:sz w:val="26"/>
-        </w:rPr>
-        <w:t>&lt;br&gt;</w:t>
+          <w:rFonts w:ascii="Consolas" w:hAnsi="Consolas"/>
+          <w:sz w:val="17"/>
+        </w:rPr>
+        <w:t>&lt;input id="name" name="name" value="&lt;?= e($data['name']) ?&gt;"&gt;</w:t>
       </w:r>
     </w:p>
     <w:p>
       <w:pPr>
-        <w:keepLines/>
+        <w:keepNext w:val="0"/>
+        <w:keepLines w:val="0"/>
         <w:widowControl/>
         <w:spacing w:after="0" w:before="0" w:line="240" w:lineRule="auto"/>
         <w:ind w:firstLine="0" w:left="142" w:right="85"/>
@@ -2763,16 +2767,16 @@
       </w:pPr>
       <w:r>
         <w:rPr>
-          <w:rFonts w:ascii="Times New Roman" w:hAnsi="Times New Roman"/>
-          <w:b w:val="0"/>
-          <w:sz w:val="26"/>
-        </w:rPr>
-        <w:t>&lt;button&gt;Tiếp tục&lt;/button&gt;</w:t>
+          <w:rFonts w:ascii="Consolas" w:hAnsi="Consolas"/>
+          <w:sz w:val="17"/>
+        </w:rPr>
+        <w:t>&lt;/label&gt;</w:t>
       </w:r>
     </w:p>
     <w:p>
       <w:pPr>
-        <w:keepLines/>
+        <w:keepNext w:val="0"/>
+        <w:keepLines w:val="0"/>
         <w:widowControl/>
         <w:spacing w:after="0" w:before="0" w:line="240" w:lineRule="auto"/>
         <w:ind w:firstLine="0" w:left="142" w:right="85"/>
@@ -2780,16 +2784,16 @@
       </w:pPr>
       <w:r>
         <w:rPr>
-          <w:rFonts w:ascii="Times New Roman" w:hAnsi="Times New Roman"/>
-          <w:b w:val="0"/>
-          <w:sz w:val="26"/>
-        </w:rPr>
-        <w:t>&lt;/form&gt;</w:t>
+          <w:rFonts w:ascii="Consolas" w:hAnsi="Consolas"/>
+          <w:sz w:val="17"/>
+        </w:rPr>
+        <w:t>&lt;label class="form-field" for="email"&gt;Email</w:t>
       </w:r>
     </w:p>
     <w:p>
       <w:pPr>
-        <w:keepLines/>
+        <w:keepNext w:val="0"/>
+        <w:keepLines w:val="0"/>
         <w:widowControl/>
         <w:spacing w:after="0" w:before="0" w:line="240" w:lineRule="auto"/>
         <w:ind w:firstLine="0" w:left="142" w:right="85"/>
@@ -2797,16 +2801,16 @@
       </w:pPr>
       <w:r>
         <w:rPr>
-          <w:rFonts w:ascii="Times New Roman" w:hAnsi="Times New Roman"/>
-          <w:b w:val="0"/>
-          <w:sz w:val="26"/>
-        </w:rPr>
-        <w:t>&lt;form method="post" action="/preferences.php"&gt;</w:t>
+          <w:rFonts w:ascii="Consolas" w:hAnsi="Consolas"/>
+          <w:sz w:val="17"/>
+        </w:rPr>
+        <w:t>&lt;input id="email" name="email" value="&lt;?= e($data['email']) ?&gt;"&gt;</w:t>
       </w:r>
     </w:p>
     <w:p>
       <w:pPr>
-        <w:keepLines/>
+        <w:keepNext w:val="0"/>
+        <w:keepLines w:val="0"/>
         <w:widowControl/>
         <w:spacing w:after="0" w:before="0" w:line="240" w:lineRule="auto"/>
         <w:ind w:firstLine="0" w:left="142" w:right="85"/>
@@ -2814,16 +2818,16 @@
       </w:pPr>
       <w:r>
         <w:rPr>
-          <w:rFonts w:ascii="Times New Roman" w:hAnsi="Times New Roman"/>
-          <w:b w:val="0"/>
-          <w:sz w:val="26"/>
-        </w:rPr>
-        <w:t>&lt;input type="hidden" name="csrf" value="&lt;?= e($_SESSION['csrf']) ?&gt;"&gt;</w:t>
+          <w:rFonts w:ascii="Consolas" w:hAnsi="Consolas"/>
+          <w:sz w:val="17"/>
+        </w:rPr>
+        <w:t>&lt;/label&gt;</w:t>
       </w:r>
     </w:p>
     <w:p>
       <w:pPr>
-        <w:keepLines/>
+        <w:keepNext w:val="0"/>
+        <w:keepLines w:val="0"/>
         <w:widowControl/>
         <w:spacing w:after="0" w:before="0" w:line="240" w:lineRule="auto"/>
         <w:ind w:firstLine="0" w:left="142" w:right="85"/>
@@ -2831,16 +2835,16 @@
       </w:pPr>
       <w:r>
         <w:rPr>
-          <w:rFonts w:ascii="Times New Roman" w:hAnsi="Times New Roman"/>
-          <w:b w:val="0"/>
-          <w:sz w:val="26"/>
-        </w:rPr>
-        <w:t>&lt;label&gt;Cách hiển thị &lt;select name="view"&gt;</w:t>
+          <w:rFonts w:ascii="Consolas" w:hAnsi="Consolas"/>
+          <w:sz w:val="17"/>
+        </w:rPr>
+        <w:t>&lt;button&gt;Tiếp tục&lt;/button&gt;</w:t>
       </w:r>
     </w:p>
     <w:p>
       <w:pPr>
-        <w:keepLines/>
+        <w:keepNext w:val="0"/>
+        <w:keepLines w:val="0"/>
         <w:widowControl/>
         <w:spacing w:after="0" w:before="0" w:line="240" w:lineRule="auto"/>
         <w:ind w:firstLine="0" w:left="142" w:right="85"/>
@@ -2848,16 +2852,16 @@
       </w:pPr>
       <w:r>
         <w:rPr>
-          <w:rFonts w:ascii="Times New Roman" w:hAnsi="Times New Roman"/>
-          <w:b w:val="0"/>
-          <w:sz w:val="26"/>
-        </w:rPr>
-        <w:t>&lt;option value="compact"&gt;Gọn&lt;/option&gt;</w:t>
+          <w:rFonts w:ascii="Consolas" w:hAnsi="Consolas"/>
+          <w:sz w:val="17"/>
+        </w:rPr>
+        <w:t>&lt;/form&gt;</w:t>
       </w:r>
     </w:p>
     <w:p>
       <w:pPr>
-        <w:keepLines/>
+        <w:keepNext w:val="0"/>
+        <w:keepLines w:val="0"/>
         <w:widowControl/>
         <w:spacing w:after="0" w:before="0" w:line="240" w:lineRule="auto"/>
         <w:ind w:firstLine="0" w:left="142" w:right="85"/>
@@ -2865,16 +2869,16 @@
       </w:pPr>
       <w:r>
         <w:rPr>
-          <w:rFonts w:ascii="Times New Roman" w:hAnsi="Times New Roman"/>
-          <w:b w:val="0"/>
-          <w:sz w:val="26"/>
-        </w:rPr>
-        <w:t>&lt;option value="full"&gt;Đầy đủ&lt;/option&gt;</w:t>
+          <w:rFonts w:ascii="Consolas" w:hAnsi="Consolas"/>
+          <w:sz w:val="17"/>
+        </w:rPr>
+        <w:t>&lt;form class="preferences-form" method="post" action="/preferences.php"&gt;</w:t>
       </w:r>
     </w:p>
     <w:p>
       <w:pPr>
-        <w:keepLines/>
+        <w:keepNext w:val="0"/>
+        <w:keepLines w:val="0"/>
         <w:widowControl/>
         <w:spacing w:after="0" w:before="0" w:line="240" w:lineRule="auto"/>
         <w:ind w:firstLine="0" w:left="142" w:right="85"/>
@@ -2882,16 +2886,16 @@
       </w:pPr>
       <w:r>
         <w:rPr>
-          <w:rFonts w:ascii="Times New Roman" w:hAnsi="Times New Roman"/>
-          <w:b w:val="0"/>
-          <w:sz w:val="26"/>
-        </w:rPr>
-        <w:t>&lt;/select&gt;</w:t>
+          <w:rFonts w:ascii="Consolas" w:hAnsi="Consolas"/>
+          <w:sz w:val="17"/>
+        </w:rPr>
+        <w:t>&lt;h2&gt;Tùy chọn hiển thị&lt;/h2&gt;</w:t>
       </w:r>
     </w:p>
     <w:p>
       <w:pPr>
-        <w:keepLines/>
+        <w:keepNext w:val="0"/>
+        <w:keepLines w:val="0"/>
         <w:widowControl/>
         <w:spacing w:after="0" w:before="0" w:line="240" w:lineRule="auto"/>
         <w:ind w:firstLine="0" w:left="142" w:right="85"/>
@@ -2899,16 +2903,16 @@
       </w:pPr>
       <w:r>
         <w:rPr>
-          <w:rFonts w:ascii="Times New Roman" w:hAnsi="Times New Roman"/>
-          <w:b w:val="0"/>
-          <w:sz w:val="26"/>
-        </w:rPr>
-        <w:t>&lt;/label&gt;</w:t>
+          <w:rFonts w:ascii="Consolas" w:hAnsi="Consolas"/>
+          <w:sz w:val="17"/>
+        </w:rPr>
+        <w:t>&lt;p&gt;Form này chỉ lưu tùy chọn Cookie, không gửi đăng ký.&lt;/p&gt;</w:t>
       </w:r>
     </w:p>
     <w:p>
       <w:pPr>
-        <w:keepLines/>
+        <w:keepNext w:val="0"/>
+        <w:keepLines w:val="0"/>
         <w:widowControl/>
         <w:spacing w:after="0" w:before="0" w:line="240" w:lineRule="auto"/>
         <w:ind w:firstLine="0" w:left="142" w:right="85"/>
@@ -2916,16 +2920,16 @@
       </w:pPr>
       <w:r>
         <w:rPr>
-          <w:rFonts w:ascii="Times New Roman" w:hAnsi="Times New Roman"/>
-          <w:b w:val="0"/>
-          <w:sz w:val="26"/>
-        </w:rPr>
-        <w:t>&lt;button&gt;Lưu tùy chọn&lt;/button&gt;</w:t>
+          <w:rFonts w:ascii="Consolas" w:hAnsi="Consolas"/>
+          <w:sz w:val="17"/>
+        </w:rPr>
+        <w:t>&lt;input type="hidden" name="csrf" value="&lt;?= e($_SESSION['csrf']) ?&gt;"&gt;</w:t>
       </w:r>
     </w:p>
     <w:p>
       <w:pPr>
-        <w:keepLines/>
+        <w:keepNext w:val="0"/>
+        <w:keepLines w:val="0"/>
         <w:widowControl/>
         <w:spacing w:after="0" w:before="0" w:line="240" w:lineRule="auto"/>
         <w:ind w:firstLine="0" w:left="142" w:right="85"/>
@@ -2933,16 +2937,16 @@
       </w:pPr>
       <w:r>
         <w:rPr>
-          <w:rFonts w:ascii="Times New Roman" w:hAnsi="Times New Roman"/>
-          <w:b w:val="0"/>
-          <w:sz w:val="26"/>
-        </w:rPr>
-        <w:t>&lt;/form&gt;</w:t>
+          <w:rFonts w:ascii="Consolas" w:hAnsi="Consolas"/>
+          <w:sz w:val="17"/>
+        </w:rPr>
+        <w:t>&lt;label class="form-field" for="view"&gt;Cách hiển thị</w:t>
       </w:r>
     </w:p>
     <w:p>
       <w:pPr>
-        <w:keepLines/>
+        <w:keepNext w:val="0"/>
+        <w:keepLines w:val="0"/>
         <w:widowControl/>
         <w:spacing w:after="0" w:before="0" w:line="240" w:lineRule="auto"/>
         <w:ind w:firstLine="0" w:left="142" w:right="85"/>
@@ -2950,16 +2954,16 @@
       </w:pPr>
       <w:r>
         <w:rPr>
-          <w:rFonts w:ascii="Times New Roman" w:hAnsi="Times New Roman"/>
-          <w:b w:val="0"/>
-          <w:sz w:val="26"/>
-        </w:rPr>
-        <w:t>&lt;p&gt;Tùy chọn Cookie: &lt;?= e(field($_COOKIE, 'view')) ?&gt;</w:t>
+          <w:rFonts w:ascii="Consolas" w:hAnsi="Consolas"/>
+          <w:sz w:val="17"/>
+        </w:rPr>
+        <w:t>&lt;select id="view" name="view"&gt;</w:t>
       </w:r>
     </w:p>
     <w:p>
       <w:pPr>
-        <w:keepLines/>
+        <w:keepNext w:val="0"/>
+        <w:keepLines w:val="0"/>
         <w:widowControl/>
         <w:spacing w:after="0" w:before="0" w:line="240" w:lineRule="auto"/>
         <w:ind w:firstLine="0" w:left="142" w:right="85"/>
@@ -2967,25 +2971,144 @@
       </w:pPr>
       <w:r>
         <w:rPr>
-          <w:rFonts w:ascii="Times New Roman" w:hAnsi="Times New Roman"/>
-          <w:b w:val="0"/>
-          <w:sz w:val="26"/>
-        </w:rPr>
-        <w:t>&lt;/p&gt;</w:t>
+          <w:rFonts w:ascii="Consolas" w:hAnsi="Consolas"/>
+          <w:sz w:val="17"/>
+        </w:rPr>
+        <w:t>&lt;option value="compact"&gt;Gọn&lt;/option&gt;</w:t>
       </w:r>
     </w:p>
     <w:p>
       <w:pPr>
+        <w:keepNext w:val="0"/>
+        <w:keepLines w:val="0"/>
         <w:widowControl/>
-        <w:spacing w:after="120" w:before="0" w:line="240" w:lineRule="auto"/>
+        <w:spacing w:after="0" w:before="0" w:line="240" w:lineRule="auto"/>
         <w:ind w:firstLine="0" w:left="142" w:right="85"/>
         <w:jc w:val="left"/>
       </w:pPr>
       <w:r>
         <w:rPr>
-          <w:rFonts w:ascii="Times New Roman" w:hAnsi="Times New Roman"/>
-          <w:b w:val="0"/>
-          <w:sz w:val="26"/>
+          <w:rFonts w:ascii="Consolas" w:hAnsi="Consolas"/>
+          <w:sz w:val="17"/>
+        </w:rPr>
+        <w:t>&lt;option value="full"&gt;Đầy đủ&lt;/option&gt;</w:t>
+      </w:r>
+    </w:p>
+    <w:p>
+      <w:pPr>
+        <w:keepNext w:val="0"/>
+        <w:keepLines w:val="0"/>
+        <w:widowControl/>
+        <w:spacing w:after="0" w:before="0" w:line="240" w:lineRule="auto"/>
+        <w:ind w:firstLine="0" w:left="142" w:right="85"/>
+        <w:jc w:val="left"/>
+      </w:pPr>
+      <w:r>
+        <w:rPr>
+          <w:rFonts w:ascii="Consolas" w:hAnsi="Consolas"/>
+          <w:sz w:val="17"/>
+        </w:rPr>
+        <w:t>&lt;/select&gt;</w:t>
+      </w:r>
+    </w:p>
+    <w:p>
+      <w:pPr>
+        <w:keepNext w:val="0"/>
+        <w:keepLines w:val="0"/>
+        <w:widowControl/>
+        <w:spacing w:after="0" w:before="0" w:line="240" w:lineRule="auto"/>
+        <w:ind w:firstLine="0" w:left="142" w:right="85"/>
+        <w:jc w:val="left"/>
+      </w:pPr>
+      <w:r>
+        <w:rPr>
+          <w:rFonts w:ascii="Consolas" w:hAnsi="Consolas"/>
+          <w:sz w:val="17"/>
+        </w:rPr>
+        <w:t>&lt;/label&gt;</w:t>
+      </w:r>
+    </w:p>
+    <w:p>
+      <w:pPr>
+        <w:keepNext w:val="0"/>
+        <w:keepLines w:val="0"/>
+        <w:widowControl/>
+        <w:spacing w:after="0" w:before="0" w:line="240" w:lineRule="auto"/>
+        <w:ind w:firstLine="0" w:left="142" w:right="85"/>
+        <w:jc w:val="left"/>
+      </w:pPr>
+      <w:r>
+        <w:rPr>
+          <w:rFonts w:ascii="Consolas" w:hAnsi="Consolas"/>
+          <w:sz w:val="17"/>
+        </w:rPr>
+        <w:t>&lt;button class="button-secondary"&gt;Lưu tùy chọn&lt;/button&gt;</w:t>
+      </w:r>
+    </w:p>
+    <w:p>
+      <w:pPr>
+        <w:keepNext w:val="0"/>
+        <w:keepLines w:val="0"/>
+        <w:widowControl/>
+        <w:spacing w:after="0" w:before="0" w:line="240" w:lineRule="auto"/>
+        <w:ind w:firstLine="0" w:left="142" w:right="85"/>
+        <w:jc w:val="left"/>
+      </w:pPr>
+      <w:r>
+        <w:rPr>
+          <w:rFonts w:ascii="Consolas" w:hAnsi="Consolas"/>
+          <w:sz w:val="17"/>
+        </w:rPr>
+        <w:t>&lt;/form&gt;</w:t>
+      </w:r>
+    </w:p>
+    <w:p>
+      <w:pPr>
+        <w:keepNext w:val="0"/>
+        <w:keepLines w:val="0"/>
+        <w:widowControl/>
+        <w:spacing w:after="0" w:before="0" w:line="240" w:lineRule="auto"/>
+        <w:ind w:firstLine="0" w:left="142" w:right="85"/>
+        <w:jc w:val="left"/>
+      </w:pPr>
+      <w:r>
+        <w:rPr>
+          <w:rFonts w:ascii="Consolas" w:hAnsi="Consolas"/>
+          <w:sz w:val="17"/>
+        </w:rPr>
+        <w:t>&lt;p class="cookie-status"&gt;Tùy chọn Cookie: &lt;?= e(field($_COOKIE, 'view')) ?&gt;</w:t>
+      </w:r>
+    </w:p>
+    <w:p>
+      <w:pPr>
+        <w:keepNext w:val="0"/>
+        <w:keepLines w:val="0"/>
+        <w:widowControl/>
+        <w:spacing w:after="0" w:before="0" w:line="240" w:lineRule="auto"/>
+        <w:ind w:firstLine="0" w:left="142" w:right="85"/>
+        <w:jc w:val="left"/>
+      </w:pPr>
+      <w:r>
+        <w:rPr>
+          <w:rFonts w:ascii="Consolas" w:hAnsi="Consolas"/>
+          <w:sz w:val="17"/>
+        </w:rPr>
+        <w:t>&lt;/p&gt;</w:t>
+      </w:r>
+    </w:p>
+    <w:p>
+      <w:pPr>
+        <w:keepNext w:val="0"/>
+        <w:keepLines w:val="0"/>
+        <w:widowControl/>
+        <w:spacing w:after="0" w:before="0" w:line="240" w:lineRule="auto"/>
+        <w:ind w:firstLine="0" w:left="142" w:right="85"/>
+        <w:jc w:val="left"/>
+      </w:pPr>
+      <w:r>
+        <w:rPr>
+          <w:rFonts w:ascii="Consolas" w:hAnsi="Consolas"/>
+          <w:sz w:val="17"/>
         </w:rPr>
         <w:t>&lt;?php require __DIR__.'/../templates/footer.php'; ?&gt;</w:t>
       </w:r>
@@ -3167,8 +3290,8 @@
     </w:p>
     <w:p>
       <w:pPr>
-        <w:keepNext/>
-        <w:keepLines/>
+        <w:keepNext w:val="0"/>
+        <w:keepLines w:val="0"/>
         <w:widowControl/>
         <w:spacing w:after="0" w:before="0" w:line="240" w:lineRule="auto"/>
         <w:ind w:firstLine="0" w:left="142" w:right="85"/>
@@ -3176,17 +3299,16 @@
       </w:pPr>
       <w:r>
         <w:rPr>
-          <w:rFonts w:ascii="Times New Roman" w:hAnsi="Times New Roman"/>
-          <w:b w:val="0"/>
-          <w:sz w:val="26"/>
+          <w:rFonts w:ascii="Consolas" w:hAnsi="Consolas"/>
+          <w:sz w:val="17"/>
         </w:rPr>
         <w:t>&lt;?php</w:t>
       </w:r>
     </w:p>
     <w:p>
       <w:pPr>
-        <w:keepNext/>
-        <w:keepLines/>
+        <w:keepNext w:val="0"/>
+        <w:keepLines w:val="0"/>
         <w:widowControl/>
         <w:spacing w:after="0" w:before="0" w:line="240" w:lineRule="auto"/>
         <w:ind w:firstLine="0" w:left="142" w:right="85"/>
@@ -3194,17 +3316,16 @@
       </w:pPr>
       <w:r>
         <w:rPr>
-          <w:rFonts w:ascii="Times New Roman" w:hAnsi="Times New Roman"/>
-          <w:b w:val="0"/>
-          <w:sz w:val="26"/>
+          <w:rFonts w:ascii="Consolas" w:hAnsi="Consolas"/>
+          <w:sz w:val="17"/>
         </w:rPr>
         <w:t>require __DIR__.'/../src/Session.php';</w:t>
       </w:r>
     </w:p>
     <w:p>
       <w:pPr>
-        <w:keepNext/>
-        <w:keepLines/>
+        <w:keepNext w:val="0"/>
+        <w:keepLines w:val="0"/>
         <w:widowControl/>
         <w:spacing w:after="0" w:before="0" w:line="240" w:lineRule="auto"/>
         <w:ind w:firstLine="0" w:left="142" w:right="85"/>
@@ -3212,17 +3333,16 @@
       </w:pPr>
       <w:r>
         <w:rPr>
-          <w:rFonts w:ascii="Times New Roman" w:hAnsi="Times New Roman"/>
-          <w:b w:val="0"/>
-          <w:sz w:val="26"/>
+          <w:rFonts w:ascii="Consolas" w:hAnsi="Consolas"/>
+          <w:sz w:val="17"/>
         </w:rPr>
         <w:t>require __DIR__.'/../src/Input.php';</w:t>
       </w:r>
     </w:p>
     <w:p>
       <w:pPr>
-        <w:keepNext/>
-        <w:keepLines/>
+        <w:keepNext w:val="0"/>
+        <w:keepLines w:val="0"/>
         <w:widowControl/>
         <w:spacing w:after="0" w:before="0" w:line="240" w:lineRule="auto"/>
         <w:ind w:firstLine="0" w:left="142" w:right="85"/>
@@ -3230,17 +3350,16 @@
       </w:pPr>
       <w:r>
         <w:rPr>
-          <w:rFonts w:ascii="Times New Roman" w:hAnsi="Times New Roman"/>
-          <w:b w:val="0"/>
-          <w:sz w:val="26"/>
+          <w:rFonts w:ascii="Consolas" w:hAnsi="Consolas"/>
+          <w:sz w:val="17"/>
         </w:rPr>
         <w:t>require __DIR__.'/../src/Draft.php';</w:t>
       </w:r>
     </w:p>
     <w:p>
       <w:pPr>
-        <w:keepNext/>
-        <w:keepLines/>
+        <w:keepNext w:val="0"/>
+        <w:keepLines w:val="0"/>
         <w:widowControl/>
         <w:spacing w:after="0" w:before="0" w:line="240" w:lineRule="auto"/>
         <w:ind w:firstLine="0" w:left="142" w:right="85"/>
@@ -3248,17 +3367,16 @@
       </w:pPr>
       <w:r>
         <w:rPr>
-          <w:rFonts w:ascii="Times New Roman" w:hAnsi="Times New Roman"/>
-          <w:b w:val="0"/>
-          <w:sz w:val="26"/>
+          <w:rFonts w:ascii="Consolas" w:hAnsi="Consolas"/>
+          <w:sz w:val="17"/>
         </w:rPr>
         <w:t>if (draftExpired($_SESSION, time(), 1800)) {</w:t>
       </w:r>
     </w:p>
     <w:p>
       <w:pPr>
-        <w:keepNext/>
-        <w:keepLines/>
+        <w:keepNext w:val="0"/>
+        <w:keepLines w:val="0"/>
         <w:widowControl/>
         <w:spacing w:after="0" w:before="0" w:line="240" w:lineRule="auto"/>
         <w:ind w:firstLine="0" w:left="142" w:right="85"/>
@@ -3266,17 +3384,16 @@
       </w:pPr>
       <w:r>
         <w:rPr>
-          <w:rFonts w:ascii="Times New Roman" w:hAnsi="Times New Roman"/>
-          <w:b w:val="0"/>
-          <w:sz w:val="26"/>
+          <w:rFonts w:ascii="Consolas" w:hAnsi="Consolas"/>
+          <w:sz w:val="17"/>
         </w:rPr>
         <w:t xml:space="preserve">    cancelDraft($_SESSION);</w:t>
       </w:r>
     </w:p>
     <w:p>
       <w:pPr>
-        <w:keepNext/>
-        <w:keepLines/>
+        <w:keepNext w:val="0"/>
+        <w:keepLines w:val="0"/>
         <w:widowControl/>
         <w:spacing w:after="0" w:before="0" w:line="240" w:lineRule="auto"/>
         <w:ind w:firstLine="0" w:left="142" w:right="85"/>
@@ -3284,17 +3401,16 @@
       </w:pPr>
       <w:r>
         <w:rPr>
-          <w:rFonts w:ascii="Times New Roman" w:hAnsi="Times New Roman"/>
-          <w:b w:val="0"/>
-          <w:sz w:val="26"/>
+          <w:rFonts w:ascii="Consolas" w:hAnsi="Consolas"/>
+          <w:sz w:val="17"/>
         </w:rPr>
         <w:t xml:space="preserve">    header('Location: /register.php', true, 303); exit;</w:t>
       </w:r>
     </w:p>
     <w:p>
       <w:pPr>
-        <w:keepNext/>
-        <w:keepLines/>
+        <w:keepNext w:val="0"/>
+        <w:keepLines w:val="0"/>
         <w:widowControl/>
         <w:spacing w:after="0" w:before="0" w:line="240" w:lineRule="auto"/>
         <w:ind w:firstLine="0" w:left="142" w:right="85"/>
@@ -3302,17 +3418,16 @@
       </w:pPr>
       <w:r>
         <w:rPr>
-          <w:rFonts w:ascii="Times New Roman" w:hAnsi="Times New Roman"/>
-          <w:b w:val="0"/>
-          <w:sz w:val="26"/>
+          <w:rFonts w:ascii="Consolas" w:hAnsi="Consolas"/>
+          <w:sz w:val="17"/>
         </w:rPr>
         <w:t>}</w:t>
       </w:r>
     </w:p>
     <w:p>
       <w:pPr>
-        <w:keepNext/>
-        <w:keepLines/>
+        <w:keepNext w:val="0"/>
+        <w:keepLines w:val="0"/>
         <w:widowControl/>
         <w:spacing w:after="0" w:before="0" w:line="240" w:lineRule="auto"/>
         <w:ind w:firstLine="0" w:left="142" w:right="85"/>
@@ -3320,17 +3435,16 @@
       </w:pPr>
       <w:r>
         <w:rPr>
-          <w:rFonts w:ascii="Times New Roman" w:hAnsi="Times New Roman"/>
-          <w:b w:val="0"/>
-          <w:sz w:val="26"/>
+          <w:rFonts w:ascii="Consolas" w:hAnsi="Consolas"/>
+          <w:sz w:val="17"/>
         </w:rPr>
         <w:t>$data = $_SESSION['draft']['data'];</w:t>
       </w:r>
     </w:p>
     <w:p>
       <w:pPr>
-        <w:keepNext/>
-        <w:keepLines/>
+        <w:keepNext w:val="0"/>
+        <w:keepLines w:val="0"/>
         <w:widowControl/>
         <w:spacing w:after="0" w:before="0" w:line="240" w:lineRule="auto"/>
         <w:ind w:firstLine="0" w:left="142" w:right="85"/>
@@ -3338,17 +3452,16 @@
       </w:pPr>
       <w:r>
         <w:rPr>
-          <w:rFonts w:ascii="Times New Roman" w:hAnsi="Times New Roman"/>
-          <w:b w:val="0"/>
-          <w:sz w:val="26"/>
+          <w:rFonts w:ascii="Consolas" w:hAnsi="Consolas"/>
+          <w:sz w:val="17"/>
         </w:rPr>
         <w:t>require __DIR__.'/../templates/header.php';</w:t>
       </w:r>
     </w:p>
     <w:p>
       <w:pPr>
-        <w:keepNext/>
-        <w:keepLines/>
+        <w:keepNext w:val="0"/>
+        <w:keepLines w:val="0"/>
         <w:widowControl/>
         <w:spacing w:after="0" w:before="0" w:line="240" w:lineRule="auto"/>
         <w:ind w:firstLine="0" w:left="142" w:right="85"/>
@@ -3356,17 +3469,16 @@
       </w:pPr>
       <w:r>
         <w:rPr>
-          <w:rFonts w:ascii="Times New Roman" w:hAnsi="Times New Roman"/>
-          <w:b w:val="0"/>
-          <w:sz w:val="26"/>
+          <w:rFonts w:ascii="Consolas" w:hAnsi="Consolas"/>
+          <w:sz w:val="17"/>
         </w:rPr>
         <w:t>?&gt;</w:t>
       </w:r>
     </w:p>
     <w:p>
       <w:pPr>
-        <w:keepNext/>
-        <w:keepLines/>
+        <w:keepNext w:val="0"/>
+        <w:keepLines w:val="0"/>
         <w:widowControl/>
         <w:spacing w:after="0" w:before="0" w:line="240" w:lineRule="auto"/>
         <w:ind w:firstLine="0" w:left="142" w:right="85"/>
@@ -3374,17 +3486,16 @@
       </w:pPr>
       <w:r>
         <w:rPr>
-          <w:rFonts w:ascii="Times New Roman" w:hAnsi="Times New Roman"/>
-          <w:b w:val="0"/>
-          <w:sz w:val="26"/>
-        </w:rPr>
-        <w:t>&lt;h2&gt;Bước 2. Xác nhận&lt;/h2&gt;</w:t>
+          <w:rFonts w:ascii="Consolas" w:hAnsi="Consolas"/>
+          <w:sz w:val="17"/>
+        </w:rPr>
+        <w:t>&lt;div class="page-heading"&gt;</w:t>
       </w:r>
     </w:p>
     <w:p>
       <w:pPr>
-        <w:keepNext/>
-        <w:keepLines/>
+        <w:keepNext w:val="0"/>
+        <w:keepLines w:val="0"/>
         <w:widowControl/>
         <w:spacing w:after="0" w:before="0" w:line="240" w:lineRule="auto"/>
         <w:ind w:firstLine="0" w:left="142" w:right="85"/>
@@ -3392,17 +3503,16 @@
       </w:pPr>
       <w:r>
         <w:rPr>
-          <w:rFonts w:ascii="Times New Roman" w:hAnsi="Times New Roman"/>
-          <w:b w:val="0"/>
-          <w:sz w:val="26"/>
-        </w:rPr>
-        <w:t>&lt;p&gt;</w:t>
+          <w:rFonts w:ascii="Consolas" w:hAnsi="Consolas"/>
+          <w:sz w:val="17"/>
+        </w:rPr>
+        <w:t>&lt;h1&gt;Bước 2. Xác nhận&lt;/h1&gt;</w:t>
       </w:r>
     </w:p>
     <w:p>
       <w:pPr>
-        <w:keepNext/>
-        <w:keepLines/>
+        <w:keepNext w:val="0"/>
+        <w:keepLines w:val="0"/>
         <w:widowControl/>
         <w:spacing w:after="0" w:before="0" w:line="240" w:lineRule="auto"/>
         <w:ind w:firstLine="0" w:left="142" w:right="85"/>
@@ -3410,17 +3520,16 @@
       </w:pPr>
       <w:r>
         <w:rPr>
-          <w:rFonts w:ascii="Times New Roman" w:hAnsi="Times New Roman"/>
-          <w:b w:val="0"/>
-          <w:sz w:val="26"/>
-        </w:rPr>
-        <w:t>&lt;?= e($data['name']) ?&gt; — &lt;?= e($data['email']) ?&gt;</w:t>
+          <w:rFonts w:ascii="Consolas" w:hAnsi="Consolas"/>
+          <w:sz w:val="17"/>
+        </w:rPr>
+        <w:t>&lt;p&gt;Đối chiếu thông tin trước khi xác nhận.&lt;/p&gt;</w:t>
       </w:r>
     </w:p>
     <w:p>
       <w:pPr>
-        <w:keepNext/>
-        <w:keepLines/>
+        <w:keepNext w:val="0"/>
+        <w:keepLines w:val="0"/>
         <w:widowControl/>
         <w:spacing w:after="0" w:before="0" w:line="240" w:lineRule="auto"/>
         <w:ind w:firstLine="0" w:left="142" w:right="85"/>
@@ -3428,17 +3537,16 @@
       </w:pPr>
       <w:r>
         <w:rPr>
-          <w:rFonts w:ascii="Times New Roman" w:hAnsi="Times New Roman"/>
-          <w:b w:val="0"/>
-          <w:sz w:val="26"/>
-        </w:rPr>
-        <w:t>&lt;/p&gt;</w:t>
+          <w:rFonts w:ascii="Consolas" w:hAnsi="Consolas"/>
+          <w:sz w:val="17"/>
+        </w:rPr>
+        <w:t>&lt;/div&gt;</w:t>
       </w:r>
     </w:p>
     <w:p>
       <w:pPr>
-        <w:keepNext/>
-        <w:keepLines/>
+        <w:keepNext w:val="0"/>
+        <w:keepLines w:val="0"/>
         <w:widowControl/>
         <w:spacing w:after="0" w:before="0" w:line="240" w:lineRule="auto"/>
         <w:ind w:firstLine="0" w:left="142" w:right="85"/>
@@ -3446,17 +3554,16 @@
       </w:pPr>
       <w:r>
         <w:rPr>
-          <w:rFonts w:ascii="Times New Roman" w:hAnsi="Times New Roman"/>
-          <w:b w:val="0"/>
-          <w:sz w:val="26"/>
-        </w:rPr>
-        <w:t>&lt;a href="/register.php"&gt;Sửa lại&lt;/a&gt;</w:t>
+          <w:rFonts w:ascii="Consolas" w:hAnsi="Consolas"/>
+          <w:sz w:val="17"/>
+        </w:rPr>
+        <w:t>&lt;section class="confirmation" aria-label="Thông tin đăng ký"&gt;</w:t>
       </w:r>
     </w:p>
     <w:p>
       <w:pPr>
-        <w:keepNext/>
-        <w:keepLines/>
+        <w:keepNext w:val="0"/>
+        <w:keepLines w:val="0"/>
         <w:widowControl/>
         <w:spacing w:after="0" w:before="0" w:line="240" w:lineRule="auto"/>
         <w:ind w:firstLine="0" w:left="142" w:right="85"/>
@@ -3464,17 +3571,16 @@
       </w:pPr>
       <w:r>
         <w:rPr>
-          <w:rFonts w:ascii="Times New Roman" w:hAnsi="Times New Roman"/>
-          <w:b w:val="0"/>
-          <w:sz w:val="26"/>
-        </w:rPr>
-        <w:t>&lt;form method="post" action="/complete.php"&gt;</w:t>
+          <w:rFonts w:ascii="Consolas" w:hAnsi="Consolas"/>
+          <w:sz w:val="17"/>
+        </w:rPr>
+        <w:t>&lt;dl class="summary-list"&gt;</w:t>
       </w:r>
     </w:p>
     <w:p>
       <w:pPr>
-        <w:keepNext/>
-        <w:keepLines/>
+        <w:keepNext w:val="0"/>
+        <w:keepLines w:val="0"/>
         <w:widowControl/>
         <w:spacing w:after="0" w:before="0" w:line="240" w:lineRule="auto"/>
         <w:ind w:firstLine="0" w:left="142" w:right="85"/>
@@ -3482,17 +3588,16 @@
       </w:pPr>
       <w:r>
         <w:rPr>
-          <w:rFonts w:ascii="Times New Roman" w:hAnsi="Times New Roman"/>
-          <w:b w:val="0"/>
-          <w:sz w:val="26"/>
-        </w:rPr>
-        <w:t>&lt;input type="hidden" name="csrf" value="&lt;?= e($_SESSION['csrf']) ?&gt;"&gt;</w:t>
+          <w:rFonts w:ascii="Consolas" w:hAnsi="Consolas"/>
+          <w:sz w:val="17"/>
+        </w:rPr>
+        <w:t>&lt;div&gt;</w:t>
       </w:r>
     </w:p>
     <w:p>
       <w:pPr>
-        <w:keepNext/>
-        <w:keepLines/>
+        <w:keepNext w:val="0"/>
+        <w:keepLines w:val="0"/>
         <w:widowControl/>
         <w:spacing w:after="0" w:before="0" w:line="240" w:lineRule="auto"/>
         <w:ind w:firstLine="0" w:left="142" w:right="85"/>
@@ -3500,17 +3605,16 @@
       </w:pPr>
       <w:r>
         <w:rPr>
-          <w:rFonts w:ascii="Times New Roman" w:hAnsi="Times New Roman"/>
-          <w:b w:val="0"/>
-          <w:sz w:val="26"/>
-        </w:rPr>
-        <w:t>&lt;button&gt;Xác nhận&lt;/button&gt;</w:t>
+          <w:rFonts w:ascii="Consolas" w:hAnsi="Consolas"/>
+          <w:sz w:val="17"/>
+        </w:rPr>
+        <w:t>&lt;dt&gt;Họ tên&lt;/dt&gt;</w:t>
       </w:r>
     </w:p>
     <w:p>
       <w:pPr>
-        <w:keepNext/>
-        <w:keepLines/>
+        <w:keepNext w:val="0"/>
+        <w:keepLines w:val="0"/>
         <w:widowControl/>
         <w:spacing w:after="0" w:before="0" w:line="240" w:lineRule="auto"/>
         <w:ind w:firstLine="0" w:left="142" w:right="85"/>
@@ -3518,17 +3622,16 @@
       </w:pPr>
       <w:r>
         <w:rPr>
-          <w:rFonts w:ascii="Times New Roman" w:hAnsi="Times New Roman"/>
-          <w:b w:val="0"/>
-          <w:sz w:val="26"/>
-        </w:rPr>
-        <w:t>&lt;/form&gt;</w:t>
+          <w:rFonts w:ascii="Consolas" w:hAnsi="Consolas"/>
+          <w:sz w:val="17"/>
+        </w:rPr>
+        <w:t>&lt;dd&gt;&lt;?= e($data['name']) ?&gt;&lt;/dd&gt;</w:t>
       </w:r>
     </w:p>
     <w:p>
       <w:pPr>
-        <w:keepNext/>
-        <w:keepLines/>
+        <w:keepNext w:val="0"/>
+        <w:keepLines w:val="0"/>
         <w:widowControl/>
         <w:spacing w:after="0" w:before="0" w:line="240" w:lineRule="auto"/>
         <w:ind w:firstLine="0" w:left="142" w:right="85"/>
@@ -3536,17 +3639,16 @@
       </w:pPr>
       <w:r>
         <w:rPr>
-          <w:rFonts w:ascii="Times New Roman" w:hAnsi="Times New Roman"/>
-          <w:b w:val="0"/>
-          <w:sz w:val="26"/>
-        </w:rPr>
-        <w:t>&lt;form method="post" action="/cancel.php"&gt;</w:t>
+          <w:rFonts w:ascii="Consolas" w:hAnsi="Consolas"/>
+          <w:sz w:val="17"/>
+        </w:rPr>
+        <w:t>&lt;/div&gt;</w:t>
       </w:r>
     </w:p>
     <w:p>
       <w:pPr>
-        <w:keepNext/>
-        <w:keepLines/>
+        <w:keepNext w:val="0"/>
+        <w:keepLines w:val="0"/>
         <w:widowControl/>
         <w:spacing w:after="0" w:before="0" w:line="240" w:lineRule="auto"/>
         <w:ind w:firstLine="0" w:left="142" w:right="85"/>
@@ -3554,17 +3656,16 @@
       </w:pPr>
       <w:r>
         <w:rPr>
-          <w:rFonts w:ascii="Times New Roman" w:hAnsi="Times New Roman"/>
-          <w:b w:val="0"/>
-          <w:sz w:val="26"/>
-        </w:rPr>
-        <w:t>&lt;input type="hidden" name="csrf" value="&lt;?= e($_SESSION['csrf']) ?&gt;"&gt;</w:t>
+          <w:rFonts w:ascii="Consolas" w:hAnsi="Consolas"/>
+          <w:sz w:val="17"/>
+        </w:rPr>
+        <w:t>&lt;div&gt;</w:t>
       </w:r>
     </w:p>
     <w:p>
       <w:pPr>
-        <w:keepNext/>
-        <w:keepLines/>
+        <w:keepNext w:val="0"/>
+        <w:keepLines w:val="0"/>
         <w:widowControl/>
         <w:spacing w:after="0" w:before="0" w:line="240" w:lineRule="auto"/>
         <w:ind w:firstLine="0" w:left="142" w:right="85"/>
@@ -3572,17 +3673,16 @@
       </w:pPr>
       <w:r>
         <w:rPr>
-          <w:rFonts w:ascii="Times New Roman" w:hAnsi="Times New Roman"/>
-          <w:b w:val="0"/>
-          <w:sz w:val="26"/>
-        </w:rPr>
-        <w:t>&lt;button&gt;Hủy bản nháp&lt;/button&gt;</w:t>
+          <w:rFonts w:ascii="Consolas" w:hAnsi="Consolas"/>
+          <w:sz w:val="17"/>
+        </w:rPr>
+        <w:t>&lt;dt&gt;Email&lt;/dt&gt;</w:t>
       </w:r>
     </w:p>
     <w:p>
       <w:pPr>
         <w:keepNext w:val="0"/>
-        <w:keepLines/>
+        <w:keepLines w:val="0"/>
         <w:widowControl/>
         <w:spacing w:after="0" w:before="0" w:line="240" w:lineRule="auto"/>
         <w:ind w:firstLine="0" w:left="142" w:right="85"/>
@@ -3590,25 +3690,263 @@
       </w:pPr>
       <w:r>
         <w:rPr>
-          <w:rFonts w:ascii="Times New Roman" w:hAnsi="Times New Roman"/>
-          <w:b w:val="0"/>
-          <w:sz w:val="26"/>
-        </w:rPr>
-        <w:t>&lt;/form&gt;</w:t>
+          <w:rFonts w:ascii="Consolas" w:hAnsi="Consolas"/>
+          <w:sz w:val="17"/>
+        </w:rPr>
+        <w:t>&lt;dd&gt;&lt;?= e($data['email']) ?&gt;&lt;/dd&gt;</w:t>
       </w:r>
     </w:p>
     <w:p>
       <w:pPr>
+        <w:keepNext w:val="0"/>
+        <w:keepLines w:val="0"/>
         <w:widowControl/>
-        <w:spacing w:after="120" w:before="0" w:line="240" w:lineRule="auto"/>
+        <w:spacing w:after="0" w:before="0" w:line="240" w:lineRule="auto"/>
         <w:ind w:firstLine="0" w:left="142" w:right="85"/>
         <w:jc w:val="left"/>
       </w:pPr>
       <w:r>
         <w:rPr>
-          <w:rFonts w:ascii="Times New Roman" w:hAnsi="Times New Roman"/>
-          <w:b w:val="0"/>
-          <w:sz w:val="26"/>
+          <w:rFonts w:ascii="Consolas" w:hAnsi="Consolas"/>
+          <w:sz w:val="17"/>
+        </w:rPr>
+        <w:t>&lt;/div&gt;</w:t>
+      </w:r>
+    </w:p>
+    <w:p>
+      <w:pPr>
+        <w:keepNext w:val="0"/>
+        <w:keepLines w:val="0"/>
+        <w:widowControl/>
+        <w:spacing w:after="0" w:before="0" w:line="240" w:lineRule="auto"/>
+        <w:ind w:firstLine="0" w:left="142" w:right="85"/>
+        <w:jc w:val="left"/>
+      </w:pPr>
+      <w:r>
+        <w:rPr>
+          <w:rFonts w:ascii="Consolas" w:hAnsi="Consolas"/>
+          <w:sz w:val="17"/>
+        </w:rPr>
+        <w:t>&lt;/dl&gt;</w:t>
+      </w:r>
+    </w:p>
+    <w:p>
+      <w:pPr>
+        <w:keepNext w:val="0"/>
+        <w:keepLines w:val="0"/>
+        <w:widowControl/>
+        <w:spacing w:after="0" w:before="0" w:line="240" w:lineRule="auto"/>
+        <w:ind w:firstLine="0" w:left="142" w:right="85"/>
+        <w:jc w:val="left"/>
+      </w:pPr>
+      <w:r>
+        <w:rPr>
+          <w:rFonts w:ascii="Consolas" w:hAnsi="Consolas"/>
+          <w:sz w:val="17"/>
+        </w:rPr>
+        <w:t>&lt;div class="confirmation-actions"&gt;</w:t>
+      </w:r>
+    </w:p>
+    <w:p>
+      <w:pPr>
+        <w:keepNext w:val="0"/>
+        <w:keepLines w:val="0"/>
+        <w:widowControl/>
+        <w:spacing w:after="0" w:before="0" w:line="240" w:lineRule="auto"/>
+        <w:ind w:firstLine="0" w:left="142" w:right="85"/>
+        <w:jc w:val="left"/>
+      </w:pPr>
+      <w:r>
+        <w:rPr>
+          <w:rFonts w:ascii="Consolas" w:hAnsi="Consolas"/>
+          <w:sz w:val="17"/>
+        </w:rPr>
+        <w:t>&lt;a href="/register.php"&gt;Sửa lại&lt;/a&gt;</w:t>
+      </w:r>
+    </w:p>
+    <w:p>
+      <w:pPr>
+        <w:keepNext w:val="0"/>
+        <w:keepLines w:val="0"/>
+        <w:widowControl/>
+        <w:spacing w:after="0" w:before="0" w:line="240" w:lineRule="auto"/>
+        <w:ind w:firstLine="0" w:left="142" w:right="85"/>
+        <w:jc w:val="left"/>
+      </w:pPr>
+      <w:r>
+        <w:rPr>
+          <w:rFonts w:ascii="Consolas" w:hAnsi="Consolas"/>
+          <w:sz w:val="17"/>
+        </w:rPr>
+        <w:t>&lt;form method="post" action="/complete.php"&gt;</w:t>
+      </w:r>
+    </w:p>
+    <w:p>
+      <w:pPr>
+        <w:keepNext w:val="0"/>
+        <w:keepLines w:val="0"/>
+        <w:widowControl/>
+        <w:spacing w:after="0" w:before="0" w:line="240" w:lineRule="auto"/>
+        <w:ind w:firstLine="0" w:left="142" w:right="85"/>
+        <w:jc w:val="left"/>
+      </w:pPr>
+      <w:r>
+        <w:rPr>
+          <w:rFonts w:ascii="Consolas" w:hAnsi="Consolas"/>
+          <w:sz w:val="17"/>
+        </w:rPr>
+        <w:t>&lt;input type="hidden" name="csrf" value="&lt;?= e($_SESSION['csrf']) ?&gt;"&gt;</w:t>
+      </w:r>
+    </w:p>
+    <w:p>
+      <w:pPr>
+        <w:keepNext w:val="0"/>
+        <w:keepLines w:val="0"/>
+        <w:widowControl/>
+        <w:spacing w:after="0" w:before="0" w:line="240" w:lineRule="auto"/>
+        <w:ind w:firstLine="0" w:left="142" w:right="85"/>
+        <w:jc w:val="left"/>
+      </w:pPr>
+      <w:r>
+        <w:rPr>
+          <w:rFonts w:ascii="Consolas" w:hAnsi="Consolas"/>
+          <w:sz w:val="17"/>
+        </w:rPr>
+        <w:t>&lt;button&gt;Xác nhận&lt;/button&gt;</w:t>
+      </w:r>
+    </w:p>
+    <w:p>
+      <w:pPr>
+        <w:keepNext w:val="0"/>
+        <w:keepLines w:val="0"/>
+        <w:widowControl/>
+        <w:spacing w:after="0" w:before="0" w:line="240" w:lineRule="auto"/>
+        <w:ind w:firstLine="0" w:left="142" w:right="85"/>
+        <w:jc w:val="left"/>
+      </w:pPr>
+      <w:r>
+        <w:rPr>
+          <w:rFonts w:ascii="Consolas" w:hAnsi="Consolas"/>
+          <w:sz w:val="17"/>
+        </w:rPr>
+        <w:t>&lt;/form&gt;</w:t>
+      </w:r>
+    </w:p>
+    <w:p>
+      <w:pPr>
+        <w:keepNext w:val="0"/>
+        <w:keepLines w:val="0"/>
+        <w:widowControl/>
+        <w:spacing w:after="0" w:before="0" w:line="240" w:lineRule="auto"/>
+        <w:ind w:firstLine="0" w:left="142" w:right="85"/>
+        <w:jc w:val="left"/>
+      </w:pPr>
+      <w:r>
+        <w:rPr>
+          <w:rFonts w:ascii="Consolas" w:hAnsi="Consolas"/>
+          <w:sz w:val="17"/>
+        </w:rPr>
+        <w:t>&lt;form method="post" action="/cancel.php"&gt;</w:t>
+      </w:r>
+    </w:p>
+    <w:p>
+      <w:pPr>
+        <w:keepNext w:val="0"/>
+        <w:keepLines w:val="0"/>
+        <w:widowControl/>
+        <w:spacing w:after="0" w:before="0" w:line="240" w:lineRule="auto"/>
+        <w:ind w:firstLine="0" w:left="142" w:right="85"/>
+        <w:jc w:val="left"/>
+      </w:pPr>
+      <w:r>
+        <w:rPr>
+          <w:rFonts w:ascii="Consolas" w:hAnsi="Consolas"/>
+          <w:sz w:val="17"/>
+        </w:rPr>
+        <w:t>&lt;input type="hidden" name="csrf" value="&lt;?= e($_SESSION['csrf']) ?&gt;"&gt;</w:t>
+      </w:r>
+    </w:p>
+    <w:p>
+      <w:pPr>
+        <w:keepNext w:val="0"/>
+        <w:keepLines w:val="0"/>
+        <w:widowControl/>
+        <w:spacing w:after="0" w:before="0" w:line="240" w:lineRule="auto"/>
+        <w:ind w:firstLine="0" w:left="142" w:right="85"/>
+        <w:jc w:val="left"/>
+      </w:pPr>
+      <w:r>
+        <w:rPr>
+          <w:rFonts w:ascii="Consolas" w:hAnsi="Consolas"/>
+          <w:sz w:val="17"/>
+        </w:rPr>
+        <w:t>&lt;button class="button-secondary button-cancel"&gt;Hủy bản nháp&lt;/button&gt;</w:t>
+      </w:r>
+    </w:p>
+    <w:p>
+      <w:pPr>
+        <w:keepNext w:val="0"/>
+        <w:keepLines w:val="0"/>
+        <w:widowControl/>
+        <w:spacing w:after="0" w:before="0" w:line="240" w:lineRule="auto"/>
+        <w:ind w:firstLine="0" w:left="142" w:right="85"/>
+        <w:jc w:val="left"/>
+      </w:pPr>
+      <w:r>
+        <w:rPr>
+          <w:rFonts w:ascii="Consolas" w:hAnsi="Consolas"/>
+          <w:sz w:val="17"/>
+        </w:rPr>
+        <w:t>&lt;/form&gt;</w:t>
+      </w:r>
+    </w:p>
+    <w:p>
+      <w:pPr>
+        <w:keepNext w:val="0"/>
+        <w:keepLines w:val="0"/>
+        <w:widowControl/>
+        <w:spacing w:after="0" w:before="0" w:line="240" w:lineRule="auto"/>
+        <w:ind w:firstLine="0" w:left="142" w:right="85"/>
+        <w:jc w:val="left"/>
+      </w:pPr>
+      <w:r>
+        <w:rPr>
+          <w:rFonts w:ascii="Consolas" w:hAnsi="Consolas"/>
+          <w:sz w:val="17"/>
+        </w:rPr>
+        <w:t>&lt;/div&gt;</w:t>
+      </w:r>
+    </w:p>
+    <w:p>
+      <w:pPr>
+        <w:keepNext w:val="0"/>
+        <w:keepLines w:val="0"/>
+        <w:widowControl/>
+        <w:spacing w:after="0" w:before="0" w:line="240" w:lineRule="auto"/>
+        <w:ind w:firstLine="0" w:left="142" w:right="85"/>
+        <w:jc w:val="left"/>
+      </w:pPr>
+      <w:r>
+        <w:rPr>
+          <w:rFonts w:ascii="Consolas" w:hAnsi="Consolas"/>
+          <w:sz w:val="17"/>
+        </w:rPr>
+        <w:t>&lt;/section&gt;</w:t>
+      </w:r>
+    </w:p>
+    <w:p>
+      <w:pPr>
+        <w:keepNext w:val="0"/>
+        <w:keepLines w:val="0"/>
+        <w:widowControl/>
+        <w:spacing w:after="0" w:before="0" w:line="240" w:lineRule="auto"/>
+        <w:ind w:firstLine="0" w:left="142" w:right="85"/>
+        <w:jc w:val="left"/>
+      </w:pPr>
+      <w:r>
+        <w:rPr>
+          <w:rFonts w:ascii="Consolas" w:hAnsi="Consolas"/>
+          <w:sz w:val="17"/>
         </w:rPr>
         <w:t>&lt;?php require __DIR__.'/../templates/footer.php'; ?&gt;</w:t>
       </w:r>
@@ -3749,8 +4087,8 @@
     </w:p>
     <w:p>
       <w:pPr>
-        <w:keepNext/>
-        <w:keepLines/>
+        <w:keepNext w:val="0"/>
+        <w:keepLines w:val="0"/>
         <w:widowControl/>
         <w:spacing w:after="0" w:before="0" w:line="240" w:lineRule="auto"/>
         <w:ind w:firstLine="0" w:left="142" w:right="85"/>
@@ -3758,17 +4096,16 @@
       </w:pPr>
       <w:r>
         <w:rPr>
-          <w:rFonts w:ascii="Times New Roman" w:hAnsi="Times New Roman"/>
-          <w:b w:val="0"/>
-          <w:sz w:val="26"/>
+          <w:rFonts w:ascii="Consolas" w:hAnsi="Consolas"/>
+          <w:sz w:val="17"/>
         </w:rPr>
         <w:t>&lt;?php</w:t>
       </w:r>
     </w:p>
     <w:p>
       <w:pPr>
-        <w:keepNext/>
-        <w:keepLines/>
+        <w:keepNext w:val="0"/>
+        <w:keepLines w:val="0"/>
         <w:widowControl/>
         <w:spacing w:after="0" w:before="0" w:line="240" w:lineRule="auto"/>
         <w:ind w:firstLine="0" w:left="142" w:right="85"/>
@@ -3776,17 +4113,16 @@
       </w:pPr>
       <w:r>
         <w:rPr>
-          <w:rFonts w:ascii="Times New Roman" w:hAnsi="Times New Roman"/>
-          <w:b w:val="0"/>
-          <w:sz w:val="26"/>
+          <w:rFonts w:ascii="Consolas" w:hAnsi="Consolas"/>
+          <w:sz w:val="17"/>
         </w:rPr>
         <w:t>require __DIR__.'/../src/Session.php';</w:t>
       </w:r>
     </w:p>
     <w:p>
       <w:pPr>
-        <w:keepNext/>
-        <w:keepLines/>
+        <w:keepNext w:val="0"/>
+        <w:keepLines w:val="0"/>
         <w:widowControl/>
         <w:spacing w:after="0" w:before="0" w:line="240" w:lineRule="auto"/>
         <w:ind w:firstLine="0" w:left="142" w:right="85"/>
@@ -3794,17 +4130,16 @@
       </w:pPr>
       <w:r>
         <w:rPr>
-          <w:rFonts w:ascii="Times New Roman" w:hAnsi="Times New Roman"/>
-          <w:b w:val="0"/>
-          <w:sz w:val="26"/>
+          <w:rFonts w:ascii="Consolas" w:hAnsi="Consolas"/>
+          <w:sz w:val="17"/>
         </w:rPr>
         <w:t>require __DIR__.'/../src/Input.php';</w:t>
       </w:r>
     </w:p>
     <w:p>
       <w:pPr>
-        <w:keepNext/>
-        <w:keepLines/>
+        <w:keepNext w:val="0"/>
+        <w:keepLines w:val="0"/>
         <w:widowControl/>
         <w:spacing w:after="0" w:before="0" w:line="240" w:lineRule="auto"/>
         <w:ind w:firstLine="0" w:left="142" w:right="85"/>
@@ -3812,17 +4147,16 @@
       </w:pPr>
       <w:r>
         <w:rPr>
-          <w:rFonts w:ascii="Times New Roman" w:hAnsi="Times New Roman"/>
-          <w:b w:val="0"/>
-          <w:sz w:val="26"/>
+          <w:rFonts w:ascii="Consolas" w:hAnsi="Consolas"/>
+          <w:sz w:val="17"/>
         </w:rPr>
         <w:t>require __DIR__.'/../src/Draft.php';</w:t>
       </w:r>
     </w:p>
     <w:p>
       <w:pPr>
-        <w:keepNext/>
-        <w:keepLines/>
+        <w:keepNext w:val="0"/>
+        <w:keepLines w:val="0"/>
         <w:widowControl/>
         <w:spacing w:after="0" w:before="0" w:line="240" w:lineRule="auto"/>
         <w:ind w:firstLine="0" w:left="142" w:right="85"/>
@@ -3830,17 +4164,16 @@
       </w:pPr>
       <w:r>
         <w:rPr>
-          <w:rFonts w:ascii="Times New Roman" w:hAnsi="Times New Roman"/>
-          <w:b w:val="0"/>
-          <w:sz w:val="26"/>
+          <w:rFonts w:ascii="Consolas" w:hAnsi="Consolas"/>
+          <w:sz w:val="17"/>
         </w:rPr>
         <w:t>if ($_SERVER['REQUEST_METHOD'] === 'POST') {</w:t>
       </w:r>
     </w:p>
     <w:p>
       <w:pPr>
-        <w:keepNext/>
-        <w:keepLines/>
+        <w:keepNext w:val="0"/>
+        <w:keepLines w:val="0"/>
         <w:widowControl/>
         <w:spacing w:after="0" w:before="0" w:line="240" w:lineRule="auto"/>
         <w:ind w:firstLine="0" w:left="142" w:right="85"/>
@@ -3848,17 +4181,16 @@
       </w:pPr>
       <w:r>
         <w:rPr>
-          <w:rFonts w:ascii="Times New Roman" w:hAnsi="Times New Roman"/>
-          <w:b w:val="0"/>
-          <w:sz w:val="26"/>
+          <w:rFonts w:ascii="Consolas" w:hAnsi="Consolas"/>
+          <w:sz w:val="17"/>
         </w:rPr>
         <w:t xml:space="preserve">    checkCsrf($_POST);</w:t>
       </w:r>
     </w:p>
     <w:p>
       <w:pPr>
-        <w:keepNext/>
-        <w:keepLines/>
+        <w:keepNext w:val="0"/>
+        <w:keepLines w:val="0"/>
         <w:widowControl/>
         <w:spacing w:after="0" w:before="0" w:line="240" w:lineRule="auto"/>
         <w:ind w:firstLine="0" w:left="142" w:right="85"/>
@@ -3866,17 +4198,16 @@
       </w:pPr>
       <w:r>
         <w:rPr>
-          <w:rFonts w:ascii="Times New Roman" w:hAnsi="Times New Roman"/>
-          <w:b w:val="0"/>
-          <w:sz w:val="26"/>
+          <w:rFonts w:ascii="Consolas" w:hAnsi="Consolas"/>
+          <w:sz w:val="17"/>
         </w:rPr>
         <w:t xml:space="preserve">    if (draftExpired($_SESSION, time(), 1800)) {</w:t>
       </w:r>
     </w:p>
     <w:p>
       <w:pPr>
-        <w:keepNext/>
-        <w:keepLines/>
+        <w:keepNext w:val="0"/>
+        <w:keepLines w:val="0"/>
         <w:widowControl/>
         <w:spacing w:after="0" w:before="0" w:line="240" w:lineRule="auto"/>
         <w:ind w:firstLine="0" w:left="142" w:right="85"/>
@@ -3884,17 +4215,16 @@
       </w:pPr>
       <w:r>
         <w:rPr>
-          <w:rFonts w:ascii="Times New Roman" w:hAnsi="Times New Roman"/>
-          <w:b w:val="0"/>
-          <w:sz w:val="26"/>
+          <w:rFonts w:ascii="Consolas" w:hAnsi="Consolas"/>
+          <w:sz w:val="17"/>
         </w:rPr>
         <w:t xml:space="preserve">        cancelDraft($_SESSION);</w:t>
       </w:r>
     </w:p>
     <w:p>
       <w:pPr>
-        <w:keepNext/>
-        <w:keepLines/>
+        <w:keepNext w:val="0"/>
+        <w:keepLines w:val="0"/>
         <w:widowControl/>
         <w:spacing w:after="0" w:before="0" w:line="240" w:lineRule="auto"/>
         <w:ind w:firstLine="0" w:left="142" w:right="85"/>
@@ -3902,17 +4232,16 @@
       </w:pPr>
       <w:r>
         <w:rPr>
-          <w:rFonts w:ascii="Times New Roman" w:hAnsi="Times New Roman"/>
-          <w:b w:val="0"/>
-          <w:sz w:val="26"/>
+          <w:rFonts w:ascii="Consolas" w:hAnsi="Consolas"/>
+          <w:sz w:val="17"/>
         </w:rPr>
         <w:t xml:space="preserve">        header('Location: /register.php', true, 303); exit;</w:t>
       </w:r>
     </w:p>
     <w:p>
       <w:pPr>
-        <w:keepNext/>
-        <w:keepLines/>
+        <w:keepNext w:val="0"/>
+        <w:keepLines w:val="0"/>
         <w:widowControl/>
         <w:spacing w:after="0" w:before="0" w:line="240" w:lineRule="auto"/>
         <w:ind w:firstLine="0" w:left="142" w:right="85"/>
@@ -3920,17 +4249,16 @@
       </w:pPr>
       <w:r>
         <w:rPr>
-          <w:rFonts w:ascii="Times New Roman" w:hAnsi="Times New Roman"/>
-          <w:b w:val="0"/>
-          <w:sz w:val="26"/>
+          <w:rFonts w:ascii="Consolas" w:hAnsi="Consolas"/>
+          <w:sz w:val="17"/>
         </w:rPr>
         <w:t xml:space="preserve">    }</w:t>
       </w:r>
     </w:p>
     <w:p>
       <w:pPr>
-        <w:keepNext/>
-        <w:keepLines/>
+        <w:keepNext w:val="0"/>
+        <w:keepLines w:val="0"/>
         <w:widowControl/>
         <w:spacing w:after="0" w:before="0" w:line="240" w:lineRule="auto"/>
         <w:ind w:firstLine="0" w:left="142" w:right="85"/>
@@ -3938,17 +4266,16 @@
       </w:pPr>
       <w:r>
         <w:rPr>
-          <w:rFonts w:ascii="Times New Roman" w:hAnsi="Times New Roman"/>
-          <w:b w:val="0"/>
-          <w:sz w:val="26"/>
+          <w:rFonts w:ascii="Consolas" w:hAnsi="Consolas"/>
+          <w:sz w:val="17"/>
         </w:rPr>
         <w:t xml:space="preserve">    $_SESSION['completed'] = 'SIMULATED_OK';</w:t>
       </w:r>
     </w:p>
     <w:p>
       <w:pPr>
-        <w:keepNext/>
-        <w:keepLines/>
+        <w:keepNext w:val="0"/>
+        <w:keepLines w:val="0"/>
         <w:widowControl/>
         <w:spacing w:after="0" w:before="0" w:line="240" w:lineRule="auto"/>
         <w:ind w:firstLine="0" w:left="142" w:right="85"/>
@@ -3956,17 +4283,16 @@
       </w:pPr>
       <w:r>
         <w:rPr>
-          <w:rFonts w:ascii="Times New Roman" w:hAnsi="Times New Roman"/>
-          <w:b w:val="0"/>
-          <w:sz w:val="26"/>
+          <w:rFonts w:ascii="Consolas" w:hAnsi="Consolas"/>
+          <w:sz w:val="17"/>
         </w:rPr>
         <w:t xml:space="preserve">    cancelDraft($_SESSION);</w:t>
       </w:r>
     </w:p>
     <w:p>
       <w:pPr>
-        <w:keepNext/>
-        <w:keepLines/>
+        <w:keepNext w:val="0"/>
+        <w:keepLines w:val="0"/>
         <w:widowControl/>
         <w:spacing w:after="0" w:before="0" w:line="240" w:lineRule="auto"/>
         <w:ind w:firstLine="0" w:left="142" w:right="85"/>
@@ -3974,17 +4300,16 @@
       </w:pPr>
       <w:r>
         <w:rPr>
-          <w:rFonts w:ascii="Times New Roman" w:hAnsi="Times New Roman"/>
-          <w:b w:val="0"/>
-          <w:sz w:val="26"/>
+          <w:rFonts w:ascii="Consolas" w:hAnsi="Consolas"/>
+          <w:sz w:val="17"/>
         </w:rPr>
         <w:t xml:space="preserve">    header('Location: /complete.php', true, 303); exit;</w:t>
       </w:r>
     </w:p>
     <w:p>
       <w:pPr>
-        <w:keepNext/>
-        <w:keepLines/>
+        <w:keepNext w:val="0"/>
+        <w:keepLines w:val="0"/>
         <w:widowControl/>
         <w:spacing w:after="0" w:before="0" w:line="240" w:lineRule="auto"/>
         <w:ind w:firstLine="0" w:left="142" w:right="85"/>
@@ -3992,17 +4317,16 @@
       </w:pPr>
       <w:r>
         <w:rPr>
-          <w:rFonts w:ascii="Times New Roman" w:hAnsi="Times New Roman"/>
-          <w:b w:val="0"/>
-          <w:sz w:val="26"/>
+          <w:rFonts w:ascii="Consolas" w:hAnsi="Consolas"/>
+          <w:sz w:val="17"/>
         </w:rPr>
         <w:t>}</w:t>
       </w:r>
     </w:p>
     <w:p>
       <w:pPr>
-        <w:keepNext/>
-        <w:keepLines/>
+        <w:keepNext w:val="0"/>
+        <w:keepLines w:val="0"/>
         <w:widowControl/>
         <w:spacing w:after="0" w:before="0" w:line="240" w:lineRule="auto"/>
         <w:ind w:firstLine="0" w:left="142" w:right="85"/>
@@ -4010,17 +4334,16 @@
       </w:pPr>
       <w:r>
         <w:rPr>
-          <w:rFonts w:ascii="Times New Roman" w:hAnsi="Times New Roman"/>
-          <w:b w:val="0"/>
-          <w:sz w:val="26"/>
+          <w:rFonts w:ascii="Consolas" w:hAnsi="Consolas"/>
+          <w:sz w:val="17"/>
         </w:rPr>
         <w:t>if (!isset($_SESSION['completed'])) {</w:t>
       </w:r>
     </w:p>
     <w:p>
       <w:pPr>
-        <w:keepNext/>
-        <w:keepLines/>
+        <w:keepNext w:val="0"/>
+        <w:keepLines w:val="0"/>
         <w:widowControl/>
         <w:spacing w:after="0" w:before="0" w:line="240" w:lineRule="auto"/>
         <w:ind w:firstLine="0" w:left="142" w:right="85"/>
@@ -4028,17 +4351,16 @@
       </w:pPr>
       <w:r>
         <w:rPr>
-          <w:rFonts w:ascii="Times New Roman" w:hAnsi="Times New Roman"/>
-          <w:b w:val="0"/>
-          <w:sz w:val="26"/>
+          <w:rFonts w:ascii="Consolas" w:hAnsi="Consolas"/>
+          <w:sz w:val="17"/>
         </w:rPr>
         <w:t xml:space="preserve">    header('Location: /register.php', true, 303); exit;</w:t>
       </w:r>
     </w:p>
     <w:p>
       <w:pPr>
-        <w:keepNext/>
-        <w:keepLines/>
+        <w:keepNext w:val="0"/>
+        <w:keepLines w:val="0"/>
         <w:widowControl/>
         <w:spacing w:after="0" w:before="0" w:line="240" w:lineRule="auto"/>
         <w:ind w:firstLine="0" w:left="142" w:right="85"/>
@@ -4046,17 +4368,16 @@
       </w:pPr>
       <w:r>
         <w:rPr>
-          <w:rFonts w:ascii="Times New Roman" w:hAnsi="Times New Roman"/>
-          <w:b w:val="0"/>
-          <w:sz w:val="26"/>
+          <w:rFonts w:ascii="Consolas" w:hAnsi="Consolas"/>
+          <w:sz w:val="17"/>
         </w:rPr>
         <w:t>}</w:t>
       </w:r>
     </w:p>
     <w:p>
       <w:pPr>
-        <w:keepNext/>
-        <w:keepLines/>
+        <w:keepNext w:val="0"/>
+        <w:keepLines w:val="0"/>
         <w:widowControl/>
         <w:spacing w:after="0" w:before="0" w:line="240" w:lineRule="auto"/>
         <w:ind w:firstLine="0" w:left="142" w:right="85"/>
@@ -4064,17 +4385,16 @@
       </w:pPr>
       <w:r>
         <w:rPr>
-          <w:rFonts w:ascii="Times New Roman" w:hAnsi="Times New Roman"/>
-          <w:b w:val="0"/>
-          <w:sz w:val="26"/>
+          <w:rFonts w:ascii="Consolas" w:hAnsi="Consolas"/>
+          <w:sz w:val="17"/>
         </w:rPr>
         <w:t>require __DIR__.'/../templates/header.php';</w:t>
       </w:r>
     </w:p>
     <w:p>
       <w:pPr>
-        <w:keepNext/>
-        <w:keepLines/>
+        <w:keepNext w:val="0"/>
+        <w:keepLines w:val="0"/>
         <w:widowControl/>
         <w:spacing w:after="0" w:before="0" w:line="240" w:lineRule="auto"/>
         <w:ind w:firstLine="0" w:left="142" w:right="85"/>
@@ -4082,17 +4402,16 @@
       </w:pPr>
       <w:r>
         <w:rPr>
-          <w:rFonts w:ascii="Times New Roman" w:hAnsi="Times New Roman"/>
-          <w:b w:val="0"/>
-          <w:sz w:val="26"/>
+          <w:rFonts w:ascii="Consolas" w:hAnsi="Consolas"/>
+          <w:sz w:val="17"/>
         </w:rPr>
         <w:t>?&gt;</w:t>
       </w:r>
     </w:p>
     <w:p>
       <w:pPr>
-        <w:keepNext/>
-        <w:keepLines/>
+        <w:keepNext w:val="0"/>
+        <w:keepLines w:val="0"/>
         <w:widowControl/>
         <w:spacing w:after="0" w:before="0" w:line="240" w:lineRule="auto"/>
         <w:ind w:firstLine="0" w:left="142" w:right="85"/>
@@ -4100,17 +4419,16 @@
       </w:pPr>
       <w:r>
         <w:rPr>
-          <w:rFonts w:ascii="Times New Roman" w:hAnsi="Times New Roman"/>
-          <w:b w:val="0"/>
-          <w:sz w:val="26"/>
-        </w:rPr>
-        <w:t>&lt;h2&gt;Bước 3. Hoàn tất mô phỏng&lt;/h2&gt;</w:t>
+          <w:rFonts w:ascii="Consolas" w:hAnsi="Consolas"/>
+          <w:sz w:val="17"/>
+        </w:rPr>
+        <w:t>&lt;div class="page-heading"&gt;</w:t>
       </w:r>
     </w:p>
     <w:p>
       <w:pPr>
-        <w:keepNext/>
-        <w:keepLines/>
+        <w:keepNext w:val="0"/>
+        <w:keepLines w:val="0"/>
         <w:widowControl/>
         <w:spacing w:after="0" w:before="0" w:line="240" w:lineRule="auto"/>
         <w:ind w:firstLine="0" w:left="142" w:right="85"/>
@@ -4118,17 +4436,16 @@
       </w:pPr>
       <w:r>
         <w:rPr>
-          <w:rFonts w:ascii="Times New Roman" w:hAnsi="Times New Roman"/>
-          <w:b w:val="0"/>
-          <w:sz w:val="26"/>
-        </w:rPr>
-        <w:t>&lt;p&gt;</w:t>
+          <w:rFonts w:ascii="Consolas" w:hAnsi="Consolas"/>
+          <w:sz w:val="17"/>
+        </w:rPr>
+        <w:t>&lt;h1&gt;Bước 3. Hoàn tất mô phỏng&lt;/h1&gt;</w:t>
       </w:r>
     </w:p>
     <w:p>
       <w:pPr>
-        <w:keepNext/>
-        <w:keepLines/>
+        <w:keepNext w:val="0"/>
+        <w:keepLines w:val="0"/>
         <w:widowControl/>
         <w:spacing w:after="0" w:before="0" w:line="240" w:lineRule="auto"/>
         <w:ind w:firstLine="0" w:left="142" w:right="85"/>
@@ -4136,17 +4453,16 @@
       </w:pPr>
       <w:r>
         <w:rPr>
-          <w:rFonts w:ascii="Times New Roman" w:hAnsi="Times New Roman"/>
-          <w:b w:val="0"/>
-          <w:sz w:val="26"/>
-        </w:rPr>
-        <w:t>&lt;?= e($_SESSION['completed']) ?&gt;</w:t>
+          <w:rFonts w:ascii="Consolas" w:hAnsi="Consolas"/>
+          <w:sz w:val="17"/>
+        </w:rPr>
+        <w:t>&lt;/div&gt;</w:t>
       </w:r>
     </w:p>
     <w:p>
       <w:pPr>
-        <w:keepNext/>
-        <w:keepLines/>
+        <w:keepNext w:val="0"/>
+        <w:keepLines w:val="0"/>
         <w:widowControl/>
         <w:spacing w:after="0" w:before="0" w:line="240" w:lineRule="auto"/>
         <w:ind w:firstLine="0" w:left="142" w:right="85"/>
@@ -4154,17 +4470,16 @@
       </w:pPr>
       <w:r>
         <w:rPr>
-          <w:rFonts w:ascii="Times New Roman" w:hAnsi="Times New Roman"/>
-          <w:b w:val="0"/>
-          <w:sz w:val="26"/>
-        </w:rPr>
-        <w:t>&lt;/p&gt;</w:t>
+          <w:rFonts w:ascii="Consolas" w:hAnsi="Consolas"/>
+          <w:sz w:val="17"/>
+        </w:rPr>
+        <w:t>&lt;section class="completion" role="status"&gt;</w:t>
       </w:r>
     </w:p>
     <w:p>
       <w:pPr>
         <w:keepNext w:val="0"/>
-        <w:keepLines/>
+        <w:keepLines w:val="0"/>
         <w:widowControl/>
         <w:spacing w:after="0" w:before="0" w:line="240" w:lineRule="auto"/>
         <w:ind w:firstLine="0" w:left="142" w:right="85"/>
@@ -4172,25 +4487,93 @@
       </w:pPr>
       <w:r>
         <w:rPr>
-          <w:rFonts w:ascii="Times New Roman" w:hAnsi="Times New Roman"/>
-          <w:b w:val="0"/>
-          <w:sz w:val="26"/>
-        </w:rPr>
-        <w:t>&lt;p&gt;Chưa ghi vào CSDL; đây không phải vé hoặc bằng chứng đăng ký thật.&lt;/p&gt;</w:t>
+          <w:rFonts w:ascii="Consolas" w:hAnsi="Consolas"/>
+          <w:sz w:val="17"/>
+        </w:rPr>
+        <w:t>&lt;p class="status-message"&gt;</w:t>
       </w:r>
     </w:p>
     <w:p>
       <w:pPr>
+        <w:keepNext w:val="0"/>
+        <w:keepLines w:val="0"/>
         <w:widowControl/>
-        <w:spacing w:after="120" w:before="0" w:line="240" w:lineRule="auto"/>
+        <w:spacing w:after="0" w:before="0" w:line="240" w:lineRule="auto"/>
         <w:ind w:firstLine="0" w:left="142" w:right="85"/>
         <w:jc w:val="left"/>
       </w:pPr>
       <w:r>
         <w:rPr>
-          <w:rFonts w:ascii="Times New Roman" w:hAnsi="Times New Roman"/>
-          <w:b w:val="0"/>
-          <w:sz w:val="26"/>
+          <w:rFonts w:ascii="Consolas" w:hAnsi="Consolas"/>
+          <w:sz w:val="17"/>
+        </w:rPr>
+        <w:t>&lt;?= e($_SESSION['completed']) ?&gt;</w:t>
+      </w:r>
+    </w:p>
+    <w:p>
+      <w:pPr>
+        <w:keepNext w:val="0"/>
+        <w:keepLines w:val="0"/>
+        <w:widowControl/>
+        <w:spacing w:after="0" w:before="0" w:line="240" w:lineRule="auto"/>
+        <w:ind w:firstLine="0" w:left="142" w:right="85"/>
+        <w:jc w:val="left"/>
+      </w:pPr>
+      <w:r>
+        <w:rPr>
+          <w:rFonts w:ascii="Consolas" w:hAnsi="Consolas"/>
+          <w:sz w:val="17"/>
+        </w:rPr>
+        <w:t>&lt;/p&gt;</w:t>
+      </w:r>
+    </w:p>
+    <w:p>
+      <w:pPr>
+        <w:keepNext w:val="0"/>
+        <w:keepLines w:val="0"/>
+        <w:widowControl/>
+        <w:spacing w:after="0" w:before="0" w:line="240" w:lineRule="auto"/>
+        <w:ind w:firstLine="0" w:left="142" w:right="85"/>
+        <w:jc w:val="left"/>
+      </w:pPr>
+      <w:r>
+        <w:rPr>
+          <w:rFonts w:ascii="Consolas" w:hAnsi="Consolas"/>
+          <w:sz w:val="17"/>
+        </w:rPr>
+        <w:t>&lt;p&gt;Chưa ghi vào CSDL; đây không phải vé hoặc bằng chứng đăng ký thật.&lt;/p&gt;</w:t>
+      </w:r>
+    </w:p>
+    <w:p>
+      <w:pPr>
+        <w:keepNext w:val="0"/>
+        <w:keepLines w:val="0"/>
+        <w:widowControl/>
+        <w:spacing w:after="0" w:before="0" w:line="240" w:lineRule="auto"/>
+        <w:ind w:firstLine="0" w:left="142" w:right="85"/>
+        <w:jc w:val="left"/>
+      </w:pPr>
+      <w:r>
+        <w:rPr>
+          <w:rFonts w:ascii="Consolas" w:hAnsi="Consolas"/>
+          <w:sz w:val="17"/>
+        </w:rPr>
+        <w:t>&lt;/section&gt;</w:t>
+      </w:r>
+    </w:p>
+    <w:p>
+      <w:pPr>
+        <w:keepNext w:val="0"/>
+        <w:keepLines w:val="0"/>
+        <w:widowControl/>
+        <w:spacing w:after="0" w:before="0" w:line="240" w:lineRule="auto"/>
+        <w:ind w:firstLine="0" w:left="142" w:right="85"/>
+        <w:jc w:val="left"/>
+      </w:pPr>
+      <w:r>
+        <w:rPr>
+          <w:rFonts w:ascii="Consolas" w:hAnsi="Consolas"/>
+          <w:sz w:val="17"/>
         </w:rPr>
         <w:t>&lt;?php require __DIR__.'/../templates/footer.php'; ?&gt;</w:t>
       </w:r>

</xml_diff>